<commit_message>
Report v3: key functions for extraction, the query pipeline, retrieval comparison and verification orchestration; front pages in the department template wording
</commit_message>
<xml_diff>
--- a/Legal_AI_Project_Report_v3.docx
+++ b/Legal_AI_Project_Report_v3.docx
@@ -393,7 +393,7 @@
           <w:sz w:val="24"/>
           <w:szCs w:val="24"/>
         </w:rPr>
-        <w:t xml:space="preserve">" submitted to the Department of Artificial Intelligence, Anurag University, in partial fulfilment of the requirements for the award of the degree of Bachelor of Technology, is a record of original work carried out by us under the guidance of Mr. S. Ravi Kumar, Assistant Professor, Department of Artificial Intelligence. The results embodied in this report have not been submitted to any other university or institute for the award of any degree or diploma. Wherever the work of others, including pretrained models, open-source libraries, public datasets and published papers, has been used, it has been duly acknowledged and cited in the relevant sections and listed among the references at the end of this report.</w:t>
+        <w:t xml:space="preserve">" submitted to the Department of Artificial Intelligence, Anurag University, in partial fulfilment of the requirements for the award of the degree of Bachelor of Technology, is a record of original work carried out by us under the guidance of Mr. S. Ravi Kumar, Assistant Professor, Department of Artificial Intelligence. The results embodied in this report have not been submitted to any other university or institute for the award of any degree or diploma. Wherever the work of others, including pretrained models, open source libraries and published papers, has been used, it has been duly acknowledged and cited.</w:t>
       </w:r>
     </w:p>
     <w:p>
@@ -407,7 +407,7 @@
           <w:sz w:val="24"/>
           <w:szCs w:val="24"/>
         </w:rPr>
-        <w:t xml:space="preserve">Use of AI tools: we declare that we used an AI assistant (Claude) during this project to help write and debug parts of the program code, to prepare documentation and figures, and to draft and edit parts of the text of this report. The problem definition, the design decisions, the running of every experiment and the checking of every reported number against the logged result files in our repository were carried out by us. We have read and verified the content of this report, all numbers in it come from our own experiments, and we take full responsibility for its content, including any errors that it may contain, and for the honest description of the limitations of our work.</w:t>
+        <w:t xml:space="preserve">Use of AI tools: We declare that we have used large language model tools for code development and debugging assistance, language editing and drafting support while preparing this project and report. The problem definition, design decisions, testing and interpretation of results are our own, and we take full responsibility for the content of this report.</w:t>
       </w:r>
     </w:p>
     <w:p>
@@ -902,7 +902,7 @@
           <w:sz w:val="24"/>
           <w:szCs w:val="24"/>
         </w:rPr>
-        <w:t xml:space="preserve">" is a bonafide record of the work carried out by Nalla Akshith Sai (23EG106C03), Aleti Vivek Reddy (23EG106C04) and Kollu Uday (23EG106C30) in partial fulfilment of the requirements for the award of the degree of Bachelor of Technology in Artificial Intelligence during the academic year 2026 to 2027. The work embodied in this report was carried out under our supervision and guidance in the Department of Artificial Intelligence, Anurag University, Hyderabad, and it has been found satisfactory in its scope and quality for the purpose of this award. The work embodied in this report has not been submitted to any other university or institute for the award of any degree or diploma, and the students have acknowledged all the sources used in it.</w:t>
+        <w:t xml:space="preserve">" is a bonafide record of the work carried out by Nalla Akshith Sai (23EG106C03), Aleti Vivek Reddy (23EG106C04) and Kollu Uday (23EG106C30) in partial fulfilment of the requirements for the award of the degree of Bachelor of Technology in Artificial Intelligence during the academic year 2026 to 2027. The work embodied in this report has not been submitted to any other university or institute for the award of any degree or diploma.</w:t>
       </w:r>
     </w:p>
     <w:p>
@@ -986,7 +986,7 @@
           <w:sz w:val="24"/>
           <w:szCs w:val="24"/>
         </w:rPr>
-        <w:t xml:space="preserve">Head of the Department,</w:t>
+        <w:t xml:space="preserve">Head of the Department</w:t>
       </w:r>
     </w:p>
     <w:p>
@@ -1031,7 +1031,7 @@
           <w:sz w:val="24"/>
           <w:szCs w:val="24"/>
         </w:rPr>
-        <w:t xml:space="preserve">We express our sincere gratitude to our guide, Mr. S. Ravi Kumar, Assistant Professor, Department of Artificial Intelligence, for the valuable guidance, constant encouragement and support given to us throughout this project. The feedback we received at every review helped us define the scope of the work clearly, keep the system design simple enough to explain and test, and report our results honestly, including the cases in which our system did not behave as we had hoped. The suggestions we received on how to evaluate a system that refuses to answer, and on how to present the trade-off between caution and usefulness, shaped the experiments described in this report. We are thankful for the time given to us during the reviews and outside them, and for the freedom we were allowed in choosing and developing the topic.</w:t>
+        <w:t xml:space="preserve">We express our sincere gratitude to our guide, Mr. S. Ravi Kumar, Assistant Professor, Department of Artificial Intelligence, for his valuable guidance, constant encouragement and support throughout this project. His feedback at every review helped us shape the scope of Legal AI, keep the system design simple and practical, and report our work honestly.</w:t>
       </w:r>
     </w:p>
     <w:p>
@@ -1045,7 +1045,7 @@
           <w:sz w:val="24"/>
           <w:szCs w:val="24"/>
         </w:rPr>
-        <w:t xml:space="preserve">We thank Prof. M. Trupthi, Head of the Department of Artificial Intelligence, for providing the facilities and the academic environment needed to carry out this project, and for the support and encouragement given to us during the project reviews. We also thank the members of the Project Review Committee of the Department of Artificial Intelligence for their questions and suggestions during the reviews, which helped us improve the design of the system, the evaluation plan and the presentation of our results. Their comments led us to test the system through its user interface with questions fixed in advance, to report false refusals alongside correct answers, and to explain each part of the pipeline in terms that a reader outside the field of artificial intelligence could follow.</w:t>
+        <w:t xml:space="preserve">We thank Dr. M. Trupthi, Head of the Department of Artificial Intelligence, for providing the facilities and the academic environment needed to carry out this project, and for her support during the project reviews.</w:t>
       </w:r>
     </w:p>
     <w:p>
@@ -1059,7 +1059,35 @@
           <w:sz w:val="24"/>
           <w:szCs w:val="24"/>
         </w:rPr>
-        <w:t xml:space="preserve">We are grateful to Prof. V. Vijaya Kumar, Dean, School of Engineering, Dr. Archana Mantri, Vice Chancellor, and the Management of Anurag University for providing the computing facilities, library resources and academic environment necessary for successfully completing this work. We also thank all the faculty members and staff of the Department of Artificial Intelligence for their help and cooperation during our studies, and the creators of the open-source software, models and public datasets on which this project is built, without which a project of this kind would not have been possible for a student team. Finally, we thank our families and our friends for their patience, continued support and encouragement throughout the course of this project and our studies.</w:t>
+        <w:t xml:space="preserve">We thank the Project Review Committee members of the Department of Artificial Intelligence for their suggestions during the reviews, which helped us improve the system design and the evaluation plan.</w:t>
+      </w:r>
+    </w:p>
+    <w:p>
+      <w:pPr>
+        <w:spacing w:after="160" w:line="360"/>
+        <w:jc w:val="both"/>
+      </w:pPr>
+      <w:r>
+        <w:rPr>
+          <w:rFonts w:ascii="Times New Roman" w:cs="Times New Roman" w:eastAsia="Times New Roman" w:hAnsi="Times New Roman"/>
+          <w:sz w:val="24"/>
+          <w:szCs w:val="24"/>
+        </w:rPr>
+        <w:t xml:space="preserve">We are grateful to Prof. V. Vijaya Kumar, Dean, School of Engineering, Dr. Archana Mantri, Vice Chancellor, and the Management of Anurag University for providing the computing facilities, library resources, and academic environment necessary for successfully completing this work.</w:t>
+      </w:r>
+    </w:p>
+    <w:p>
+      <w:pPr>
+        <w:spacing w:after="160" w:line="360"/>
+        <w:jc w:val="both"/>
+      </w:pPr>
+      <w:r>
+        <w:rPr>
+          <w:rFonts w:ascii="Times New Roman" w:cs="Times New Roman" w:eastAsia="Times New Roman" w:hAnsi="Times New Roman"/>
+          <w:sz w:val="24"/>
+          <w:szCs w:val="24"/>
+        </w:rPr>
+        <w:t xml:space="preserve">We also thank all the faculty and staff of the Department of Artificial Intelligence, our families and our friends for their continued support and encouragement.</w:t>
       </w:r>
     </w:p>
     <w:p>
@@ -2429,7 +2457,7 @@
           <w:sz w:val="24"/>
           <w:szCs w:val="24"/>
         </w:rPr>
-        <w:t xml:space="preserve">5.5.1	Section Summary and Chunk Identifiers	41</w:t>
+        <w:t xml:space="preserve">5.5.1	Text Extraction	41</w:t>
       </w:r>
     </w:p>
     <w:p>
@@ -2447,7 +2475,7 @@
           <w:sz w:val="24"/>
           <w:szCs w:val="24"/>
         </w:rPr>
-        <w:t xml:space="preserve">5.5.2	Reciprocal Rank Fusion	42</w:t>
+        <w:t xml:space="preserve">5.5.2	Query Pipeline	42</w:t>
       </w:r>
     </w:p>
     <w:p>
@@ -2465,7 +2493,7 @@
           <w:sz w:val="24"/>
           <w:szCs w:val="24"/>
         </w:rPr>
-        <w:t xml:space="preserve">5.5.3	Citation-Forced Prompt	42</w:t>
+        <w:t xml:space="preserve">5.5.3	Retrieval Comparison and Fusion	42</w:t>
       </w:r>
     </w:p>
     <w:p>
@@ -2483,7 +2511,7 @@
           <w:sz w:val="24"/>
           <w:szCs w:val="24"/>
         </w:rPr>
-        <w:t xml:space="preserve">5.5.4	Claim Scoring and the Gate	43</w:t>
+        <w:t xml:space="preserve">5.5.4	Verification Rules and Orchestration	43</w:t>
       </w:r>
     </w:p>
     <w:p>
@@ -2501,7 +2529,7 @@
           <w:sz w:val="24"/>
           <w:szCs w:val="24"/>
         </w:rPr>
-        <w:t xml:space="preserve">5.6	Deployment and User Interface	43</w:t>
+        <w:t xml:space="preserve">5.6	Deployment and User Interface	44</w:t>
       </w:r>
     </w:p>
     <w:p>
@@ -24083,7 +24111,7 @@
           <w:sz w:val="24"/>
           <w:szCs w:val="24"/>
         </w:rPr>
-        <w:t xml:space="preserve">This section presents short excerpts from the source code in the project repository, chosen to show how the central ideas of the design are implemented. The excerpts are copied from the repository with only minor shortening, and each is followed by an explanation of what it does and why it matters for the behaviour of the system. The first excerpt builds the contextual summary and the identifier of every chunk, the second merges the dense and keyword rankings with reciprocal rank fusion, the third contains the rules given to the language model in the system prompt, and the fourth computes the score of a claim from the verification checks. Together they cover the chunking, retrieval, generation and verification stages of the pipeline described in Chapter 4, and they show that each stage is implemented with a small amount of readable code.</w:t>
+        <w:t xml:space="preserve">This section presents the key functions of the four main parts of the pipeline, taken from the source code in the project repository: text extraction, the query pipeline, the comparison and fusion of retrieval results, and the verification rules together with the orchestration of the six layers. Only the functions themselves are shown, not complete programs, and some functions are abridged, with comments and error handling removed and omitted lines marked with an ellipsis, so that the central logic fits on the page. Each excerpt is followed by an explanation of what it does and why it matters for the behaviour of the system. The complete source files, with their tests and documentation, are available in the GitHub repository described in Appendix A, where each function can be read in full together with the modules it calls.</w:t>
       </w:r>
     </w:p>
     <w:p>
@@ -24100,7 +24128,7 @@
           <w:sz w:val="24"/>
           <w:szCs w:val="24"/>
         </w:rPr>
-        <w:t xml:space="preserve">5.5.1  Section Summary and Chunk Identifiers</w:t>
+        <w:t xml:space="preserve">5.5.1  Text Extraction</w:t>
       </w:r>
     </w:p>
     <w:p>
@@ -24121,7 +24149,7 @@
           <w:sz w:val="17"/>
           <w:szCs w:val="17"/>
         </w:rPr>
-        <w:t xml:space="preserve">def contextual_summary_for_section(section: Section) -&gt; str:</w:t>
+        <w:t xml:space="preserve">def ingest_file_with_text(path: str | Path) -&gt; tuple[Document, str]:</w:t>
       </w:r>
     </w:p>
     <w:p>
@@ -24141,7 +24169,7 @@
           <w:sz w:val="17"/>
           <w:szCs w:val="17"/>
         </w:rPr>
-        <w:t xml:space="preserve">    """Extractive summary: section heading + its own first sentence."""</w:t>
+        <w:t xml:space="preserve">    """Load (.txt or .pdf), clean, and parse; return the parsed Document and</w:t>
       </w:r>
     </w:p>
     <w:p>
@@ -24161,7 +24189,7 @@
           <w:sz w:val="17"/>
           <w:szCs w:val="17"/>
         </w:rPr>
-        <w:t xml:space="preserve">    heading = f"Section {section.number}. {section.title}."</w:t>
+        <w:t xml:space="preserve">    the cleaned text, which fallback chunking needs when the document has no</w:t>
       </w:r>
     </w:p>
     <w:p>
@@ -24181,7 +24209,7 @@
           <w:sz w:val="17"/>
           <w:szCs w:val="17"/>
         </w:rPr>
-        <w:t xml:space="preserve">    first_sentence = section.first_sentence</w:t>
+        <w:t xml:space="preserve">    legal structure to parse."""</w:t>
       </w:r>
     </w:p>
     <w:p>
@@ -24201,7 +24229,7 @@
           <w:sz w:val="17"/>
           <w:szCs w:val="17"/>
         </w:rPr>
-        <w:t xml:space="preserve">    if (first_sentence</w:t>
+        <w:t xml:space="preserve">    path = Path(path)</w:t>
       </w:r>
     </w:p>
     <w:p>
@@ -24221,7 +24249,7 @@
           <w:sz w:val="17"/>
           <w:szCs w:val="17"/>
         </w:rPr>
-        <w:t xml:space="preserve">            and first_sentence.rstrip(".") != section.title.rstrip(".")):</w:t>
+        <w:t xml:space="preserve">    raw = load_document(path)          # pypdf for PDF, plain read for .txt</w:t>
       </w:r>
     </w:p>
     <w:p>
@@ -24241,7 +24269,7 @@
           <w:sz w:val="17"/>
           <w:szCs w:val="17"/>
         </w:rPr>
-        <w:t xml:space="preserve">        return f"{heading} {first_sentence}"</w:t>
+        <w:t xml:space="preserve">    cleaned = clean_text(raw)</w:t>
       </w:r>
     </w:p>
     <w:p>
@@ -24261,127 +24289,7 @@
           <w:sz w:val="17"/>
           <w:szCs w:val="17"/>
         </w:rPr>
-        <w:t xml:space="preserve">    return heading</w:t>
-      </w:r>
-    </w:p>
-    <w:p>
-      <w:pPr>
-        <w:keepNext/>
-        <w:keepLines/>
-        <w:pBdr>
-          <w:left w:val="single" w:color="808080" w:sz="4" w:space="4"/>
-          <w:right w:val="single" w:color="808080" w:sz="4" w:space="4"/>
-        </w:pBdr>
-        <w:shd w:fill="F2F2F2" w:color="auto" w:val="clear"/>
-        <w:spacing w:after="0" w:before="0" w:line="240"/>
-      </w:pPr>
-      <w:r>
-        <w:rPr>
-          <w:rFonts w:ascii="Courier New" w:cs="Courier New" w:eastAsia="Courier New" w:hAnsi="Courier New"/>
-          <w:sz w:val="17"/>
-          <w:szCs w:val="17"/>
-        </w:rPr>
-        <w:t xml:space="preserve"> </w:t>
-      </w:r>
-    </w:p>
-    <w:p>
-      <w:pPr>
-        <w:keepNext/>
-        <w:keepLines/>
-        <w:pBdr>
-          <w:left w:val="single" w:color="808080" w:sz="4" w:space="4"/>
-          <w:right w:val="single" w:color="808080" w:sz="4" w:space="4"/>
-        </w:pBdr>
-        <w:shd w:fill="F2F2F2" w:color="auto" w:val="clear"/>
-        <w:spacing w:after="0" w:before="0" w:line="240"/>
-      </w:pPr>
-      <w:r>
-        <w:rPr>
-          <w:rFonts w:ascii="Courier New" w:cs="Courier New" w:eastAsia="Courier New" w:hAnsi="Courier New"/>
-          <w:sz w:val="17"/>
-          <w:szCs w:val="17"/>
-        </w:rPr>
-        <w:t xml:space="preserve">def _chunk_id(source_id: str, section: Section,</w:t>
-      </w:r>
-    </w:p>
-    <w:p>
-      <w:pPr>
-        <w:keepNext/>
-        <w:keepLines/>
-        <w:pBdr>
-          <w:left w:val="single" w:color="808080" w:sz="4" w:space="4"/>
-          <w:right w:val="single" w:color="808080" w:sz="4" w:space="4"/>
-        </w:pBdr>
-        <w:shd w:fill="F2F2F2" w:color="auto" w:val="clear"/>
-        <w:spacing w:after="0" w:before="0" w:line="240"/>
-      </w:pPr>
-      <w:r>
-        <w:rPr>
-          <w:rFonts w:ascii="Courier New" w:cs="Courier New" w:eastAsia="Courier New" w:hAnsi="Courier New"/>
-          <w:sz w:val="17"/>
-          <w:szCs w:val="17"/>
-        </w:rPr>
-        <w:t xml:space="preserve">              clause: Clause | None = None) -&gt; str:</w:t>
-      </w:r>
-    </w:p>
-    <w:p>
-      <w:pPr>
-        <w:keepNext/>
-        <w:keepLines/>
-        <w:pBdr>
-          <w:left w:val="single" w:color="808080" w:sz="4" w:space="4"/>
-          <w:right w:val="single" w:color="808080" w:sz="4" w:space="4"/>
-        </w:pBdr>
-        <w:shd w:fill="F2F2F2" w:color="auto" w:val="clear"/>
-        <w:spacing w:after="0" w:before="0" w:line="240"/>
-      </w:pPr>
-      <w:r>
-        <w:rPr>
-          <w:rFonts w:ascii="Courier New" w:cs="Courier New" w:eastAsia="Courier New" w:hAnsi="Courier New"/>
-          <w:sz w:val="17"/>
-          <w:szCs w:val="17"/>
-        </w:rPr>
-        <w:t xml:space="preserve">    base = f"{source_id}::s{section.number}"</w:t>
-      </w:r>
-    </w:p>
-    <w:p>
-      <w:pPr>
-        <w:keepNext/>
-        <w:keepLines/>
-        <w:pBdr>
-          <w:left w:val="single" w:color="808080" w:sz="4" w:space="4"/>
-          <w:right w:val="single" w:color="808080" w:sz="4" w:space="4"/>
-        </w:pBdr>
-        <w:shd w:fill="F2F2F2" w:color="auto" w:val="clear"/>
-        <w:spacing w:after="0" w:before="0" w:line="240"/>
-      </w:pPr>
-      <w:r>
-        <w:rPr>
-          <w:rFonts w:ascii="Courier New" w:cs="Courier New" w:eastAsia="Courier New" w:hAnsi="Courier New"/>
-          <w:sz w:val="17"/>
-          <w:szCs w:val="17"/>
-        </w:rPr>
-        <w:t xml:space="preserve">    if clause is not None:</w:t>
-      </w:r>
-    </w:p>
-    <w:p>
-      <w:pPr>
-        <w:keepNext/>
-        <w:keepLines/>
-        <w:pBdr>
-          <w:left w:val="single" w:color="808080" w:sz="4" w:space="4"/>
-          <w:right w:val="single" w:color="808080" w:sz="4" w:space="4"/>
-        </w:pBdr>
-        <w:shd w:fill="F2F2F2" w:color="auto" w:val="clear"/>
-        <w:spacing w:after="0" w:before="0" w:line="240"/>
-      </w:pPr>
-      <w:r>
-        <w:rPr>
-          <w:rFonts w:ascii="Courier New" w:cs="Courier New" w:eastAsia="Courier New" w:hAnsi="Courier New"/>
-          <w:sz w:val="17"/>
-          <w:szCs w:val="17"/>
-        </w:rPr>
-        <w:t xml:space="preserve">        return f"{base}:{clause.label}"</w:t>
+        <w:t xml:space="preserve">    document = parse_document(cleaned, source_id=path.stem.strip())</w:t>
       </w:r>
     </w:p>
     <w:p>
@@ -24402,7 +24310,7 @@
           <w:sz w:val="17"/>
           <w:szCs w:val="17"/>
         </w:rPr>
-        <w:t xml:space="preserve">    return base</w:t>
+        <w:t xml:space="preserve">    return document, cleaned</w:t>
       </w:r>
     </w:p>
     <w:p>
@@ -24416,7 +24324,7 @@
           <w:sz w:val="24"/>
           <w:szCs w:val="24"/>
         </w:rPr>
-        <w:t xml:space="preserve">The first function builds the contextual summary that is attached to every chunk of a section. It combines the section heading, such as "Section 379. Punishment for theft.", with the first sentence of the section, and it avoids repeating the sentence when it is identical to the heading. Because the summary is extractive, it needs no language model call, so ingestion is fast, free and gives the same result every time. The second function builds the identifier of a chunk from the source document, the section number and, for a clause, its label. These identifiers are what the language model must cite and what layer V1 checks, so they must be stable, readable and unique. A user who sees a citation such as ipc_theft::s379 can tell immediately which document and which section the claim relies on, without opening the proof view.</w:t>
+        <w:t xml:space="preserve">This function is the entry point of text extraction. It reads an uploaded file with the loader for its type, which uses the pypdf library for PDF files and a plain read for text files, and then cleans the text by normalising whitespace and removing artefacts of extraction while keeping the line breaks that mark headings. The cleaned text is passed to the structure parser, which recognises chapters, sections and clauses and returns a document object with its legal hierarchy. The function also returns the cleaned text itself, because a document without any legal structure, such as a contract, is split by the paragraph fallback instead. The source identifier is taken from the file name with surrounding spaces removed, a fix added after testing showed that a stray space in a file name broke every citation identifier of that document.</w:t>
       </w:r>
     </w:p>
     <w:p>
@@ -24433,7 +24341,7 @@
           <w:sz w:val="24"/>
           <w:szCs w:val="24"/>
         </w:rPr>
-        <w:t xml:space="preserve">5.5.2  Reciprocal Rank Fusion</w:t>
+        <w:t xml:space="preserve">5.5.2  Query Pipeline</w:t>
       </w:r>
     </w:p>
     <w:p>
@@ -24454,7 +24362,7 @@
           <w:sz w:val="17"/>
           <w:szCs w:val="17"/>
         </w:rPr>
-        <w:t xml:space="preserve">class FusedRetriever(EnsembleRetriever):</w:t>
+        <w:t xml:space="preserve">def build_query_chain(retriever, llm, nli) -&gt; Runnable:</w:t>
       </w:r>
     </w:p>
     <w:p>
@@ -24474,7 +24382,7 @@
           <w:sz w:val="17"/>
           <w:szCs w:val="17"/>
         </w:rPr>
-        <w:t xml:space="preserve">    """EnsembleRetriever (weighted RRF) that keeps the fused score and truncates</w:t>
+        <w:t xml:space="preserve">    """Input: {question, self_consistency, allow_general_knowledge}."""</w:t>
       </w:r>
     </w:p>
     <w:p>
@@ -24494,7 +24402,7 @@
           <w:sz w:val="17"/>
           <w:szCs w:val="17"/>
         </w:rPr>
-        <w:t xml:space="preserve">    to `limit`, like LanceDB's hybrid query."""</w:t>
+        <w:t xml:space="preserve">    answer = answer_chain(llm)          # prompt | llm | citation parser</w:t>
       </w:r>
     </w:p>
     <w:p>
@@ -24514,7 +24422,7 @@
           <w:sz w:val="17"/>
           <w:szCs w:val="17"/>
         </w:rPr>
-        <w:t xml:space="preserve">    limit: int = 5</w:t>
+        <w:t xml:space="preserve">    ...</w:t>
       </w:r>
     </w:p>
     <w:p>
@@ -24534,7 +24442,7 @@
           <w:sz w:val="17"/>
           <w:szCs w:val="17"/>
         </w:rPr>
-        <w:t xml:space="preserve"> </w:t>
+        <w:t xml:space="preserve">    return (</w:t>
       </w:r>
     </w:p>
     <w:p>
@@ -24554,7 +24462,7 @@
           <w:sz w:val="17"/>
           <w:szCs w:val="17"/>
         </w:rPr>
-        <w:t xml:space="preserve">    def weighted_reciprocal_rank(self, doc_lists):</w:t>
+        <w:t xml:space="preserve">        RunnablePassthrough.assign(context=itemgetter("question") | retriever)</w:t>
       </w:r>
     </w:p>
     <w:p>
@@ -24574,7 +24482,7 @@
           <w:sz w:val="17"/>
           <w:szCs w:val="17"/>
         </w:rPr>
-        <w:t xml:space="preserve">        scores, first = {}, {}</w:t>
+        <w:t xml:space="preserve">        | RunnablePassthrough.assign(prompt=RunnableLambda(_prompt_messages))</w:t>
       </w:r>
     </w:p>
     <w:p>
@@ -24594,7 +24502,7 @@
           <w:sz w:val="17"/>
           <w:szCs w:val="17"/>
         </w:rPr>
-        <w:t xml:space="preserve">        for doc_list, weight in zip(doc_lists, self.weights):</w:t>
+        <w:t xml:space="preserve">        | RunnablePassthrough.assign(parsed=_guard(answer, "generate"))</w:t>
       </w:r>
     </w:p>
     <w:p>
@@ -24614,7 +24522,7 @@
           <w:sz w:val="17"/>
           <w:szCs w:val="17"/>
         </w:rPr>
-        <w:t xml:space="preserve">            for rank, doc in enumerate(doc_list, start=1):</w:t>
+        <w:t xml:space="preserve">        | RunnablePassthrough.assign(resamples=_guard(RunnableLambda(_resamples),</w:t>
       </w:r>
     </w:p>
     <w:p>
@@ -24634,7 +24542,7 @@
           <w:sz w:val="17"/>
           <w:szCs w:val="17"/>
         </w:rPr>
-        <w:t xml:space="preserve">                key = doc.metadata[self.id_key]</w:t>
+        <w:t xml:space="preserve">                                                      "resample"))</w:t>
       </w:r>
     </w:p>
     <w:p>
@@ -24654,7 +24562,7 @@
           <w:sz w:val="17"/>
           <w:szCs w:val="17"/>
         </w:rPr>
-        <w:t xml:space="preserve">                scores[key] = scores.get(key, 0.0) + weight / (rank + self.c)</w:t>
+        <w:t xml:space="preserve">        | RunnablePassthrough.assign(verification=verification_step(nli))</w:t>
       </w:r>
     </w:p>
     <w:p>
@@ -24674,7 +24582,7 @@
           <w:sz w:val="17"/>
           <w:szCs w:val="17"/>
         </w:rPr>
-        <w:t xml:space="preserve">                first.setdefault(key, doc)</w:t>
+        <w:t xml:space="preserve">        | RunnableBranch(</w:t>
       </w:r>
     </w:p>
     <w:p>
@@ -24694,7 +24602,7 @@
           <w:sz w:val="17"/>
           <w:szCs w:val="17"/>
         </w:rPr>
-        <w:t xml:space="preserve">        ranked = sorted(scores, key=lambda key: scores[key],</w:t>
+        <w:t xml:space="preserve">            (wants_general_knowledge,</w:t>
       </w:r>
     </w:p>
     <w:p>
@@ -24714,7 +24622,7 @@
           <w:sz w:val="17"/>
           <w:szCs w:val="17"/>
         </w:rPr>
-        <w:t xml:space="preserve">                        reverse=True)[: self.limit]</w:t>
+        <w:t xml:space="preserve">             RunnablePassthrough.assign(general_text=RunnableLambda(_general))),</w:t>
       </w:r>
     </w:p>
     <w:p>
@@ -24734,7 +24642,27 @@
           <w:sz w:val="17"/>
           <w:szCs w:val="17"/>
         </w:rPr>
-        <w:t xml:space="preserve">        return [_copy(first[key], _relevance_score=scores[key])</w:t>
+        <w:t xml:space="preserve">            RunnablePassthrough.assign(general_text=lambda _: None),</w:t>
+      </w:r>
+    </w:p>
+    <w:p>
+      <w:pPr>
+        <w:keepNext/>
+        <w:keepLines/>
+        <w:pBdr>
+          <w:left w:val="single" w:color="808080" w:sz="4" w:space="4"/>
+          <w:right w:val="single" w:color="808080" w:sz="4" w:space="4"/>
+        </w:pBdr>
+        <w:shd w:fill="F2F2F2" w:color="auto" w:val="clear"/>
+        <w:spacing w:after="0" w:before="0" w:line="240"/>
+      </w:pPr>
+      <w:r>
+        <w:rPr>
+          <w:rFonts w:ascii="Courier New" w:cs="Courier New" w:eastAsia="Courier New" w:hAnsi="Courier New"/>
+          <w:sz w:val="17"/>
+          <w:szCs w:val="17"/>
+        </w:rPr>
+        <w:t xml:space="preserve">        )</w:t>
       </w:r>
     </w:p>
     <w:p>
@@ -24755,7 +24683,7 @@
           <w:sz w:val="17"/>
           <w:szCs w:val="17"/>
         </w:rPr>
-        <w:t xml:space="preserve">                for key in ranked]</w:t>
+        <w:t xml:space="preserve">    )</w:t>
       </w:r>
     </w:p>
     <w:p>
@@ -24769,7 +24697,7 @@
           <w:sz w:val="24"/>
           <w:szCs w:val="24"/>
         </w:rPr>
-        <w:t xml:space="preserve">This class extends the ensemble retriever of LangChain so that the fused score is kept and the result is cut to a fixed number of candidates. For every ranked list, here the dense list and the BM25 list, it walks through the documents in order and adds the weight of the list divided by the rank plus a constant to the score of each document, which is Equation 4.1. A document that appears in both lists accumulates two contributions and moves up. The documents are then sorted by their fused score and the top ones are returned with the score attached, so that the Search page and the proof view can show it. The stock LangChain class returns neither the score nor a fixed number of results, which is why this small subclass was written; with the constant set appropriately, it reproduces the fusion that LanceDB applies in its own hybrid search.</w:t>
+        <w:t xml:space="preserve">This function builds the complete question-answering pipeline as a single LangChain chain. Each step adds its result to a shared state without removing what came before: the retriever adds the context chunks, the prompt step adds the exact messages sent to the model, the answer step adds the parsed claims and citations, the optional resampling step adds extra answers for the consistency check, and the verification step adds the score, the decision and the proof object. The final branch sends a question about a general legal concept to the general-knowledge path, which produces a labelled answer without citations, and leaves every other question on the verified path. Because the state keeps every intermediate result, the API can return a full trace of how an answer was produced, which was essential for finding the defects described in Chapter 6.</w:t>
       </w:r>
     </w:p>
     <w:p>
@@ -24786,7 +24714,7 @@
           <w:sz w:val="24"/>
           <w:szCs w:val="24"/>
         </w:rPr>
-        <w:t xml:space="preserve">5.5.3  Citation-Forced Prompt</w:t>
+        <w:t xml:space="preserve">5.5.3  Retrieval Comparison and Fusion</w:t>
       </w:r>
     </w:p>
     <w:p>
@@ -24807,7 +24735,7 @@
           <w:sz w:val="17"/>
           <w:szCs w:val="17"/>
         </w:rPr>
-        <w:t xml:space="preserve">SYSTEM_PROMPT = """You are a legal question-answering assistant. You answer ONLY</w:t>
+        <w:t xml:space="preserve">def weighted_reciprocal_rank(self, doc_lists):</w:t>
       </w:r>
     </w:p>
     <w:p>
@@ -24827,7 +24755,7 @@
           <w:sz w:val="17"/>
           <w:szCs w:val="17"/>
         </w:rPr>
-        <w:t xml:space="preserve">from the provided context passages, never from prior knowledge.</w:t>
+        <w:t xml:space="preserve">    scores, first = {}, {}</w:t>
       </w:r>
     </w:p>
     <w:p>
@@ -24847,7 +24775,7 @@
           <w:sz w:val="17"/>
           <w:szCs w:val="17"/>
         </w:rPr>
-        <w:t xml:space="preserve"> </w:t>
+        <w:t xml:space="preserve">    for doc_list, weight in zip(doc_lists, self.weights):   # dense, BM25</w:t>
       </w:r>
     </w:p>
     <w:p>
@@ -24867,7 +24795,7 @@
           <w:sz w:val="17"/>
           <w:szCs w:val="17"/>
         </w:rPr>
-        <w:t xml:space="preserve">Rules you must follow exactly:</w:t>
+        <w:t xml:space="preserve">        for rank, doc in enumerate(doc_list, start=1):</w:t>
       </w:r>
     </w:p>
     <w:p>
@@ -24887,7 +24815,7 @@
           <w:sz w:val="17"/>
           <w:szCs w:val="17"/>
         </w:rPr>
-        <w:t xml:space="preserve">1. Use ONLY the information in the CONTEXT passages below.</w:t>
+        <w:t xml:space="preserve">            key = doc.metadata[self.id_key]</w:t>
       </w:r>
     </w:p>
     <w:p>
@@ -24907,7 +24835,7 @@
           <w:sz w:val="17"/>
           <w:szCs w:val="17"/>
         </w:rPr>
-        <w:t xml:space="preserve">2. Write each factual claim on its own line.</w:t>
+        <w:t xml:space="preserve">            scores[key] = scores.get(key, 0.0) + weight / (rank + self.c)</w:t>
       </w:r>
     </w:p>
     <w:p>
@@ -24927,7 +24855,7 @@
           <w:sz w:val="17"/>
           <w:szCs w:val="17"/>
         </w:rPr>
-        <w:t xml:space="preserve">3. End every claim line with a citation to the chunk id(s) it is supported by,</w:t>
+        <w:t xml:space="preserve">            first.setdefault(key, doc)</w:t>
       </w:r>
     </w:p>
     <w:p>
@@ -24947,7 +24875,7 @@
           <w:sz w:val="17"/>
           <w:szCs w:val="17"/>
         </w:rPr>
-        <w:t xml:space="preserve">   in square brackets, e.g. [urban_tenancy_act_2019::s4:b].</w:t>
+        <w:t xml:space="preserve">    ranked = sorted(scores, key=lambda key: scores[key],</w:t>
       </w:r>
     </w:p>
     <w:p>
@@ -24967,7 +24895,7 @@
           <w:sz w:val="17"/>
           <w:szCs w:val="17"/>
         </w:rPr>
-        <w:t xml:space="preserve">4. Never write a factual sentence without a citation.</w:t>
+        <w:t xml:space="preserve">                    reverse=True)[: self.limit]</w:t>
       </w:r>
     </w:p>
     <w:p>
@@ -24987,7 +24915,7 @@
           <w:sz w:val="17"/>
           <w:szCs w:val="17"/>
         </w:rPr>
-        <w:t xml:space="preserve">5. If the context does not contain enough information to answer, respond with</w:t>
+        <w:t xml:space="preserve">    return [_copy(first[key], _relevance_score=scores[key]) for key in ranked]</w:t>
       </w:r>
     </w:p>
     <w:p>
@@ -25007,7 +24935,107 @@
           <w:sz w:val="17"/>
           <w:szCs w:val="17"/>
         </w:rPr>
-        <w:t xml:space="preserve">   a single line beginning exactly with "INSUFFICIENT_CONTEXT:" followed by a</w:t>
+        <w:t xml:space="preserve"> </w:t>
+      </w:r>
+    </w:p>
+    <w:p>
+      <w:pPr>
+        <w:keepNext/>
+        <w:keepLines/>
+        <w:pBdr>
+          <w:left w:val="single" w:color="808080" w:sz="4" w:space="4"/>
+          <w:right w:val="single" w:color="808080" w:sz="4" w:space="4"/>
+        </w:pBdr>
+        <w:shd w:fill="F2F2F2" w:color="auto" w:val="clear"/>
+        <w:spacing w:after="0" w:before="0" w:line="240"/>
+      </w:pPr>
+      <w:r>
+        <w:rPr>
+          <w:rFonts w:ascii="Courier New" w:cs="Courier New" w:eastAsia="Courier New" w:hAnsi="Courier New"/>
+          <w:sz w:val="17"/>
+          <w:szCs w:val="17"/>
+        </w:rPr>
+        <w:t xml:space="preserve">def query_retriever(store, k, n, reranker=None):</w:t>
+      </w:r>
+    </w:p>
+    <w:p>
+      <w:pPr>
+        <w:keepNext/>
+        <w:keepLines/>
+        <w:pBdr>
+          <w:left w:val="single" w:color="808080" w:sz="4" w:space="4"/>
+          <w:right w:val="single" w:color="808080" w:sz="4" w:space="4"/>
+        </w:pBdr>
+        <w:shd w:fill="F2F2F2" w:color="auto" w:val="clear"/>
+        <w:spacing w:after="0" w:before="0" w:line="240"/>
+      </w:pPr>
+      <w:r>
+        <w:rPr>
+          <w:rFonts w:ascii="Courier New" w:cs="Courier New" w:eastAsia="Courier New" w:hAnsi="Courier New"/>
+          <w:sz w:val="17"/>
+          <w:szCs w:val="17"/>
+        </w:rPr>
+        <w:t xml:space="preserve">    if reranker is None:</w:t>
+      </w:r>
+    </w:p>
+    <w:p>
+      <w:pPr>
+        <w:keepNext/>
+        <w:keepLines/>
+        <w:pBdr>
+          <w:left w:val="single" w:color="808080" w:sz="4" w:space="4"/>
+          <w:right w:val="single" w:color="808080" w:sz="4" w:space="4"/>
+        </w:pBdr>
+        <w:shd w:fill="F2F2F2" w:color="auto" w:val="clear"/>
+        <w:spacing w:after="0" w:before="0" w:line="240"/>
+      </w:pPr>
+      <w:r>
+        <w:rPr>
+          <w:rFonts w:ascii="Courier New" w:cs="Courier New" w:eastAsia="Courier New" w:hAnsi="Courier New"/>
+          <w:sz w:val="17"/>
+          <w:szCs w:val="17"/>
+        </w:rPr>
+        <w:t xml:space="preserve">        return hybrid_retriever(store, k)</w:t>
+      </w:r>
+    </w:p>
+    <w:p>
+      <w:pPr>
+        <w:keepNext/>
+        <w:keepLines/>
+        <w:pBdr>
+          <w:left w:val="single" w:color="808080" w:sz="4" w:space="4"/>
+          <w:right w:val="single" w:color="808080" w:sz="4" w:space="4"/>
+        </w:pBdr>
+        <w:shd w:fill="F2F2F2" w:color="auto" w:val="clear"/>
+        <w:spacing w:after="0" w:before="0" w:line="240"/>
+      </w:pPr>
+      <w:r>
+        <w:rPr>
+          <w:rFonts w:ascii="Courier New" w:cs="Courier New" w:eastAsia="Courier New" w:hAnsi="Courier New"/>
+          <w:sz w:val="17"/>
+          <w:szCs w:val="17"/>
+        </w:rPr>
+        <w:t xml:space="preserve">    return ContextualCompressionRetriever(</w:t>
+      </w:r>
+    </w:p>
+    <w:p>
+      <w:pPr>
+        <w:keepNext/>
+        <w:keepLines/>
+        <w:pBdr>
+          <w:left w:val="single" w:color="808080" w:sz="4" w:space="4"/>
+          <w:right w:val="single" w:color="808080" w:sz="4" w:space="4"/>
+        </w:pBdr>
+        <w:shd w:fill="F2F2F2" w:color="auto" w:val="clear"/>
+        <w:spacing w:after="0" w:before="0" w:line="240"/>
+      </w:pPr>
+      <w:r>
+        <w:rPr>
+          <w:rFonts w:ascii="Courier New" w:cs="Courier New" w:eastAsia="Courier New" w:hAnsi="Courier New"/>
+          <w:sz w:val="17"/>
+          <w:szCs w:val="17"/>
+        </w:rPr>
+        <w:t xml:space="preserve">        base_compressor=as_compressor(reranker, top_n=k),</w:t>
       </w:r>
     </w:p>
     <w:p>
@@ -25028,7 +25056,7 @@
           <w:sz w:val="17"/>
           <w:szCs w:val="17"/>
         </w:rPr>
-        <w:t xml:space="preserve">   short reason, and nothing else."""</w:t>
+        <w:t xml:space="preserve">        base_retriever=hybrid_retriever(store, n))</w:t>
       </w:r>
     </w:p>
     <w:p>
@@ -25042,7 +25070,7 @@
           <w:sz w:val="24"/>
           <w:szCs w:val="24"/>
         </w:rPr>
-        <w:t xml:space="preserve">The system prompt is the contract between the generator and the verifier. It restricts the model to the retrieved passages, requires one claim per line, requires every claim to end with the identifier of the chunk that supports it, and forbids factual sentences without a citation. When the passages cannot answer the question, the model must return a single line that starts with the abstention marker. Because the format is fixed, the parser can split the answer into claims and map each claim to its evidence deterministically, and the verifier never has to guess which passage a sentence came from. The prompt cannot force the model to obey, which is why the verification layers exist: a claim that cites an identifier that was not retrieved, cites the wrong passage or states something the passage does not say is caught by layers V1, V2 and V3 and lowers the score of the answer.</w:t>
+        <w:t xml:space="preserve">The first function compares and merges the ranked lists returned by dense search and BM25 keyword search. For every list it walks through the chunks in order and adds the weight of the list divided by the rank plus a constant to the score of each chunk, which is Equation 4.1, so a chunk found near the top of both lists collects two contributions and moves up. The chunks are then sorted by their fused score and the best ones are returned with the score attached, so the Search page and the proof view can display it. The second function puts the stages together: without a reranker it returns the fused top k directly, and with a reranker it first fetches a larger pool of n fused candidates and then lets the cross-encoder keep the best k of them, which is how the Ask page turns a pool of one hundred candidates into twelve passages.</w:t>
       </w:r>
     </w:p>
     <w:p>
@@ -25059,7 +25087,7 @@
           <w:sz w:val="24"/>
           <w:szCs w:val="24"/>
         </w:rPr>
-        <w:t xml:space="preserve">5.5.4  Claim Scoring and the Gate</w:t>
+        <w:t xml:space="preserve">5.5.4  Verification Rules and Orchestration</w:t>
       </w:r>
     </w:p>
     <w:p>
@@ -25120,7 +25148,7 @@
           <w:sz w:val="17"/>
           <w:szCs w:val="17"/>
         </w:rPr>
-        <w:t xml:space="preserve">        return 0.0, "citation"</w:t>
+        <w:t xml:space="preserve">        return 0.0, "citation"                     # hard gate V1</w:t>
       </w:r>
     </w:p>
     <w:p>
@@ -25160,7 +25188,7 @@
           <w:sz w:val="17"/>
           <w:szCs w:val="17"/>
         </w:rPr>
-        <w:t xml:space="preserve">        return 0.0, "contradiction"</w:t>
+        <w:t xml:space="preserve">        return 0.0, "contradiction"                # hard gate V2</w:t>
       </w:r>
     </w:p>
     <w:p>
@@ -25180,7 +25208,7 @@
           <w:sz w:val="17"/>
           <w:szCs w:val="17"/>
         </w:rPr>
-        <w:t xml:space="preserve">    components = []</w:t>
+        <w:t xml:space="preserve">    components = [(1.0 if entailment == Entailment.ENTAILS else 0.0,</w:t>
       </w:r>
     </w:p>
     <w:p>
@@ -25200,7 +25228,7 @@
           <w:sz w:val="17"/>
           <w:szCs w:val="17"/>
         </w:rPr>
-        <w:t xml:space="preserve">    if config.enable_v2:</w:t>
+        <w:t xml:space="preserve">                   config.w_entail), (fidelity, config.w_fidelity)]</w:t>
       </w:r>
     </w:p>
     <w:p>
@@ -25220,7 +25248,7 @@
           <w:sz w:val="17"/>
           <w:szCs w:val="17"/>
         </w:rPr>
-        <w:t xml:space="preserve">        components.append((1.0 if entailment == Entailment.ENTAILS else 0.0,</w:t>
+        <w:t xml:space="preserve">    if consistency is not None:</w:t>
       </w:r>
     </w:p>
     <w:p>
@@ -25240,7 +25268,7 @@
           <w:sz w:val="17"/>
           <w:szCs w:val="17"/>
         </w:rPr>
-        <w:t xml:space="preserve">                           config.w_entail))</w:t>
+        <w:t xml:space="preserve">        components.append((consistency, config.w_consistency))</w:t>
       </w:r>
     </w:p>
     <w:p>
@@ -25260,7 +25288,7 @@
           <w:sz w:val="17"/>
           <w:szCs w:val="17"/>
         </w:rPr>
-        <w:t xml:space="preserve">    if config.enable_v3:</w:t>
+        <w:t xml:space="preserve">    total_weight = sum(w for _, w in components)</w:t>
       </w:r>
     </w:p>
     <w:p>
@@ -25280,7 +25308,7 @@
           <w:sz w:val="17"/>
           <w:szCs w:val="17"/>
         </w:rPr>
-        <w:t xml:space="preserve">        components.append((fidelity, config.w_fidelity))</w:t>
+        <w:t xml:space="preserve">    return sum(c * w for c, w in components) / total_weight, None</w:t>
       </w:r>
     </w:p>
     <w:p>
@@ -25300,7 +25328,7 @@
           <w:sz w:val="17"/>
           <w:szCs w:val="17"/>
         </w:rPr>
-        <w:t xml:space="preserve">    if consistency is not None:</w:t>
+        <w:t xml:space="preserve"> </w:t>
       </w:r>
     </w:p>
     <w:p>
@@ -25320,7 +25348,7 @@
           <w:sz w:val="17"/>
           <w:szCs w:val="17"/>
         </w:rPr>
-        <w:t xml:space="preserve">        components.append((consistency, config.w_consistency))</w:t>
+        <w:t xml:space="preserve">def verify_answer(answer, context_chunks, nli, resamples=None, config=None):</w:t>
       </w:r>
     </w:p>
     <w:p>
@@ -25340,7 +25368,7 @@
           <w:sz w:val="17"/>
           <w:szCs w:val="17"/>
         </w:rPr>
-        <w:t xml:space="preserve">    total_weight = sum(w for _, w in components)</w:t>
+        <w:t xml:space="preserve">    v1 = check_citation_existence(answer)                       # V1</w:t>
       </w:r>
     </w:p>
     <w:p>
@@ -25360,7 +25388,7 @@
           <w:sz w:val="17"/>
           <w:szCs w:val="17"/>
         </w:rPr>
-        <w:t xml:space="preserve">    if total_weight == 0:</w:t>
+        <w:t xml:space="preserve">    v2 = check_entailment_all(answer.claims, context_chunks, nli)  # V2</w:t>
       </w:r>
     </w:p>
     <w:p>
@@ -25380,7 +25408,87 @@
           <w:sz w:val="17"/>
           <w:szCs w:val="17"/>
         </w:rPr>
-        <w:t xml:space="preserve">        return 0.0, None</w:t>
+        <w:t xml:space="preserve">    v3 = check_fidelity_all(answer.claims, context_chunks, nli)    # V3</w:t>
+      </w:r>
+    </w:p>
+    <w:p>
+      <w:pPr>
+        <w:keepNext/>
+        <w:keepLines/>
+        <w:pBdr>
+          <w:left w:val="single" w:color="808080" w:sz="4" w:space="4"/>
+          <w:right w:val="single" w:color="808080" w:sz="4" w:space="4"/>
+        </w:pBdr>
+        <w:shd w:fill="F2F2F2" w:color="auto" w:val="clear"/>
+        <w:spacing w:after="0" w:before="0" w:line="240"/>
+      </w:pPr>
+      <w:r>
+        <w:rPr>
+          <w:rFonts w:ascii="Courier New" w:cs="Courier New" w:eastAsia="Courier New" w:hAnsi="Courier New"/>
+          <w:sz w:val="17"/>
+          <w:szCs w:val="17"/>
+        </w:rPr>
+        <w:t xml:space="preserve">    v4 = self_consistency(answer, resamples) if resamples else None  # V4</w:t>
+      </w:r>
+    </w:p>
+    <w:p>
+      <w:pPr>
+        <w:keepNext/>
+        <w:keepLines/>
+        <w:pBdr>
+          <w:left w:val="single" w:color="808080" w:sz="4" w:space="4"/>
+          <w:right w:val="single" w:color="808080" w:sz="4" w:space="4"/>
+        </w:pBdr>
+        <w:shd w:fill="F2F2F2" w:color="auto" w:val="clear"/>
+        <w:spacing w:after="0" w:before="0" w:line="240"/>
+      </w:pPr>
+      <w:r>
+        <w:rPr>
+          <w:rFonts w:ascii="Courier New" w:cs="Courier New" w:eastAsia="Courier New" w:hAnsi="Courier New"/>
+          <w:sz w:val="17"/>
+          <w:szCs w:val="17"/>
+        </w:rPr>
+        <w:t xml:space="preserve">    vcs_result = aggregate_vcs(...)             # V5: claim scores, gate 0.60</w:t>
+      </w:r>
+    </w:p>
+    <w:p>
+      <w:pPr>
+        <w:keepNext/>
+        <w:keepLines/>
+        <w:pBdr>
+          <w:left w:val="single" w:color="808080" w:sz="4" w:space="4"/>
+          <w:right w:val="single" w:color="808080" w:sz="4" w:space="4"/>
+        </w:pBdr>
+        <w:shd w:fill="F2F2F2" w:color="auto" w:val="clear"/>
+        <w:spacing w:after="0" w:before="0" w:line="240"/>
+      </w:pPr>
+      <w:r>
+        <w:rPr>
+          <w:rFonts w:ascii="Courier New" w:cs="Courier New" w:eastAsia="Courier New" w:hAnsi="Courier New"/>
+          <w:sz w:val="17"/>
+          <w:szCs w:val="17"/>
+        </w:rPr>
+        <w:t xml:space="preserve">    proof = build_proof(answer.query, answer.raw_text, context_chunks,</w:t>
+      </w:r>
+    </w:p>
+    <w:p>
+      <w:pPr>
+        <w:keepNext/>
+        <w:keepLines/>
+        <w:pBdr>
+          <w:left w:val="single" w:color="808080" w:sz="4" w:space="4"/>
+          <w:right w:val="single" w:color="808080" w:sz="4" w:space="4"/>
+        </w:pBdr>
+        <w:shd w:fill="F2F2F2" w:color="auto" w:val="clear"/>
+        <w:spacing w:after="0" w:before="0" w:line="240"/>
+      </w:pPr>
+      <w:r>
+        <w:rPr>
+          <w:rFonts w:ascii="Courier New" w:cs="Courier New" w:eastAsia="Courier New" w:hAnsi="Courier New"/>
+          <w:sz w:val="17"/>
+          <w:szCs w:val="17"/>
+        </w:rPr>
+        <w:t xml:space="preserve">                        v1=v1, v2=v2, v3=v3, v4=v4, vcs_result=vcs_result)  # V6</w:t>
       </w:r>
     </w:p>
     <w:p>
@@ -25401,7 +25509,7 @@
           <w:sz w:val="17"/>
           <w:szCs w:val="17"/>
         </w:rPr>
-        <w:t xml:space="preserve">    return sum(c * w for c, w in components) / total_weight, None</w:t>
+        <w:t xml:space="preserve">    return VerificationResult(vcs_result, proof)</w:t>
       </w:r>
     </w:p>
     <w:p>
@@ -25415,7 +25523,7 @@
           <w:sz w:val="24"/>
           <w:szCs w:val="24"/>
         </w:rPr>
-        <w:t xml:space="preserve">This function implements Equation 4.2 and the two hard gates. If layer V1 found an invalid citation, or layer V2 returned a contradiction, the claim score is zero and the reason is recorded so that the proof view can show which gate failed. Otherwise the function collects the components of the layers that ran, each with its weight, and returns their weighted mean. Layers that were switched off for an ablation, or that did not run, such as V4 in the web interface, are simply left out of both the sum and the total weight, so they do not lower the score. The answer-level function then averages the claim scores into the Verification Confidence Score and compares it with the threshold of 0.60. The same switches that appear in this code are used by the ablation experiments in Chapter 6 to remove one layer at a time.</w:t>
+        <w:t xml:space="preserve">The first function contains the rules that turn the checks of one claim into a score, which is Equation 4.2. An invalid citation or a contradiction sets the score to zero and records which gate failed, so the proof view can show the reason. Otherwise the function takes the weighted mean of the entailment verdict, the fraction of atomic facts entailed and, when it was measured, the consistency of the claim across resamples, leaving out any layer that did not run. The second function orchestrates the six layers in order, since later layers use the results of earlier ones: it checks the citations, runs the inference model on every claim, checks the atomic facts, measures consistency when resampled answers are supplied, combines everything into the Verification Confidence Score and the decision with the threshold of 0.60, and finally builds the proof object that the web interface shows when a citation is clicked.</w:t>
       </w:r>
     </w:p>
     <w:p>

</xml_diff>

<commit_message>
Report v3: more code for each pipeline part, smaller pipeline figure on page 22, guide's designation and department on separate title-page lines
</commit_message>
<xml_diff>
--- a/Legal_AI_Project_Report_v3.docx
+++ b/Legal_AI_Project_Report_v3.docx
@@ -225,7 +225,7 @@
     </w:p>
     <w:p>
       <w:pPr>
-        <w:spacing w:after="0" w:before="0" w:line="360"/>
+        <w:spacing w:after="0" w:before="0" w:line="300"/>
         <w:jc w:val="center"/>
       </w:pPr>
       <w:r>
@@ -234,7 +234,21 @@
           <w:sz w:val="24"/>
           <w:szCs w:val="24"/>
         </w:rPr>
-        <w:t xml:space="preserve">Assistant Professor, Department of Artificial Intelligence</w:t>
+        <w:t xml:space="preserve">Assistant Professor,</w:t>
+      </w:r>
+    </w:p>
+    <w:p>
+      <w:pPr>
+        <w:spacing w:after="0" w:before="0" w:line="300"/>
+        <w:jc w:val="center"/>
+      </w:pPr>
+      <w:r>
+        <w:rPr>
+          <w:rFonts w:ascii="Times New Roman" w:cs="Times New Roman" w:eastAsia="Times New Roman" w:hAnsi="Times New Roman"/>
+          <w:sz w:val="24"/>
+          <w:szCs w:val="24"/>
+        </w:rPr>
+        <w:t xml:space="preserve">Department of Artificial Intelligence</w:t>
       </w:r>
     </w:p>
     <w:p>
@@ -1933,7 +1947,7 @@
           <w:sz w:val="24"/>
           <w:szCs w:val="24"/>
         </w:rPr>
-        <w:t xml:space="preserve">4.2	System Architecture	24</w:t>
+        <w:t xml:space="preserve">4.2	System Architecture	23</w:t>
       </w:r>
     </w:p>
     <w:p>
@@ -1951,7 +1965,7 @@
           <w:sz w:val="24"/>
           <w:szCs w:val="24"/>
         </w:rPr>
-        <w:t xml:space="preserve">4.3	Module Description	25</w:t>
+        <w:t xml:space="preserve">4.3	Module Description	24</w:t>
       </w:r>
     </w:p>
     <w:p>
@@ -1969,7 +1983,7 @@
           <w:sz w:val="24"/>
           <w:szCs w:val="24"/>
         </w:rPr>
-        <w:t xml:space="preserve">4.3.1	Ingestion and Duplicate Detection Module	25</w:t>
+        <w:t xml:space="preserve">4.3.1	Ingestion and Duplicate Detection Module	24</w:t>
       </w:r>
     </w:p>
     <w:p>
@@ -2005,7 +2019,7 @@
           <w:sz w:val="24"/>
           <w:szCs w:val="24"/>
         </w:rPr>
-        <w:t xml:space="preserve">4.3.3	Embedding and Indexing Module	26</w:t>
+        <w:t xml:space="preserve">4.3.3	Embedding and Indexing Module	25</w:t>
       </w:r>
     </w:p>
     <w:p>
@@ -2023,7 +2037,7 @@
           <w:sz w:val="24"/>
           <w:szCs w:val="24"/>
         </w:rPr>
-        <w:t xml:space="preserve">4.3.4	Hybrid Retrieval and Reranking Module	26</w:t>
+        <w:t xml:space="preserve">4.3.4	Hybrid Retrieval and Reranking Module	25</w:t>
       </w:r>
     </w:p>
     <w:p>
@@ -2059,7 +2073,7 @@
           <w:sz w:val="24"/>
           <w:szCs w:val="24"/>
         </w:rPr>
-        <w:t xml:space="preserve">4.3.6	Verification Module	27</w:t>
+        <w:t xml:space="preserve">4.3.6	Verification Module	26</w:t>
       </w:r>
     </w:p>
     <w:p>
@@ -2095,7 +2109,7 @@
           <w:sz w:val="24"/>
           <w:szCs w:val="24"/>
         </w:rPr>
-        <w:t xml:space="preserve">4.4	Model Selection and Justification	28</w:t>
+        <w:t xml:space="preserve">4.4	Model Selection and Justification	27</w:t>
       </w:r>
     </w:p>
     <w:p>
@@ -2131,7 +2145,7 @@
           <w:sz w:val="24"/>
           <w:szCs w:val="24"/>
         </w:rPr>
-        <w:t xml:space="preserve">4.5.1	Section-Aware Chunking Algorithm	29</w:t>
+        <w:t xml:space="preserve">4.5.1	Section-Aware Chunking Algorithm	28</w:t>
       </w:r>
     </w:p>
     <w:p>
@@ -2475,7 +2489,7 @@
           <w:sz w:val="24"/>
           <w:szCs w:val="24"/>
         </w:rPr>
-        <w:t xml:space="preserve">5.5.2	Query Pipeline	42</w:t>
+        <w:t xml:space="preserve">5.5.2	Query Pipeline	43</w:t>
       </w:r>
     </w:p>
     <w:p>
@@ -2493,7 +2507,7 @@
           <w:sz w:val="24"/>
           <w:szCs w:val="24"/>
         </w:rPr>
-        <w:t xml:space="preserve">5.5.3	Retrieval Comparison and Fusion	42</w:t>
+        <w:t xml:space="preserve">5.5.3	Retrieval Comparison and Fusion	45</w:t>
       </w:r>
     </w:p>
     <w:p>
@@ -2511,7 +2525,7 @@
           <w:sz w:val="24"/>
           <w:szCs w:val="24"/>
         </w:rPr>
-        <w:t xml:space="preserve">5.5.4	Verification Rules and Orchestration	43</w:t>
+        <w:t xml:space="preserve">5.5.4	Verification Rules and Orchestration	47</w:t>
       </w:r>
     </w:p>
     <w:p>
@@ -2529,7 +2543,7 @@
           <w:sz w:val="24"/>
           <w:szCs w:val="24"/>
         </w:rPr>
-        <w:t xml:space="preserve">5.6	Deployment and User Interface	44</w:t>
+        <w:t xml:space="preserve">5.6	Deployment and User Interface	48</w:t>
       </w:r>
     </w:p>
     <w:p>
@@ -2549,7 +2563,7 @@
           <w:sz w:val="24"/>
           <w:szCs w:val="24"/>
         </w:rPr>
-        <w:t xml:space="preserve">6	Results and Discussion	46</w:t>
+        <w:t xml:space="preserve">6	Results and Discussion	50</w:t>
       </w:r>
     </w:p>
     <w:p>
@@ -2567,7 +2581,7 @@
           <w:sz w:val="24"/>
           <w:szCs w:val="24"/>
         </w:rPr>
-        <w:t xml:space="preserve">6.1	Evaluation Metrics	46</w:t>
+        <w:t xml:space="preserve">6.1	Evaluation Metrics	50</w:t>
       </w:r>
     </w:p>
     <w:p>
@@ -2585,7 +2599,7 @@
           <w:sz w:val="24"/>
           <w:szCs w:val="24"/>
         </w:rPr>
-        <w:t xml:space="preserve">6.2	Testing Strategy	46</w:t>
+        <w:t xml:space="preserve">6.2	Testing Strategy	50</w:t>
       </w:r>
     </w:p>
     <w:p>
@@ -2603,7 +2617,7 @@
           <w:sz w:val="24"/>
           <w:szCs w:val="24"/>
         </w:rPr>
-        <w:t xml:space="preserve">6.3	Functional Test Results	47</w:t>
+        <w:t xml:space="preserve">6.3	Functional Test Results	51</w:t>
       </w:r>
     </w:p>
     <w:p>
@@ -2621,7 +2635,7 @@
           <w:sz w:val="24"/>
           <w:szCs w:val="24"/>
         </w:rPr>
-        <w:t xml:space="preserve">6.4	Quantitative Results	48</w:t>
+        <w:t xml:space="preserve">6.4	Quantitative Results	52</w:t>
       </w:r>
     </w:p>
     <w:p>
@@ -2639,7 +2653,7 @@
           <w:sz w:val="24"/>
           <w:szCs w:val="24"/>
         </w:rPr>
-        <w:t xml:space="preserve">6.4.1	Retrieval and Chunking	48</w:t>
+        <w:t xml:space="preserve">6.4.1	Retrieval and Chunking	52</w:t>
       </w:r>
     </w:p>
     <w:p>
@@ -2657,7 +2671,7 @@
           <w:sz w:val="24"/>
           <w:szCs w:val="24"/>
         </w:rPr>
-        <w:t xml:space="preserve">6.4.2	Verification Ablation	50</w:t>
+        <w:t xml:space="preserve">6.4.2	Verification Ablation	54</w:t>
       </w:r>
     </w:p>
     <w:p>
@@ -2675,7 +2689,7 @@
           <w:sz w:val="24"/>
           <w:szCs w:val="24"/>
         </w:rPr>
-        <w:t xml:space="preserve">6.4.3	End-to-End Test Through the Interface	51</w:t>
+        <w:t xml:space="preserve">6.4.3	End-to-End Test Through the Interface	55</w:t>
       </w:r>
     </w:p>
     <w:p>
@@ -2693,7 +2707,7 @@
           <w:sz w:val="24"/>
           <w:szCs w:val="24"/>
         </w:rPr>
-        <w:t xml:space="preserve">6.4.4	LangChain and Plain-Python Comparison	52</w:t>
+        <w:t xml:space="preserve">6.4.4	LangChain and Plain-Python Comparison	56</w:t>
       </w:r>
     </w:p>
     <w:p>
@@ -2711,7 +2725,7 @@
           <w:sz w:val="24"/>
           <w:szCs w:val="24"/>
         </w:rPr>
-        <w:t xml:space="preserve">6.5	Comparison with Existing Methods	53</w:t>
+        <w:t xml:space="preserve">6.5	Comparison with Existing Methods	57</w:t>
       </w:r>
     </w:p>
     <w:p>
@@ -2729,7 +2743,7 @@
           <w:sz w:val="24"/>
           <w:szCs w:val="24"/>
         </w:rPr>
-        <w:t xml:space="preserve">6.6	Error Analysis	53</w:t>
+        <w:t xml:space="preserve">6.6	Error Analysis	57</w:t>
       </w:r>
     </w:p>
     <w:p>
@@ -2747,7 +2761,7 @@
           <w:sz w:val="24"/>
           <w:szCs w:val="24"/>
         </w:rPr>
-        <w:t xml:space="preserve">6.7	Sample Outputs	54</w:t>
+        <w:t xml:space="preserve">6.7	Sample Outputs	58</w:t>
       </w:r>
     </w:p>
     <w:p>
@@ -2765,7 +2779,7 @@
           <w:sz w:val="24"/>
           <w:szCs w:val="24"/>
         </w:rPr>
-        <w:t xml:space="preserve">6.8	Ethical and Responsible AI Considerations	56</w:t>
+        <w:t xml:space="preserve">6.8	Ethical and Responsible AI Considerations	60</w:t>
       </w:r>
     </w:p>
     <w:p>
@@ -2785,7 +2799,7 @@
           <w:sz w:val="24"/>
           <w:szCs w:val="24"/>
         </w:rPr>
-        <w:t xml:space="preserve">7	Conclusion and Future Scope	58</w:t>
+        <w:t xml:space="preserve">7	Conclusion and Future Scope	62</w:t>
       </w:r>
     </w:p>
     <w:p>
@@ -2803,7 +2817,7 @@
           <w:sz w:val="24"/>
           <w:szCs w:val="24"/>
         </w:rPr>
-        <w:t xml:space="preserve">7.1	Conclusion	58</w:t>
+        <w:t xml:space="preserve">7.1	Conclusion	62</w:t>
       </w:r>
     </w:p>
     <w:p>
@@ -2821,7 +2835,7 @@
           <w:sz w:val="24"/>
           <w:szCs w:val="24"/>
         </w:rPr>
-        <w:t xml:space="preserve">7.2	Limitations	58</w:t>
+        <w:t xml:space="preserve">7.2	Limitations	62</w:t>
       </w:r>
     </w:p>
     <w:p>
@@ -2839,7 +2853,7 @@
           <w:sz w:val="24"/>
           <w:szCs w:val="24"/>
         </w:rPr>
-        <w:t xml:space="preserve">7.3	Future Enhancements	59</w:t>
+        <w:t xml:space="preserve">7.3	Future Enhancements	63</w:t>
       </w:r>
     </w:p>
     <w:p>
@@ -2858,7 +2872,7 @@
           <w:sz w:val="24"/>
           <w:szCs w:val="24"/>
         </w:rPr>
-        <w:t xml:space="preserve">	References	60</w:t>
+        <w:t xml:space="preserve">	References	64</w:t>
       </w:r>
     </w:p>
     <w:p>
@@ -2877,7 +2891,7 @@
           <w:sz w:val="24"/>
           <w:szCs w:val="24"/>
         </w:rPr>
-        <w:t xml:space="preserve">	Appendices	63</w:t>
+        <w:t xml:space="preserve">	Appendices	67</w:t>
       </w:r>
     </w:p>
     <w:p>
@@ -2895,7 +2909,7 @@
           <w:sz w:val="24"/>
           <w:szCs w:val="24"/>
         </w:rPr>
-        <w:t xml:space="preserve">	Appendix A: Source Code and Repository	63</w:t>
+        <w:t xml:space="preserve">	Appendix A: Source Code and Repository	67</w:t>
       </w:r>
     </w:p>
     <w:p>
@@ -2913,7 +2927,7 @@
           <w:sz w:val="24"/>
           <w:szCs w:val="24"/>
         </w:rPr>
-        <w:t xml:space="preserve">	Appendix B: Running and Hosting the System	63</w:t>
+        <w:t xml:space="preserve">	Appendix B: Running and Hosting the System	67</w:t>
       </w:r>
     </w:p>
     <w:p>
@@ -2931,7 +2945,7 @@
           <w:sz w:val="24"/>
           <w:szCs w:val="24"/>
         </w:rPr>
-        <w:t xml:space="preserve">	Appendix C: Demonstration Questions	64</w:t>
+        <w:t xml:space="preserve">	Appendix C: Demonstration Questions	68</w:t>
       </w:r>
     </w:p>
     <w:p>
@@ -3288,7 +3302,7 @@
                 <w:sz w:val="22"/>
                 <w:szCs w:val="22"/>
               </w:rPr>
-              <w:t xml:space="preserve">23</w:t>
+              <w:t xml:space="preserve">22</w:t>
             </w:r>
           </w:p>
         </w:tc>
@@ -3395,7 +3409,7 @@
                 <w:sz w:val="22"/>
                 <w:szCs w:val="22"/>
               </w:rPr>
-              <w:t xml:space="preserve">24</w:t>
+              <w:t xml:space="preserve">23</w:t>
             </w:r>
           </w:p>
         </w:tc>
@@ -4251,7 +4265,7 @@
                 <w:sz w:val="22"/>
                 <w:szCs w:val="22"/>
               </w:rPr>
-              <w:t xml:space="preserve">44</w:t>
+              <w:t xml:space="preserve">48</w:t>
             </w:r>
           </w:p>
         </w:tc>
@@ -4358,7 +4372,7 @@
                 <w:sz w:val="22"/>
                 <w:szCs w:val="22"/>
               </w:rPr>
-              <w:t xml:space="preserve">45</w:t>
+              <w:t xml:space="preserve">49</w:t>
             </w:r>
           </w:p>
         </w:tc>
@@ -4465,7 +4479,7 @@
                 <w:sz w:val="22"/>
                 <w:szCs w:val="22"/>
               </w:rPr>
-              <w:t xml:space="preserve">49</w:t>
+              <w:t xml:space="preserve">53</w:t>
             </w:r>
           </w:p>
         </w:tc>
@@ -4572,7 +4586,7 @@
                 <w:sz w:val="22"/>
                 <w:szCs w:val="22"/>
               </w:rPr>
-              <w:t xml:space="preserve">50</w:t>
+              <w:t xml:space="preserve">54</w:t>
             </w:r>
           </w:p>
         </w:tc>
@@ -4679,7 +4693,7 @@
                 <w:sz w:val="22"/>
                 <w:szCs w:val="22"/>
               </w:rPr>
-              <w:t xml:space="preserve">54</w:t>
+              <w:t xml:space="preserve">58</w:t>
             </w:r>
           </w:p>
         </w:tc>
@@ -4786,7 +4800,7 @@
                 <w:sz w:val="22"/>
                 <w:szCs w:val="22"/>
               </w:rPr>
-              <w:t xml:space="preserve">55</w:t>
+              <w:t xml:space="preserve">59</w:t>
             </w:r>
           </w:p>
         </w:tc>
@@ -4893,7 +4907,7 @@
                 <w:sz w:val="22"/>
                 <w:szCs w:val="22"/>
               </w:rPr>
-              <w:t xml:space="preserve">56</w:t>
+              <w:t xml:space="preserve">60</w:t>
             </w:r>
           </w:p>
         </w:tc>
@@ -5000,7 +5014,7 @@
                 <w:sz w:val="22"/>
                 <w:szCs w:val="22"/>
               </w:rPr>
-              <w:t xml:space="preserve">56</w:t>
+              <w:t xml:space="preserve">60</w:t>
             </w:r>
           </w:p>
         </w:tc>
@@ -5788,7 +5802,7 @@
                 <w:sz w:val="22"/>
                 <w:szCs w:val="22"/>
               </w:rPr>
-              <w:t xml:space="preserve">31</w:t>
+              <w:t xml:space="preserve">30</w:t>
             </w:r>
           </w:p>
         </w:tc>
@@ -6323,7 +6337,7 @@
                 <w:sz w:val="22"/>
                 <w:szCs w:val="22"/>
               </w:rPr>
-              <w:t xml:space="preserve">47</w:t>
+              <w:t xml:space="preserve">51</w:t>
             </w:r>
           </w:p>
         </w:tc>
@@ -6430,7 +6444,7 @@
                 <w:sz w:val="22"/>
                 <w:szCs w:val="22"/>
               </w:rPr>
-              <w:t xml:space="preserve">49</w:t>
+              <w:t xml:space="preserve">53</w:t>
             </w:r>
           </w:p>
         </w:tc>
@@ -6537,7 +6551,7 @@
                 <w:sz w:val="22"/>
                 <w:szCs w:val="22"/>
               </w:rPr>
-              <w:t xml:space="preserve">50</w:t>
+              <w:t xml:space="preserve">54</w:t>
             </w:r>
           </w:p>
         </w:tc>
@@ -6644,7 +6658,7 @@
                 <w:sz w:val="22"/>
                 <w:szCs w:val="22"/>
               </w:rPr>
-              <w:t xml:space="preserve">51</w:t>
+              <w:t xml:space="preserve">55</w:t>
             </w:r>
           </w:p>
         </w:tc>
@@ -6751,7 +6765,7 @@
                 <w:sz w:val="22"/>
                 <w:szCs w:val="22"/>
               </w:rPr>
-              <w:t xml:space="preserve">52</w:t>
+              <w:t xml:space="preserve">56</w:t>
             </w:r>
           </w:p>
         </w:tc>
@@ -6858,7 +6872,7 @@
                 <w:sz w:val="22"/>
                 <w:szCs w:val="22"/>
               </w:rPr>
-              <w:t xml:space="preserve">55</w:t>
+              <w:t xml:space="preserve">59</w:t>
             </w:r>
           </w:p>
         </w:tc>
@@ -6965,7 +6979,7 @@
                 <w:sz w:val="22"/>
                 <w:szCs w:val="22"/>
               </w:rPr>
-              <w:t xml:space="preserve">64</w:t>
+              <w:t xml:space="preserve">68</w:t>
             </w:r>
           </w:p>
         </w:tc>
@@ -15637,7 +15651,7 @@
       <w:r>
         <w:drawing>
           <wp:inline distT="0" distB="0" distL="0" distR="0">
-            <wp:extent cx="4019550" cy="5638800"/>
+            <wp:extent cx="2838450" cy="3971925"/>
             <wp:effectExtent t="0" r="0" b="0" l="0"/>
             <wp:docPr id="1" name="" descr="" title=""/>
             <wp:cNvGraphicFramePr>
@@ -15662,7 +15676,7 @@
                   <pic:spPr bwMode="auto">
                     <a:xfrm>
                       <a:off x="0" y="0"/>
-                      <a:ext cx="4019550" cy="5638800"/>
+                      <a:ext cx="2838450" cy="3971925"/>
                     </a:xfrm>
                     <a:prstGeom prst="rect">
                       <a:avLst/>
@@ -24146,10 +24160,10 @@
       <w:r>
         <w:rPr>
           <w:rFonts w:ascii="Courier New" w:cs="Courier New" w:eastAsia="Courier New" w:hAnsi="Courier New"/>
-          <w:sz w:val="17"/>
-          <w:szCs w:val="17"/>
-        </w:rPr>
-        <w:t xml:space="preserve">def ingest_file_with_text(path: str | Path) -&gt; tuple[Document, str]:</w:t>
+          <w:sz w:val="16"/>
+          <w:szCs w:val="16"/>
+        </w:rPr>
+        <w:t xml:space="preserve">def load_pdf(path: str | Path) -&gt; str:</w:t>
       </w:r>
     </w:p>
     <w:p>
@@ -24166,10 +24180,10 @@
       <w:r>
         <w:rPr>
           <w:rFonts w:ascii="Courier New" w:cs="Courier New" w:eastAsia="Courier New" w:hAnsi="Courier New"/>
-          <w:sz w:val="17"/>
-          <w:szCs w:val="17"/>
-        </w:rPr>
-        <w:t xml:space="preserve">    """Load (.txt or .pdf), clean, and parse; return the parsed Document and</w:t>
+          <w:sz w:val="16"/>
+          <w:szCs w:val="16"/>
+        </w:rPr>
+        <w:t xml:space="preserve">    """Load a PDF document and extract its text, page by page, via pypdf."""</w:t>
       </w:r>
     </w:p>
     <w:p>
@@ -24186,10 +24200,10 @@
       <w:r>
         <w:rPr>
           <w:rFonts w:ascii="Courier New" w:cs="Courier New" w:eastAsia="Courier New" w:hAnsi="Courier New"/>
-          <w:sz w:val="17"/>
-          <w:szCs w:val="17"/>
-        </w:rPr>
-        <w:t xml:space="preserve">    the cleaned text, which fallback chunking needs when the document has no</w:t>
+          <w:sz w:val="16"/>
+          <w:szCs w:val="16"/>
+        </w:rPr>
+        <w:t xml:space="preserve">    path = Path(path)</w:t>
       </w:r>
     </w:p>
     <w:p>
@@ -24206,10 +24220,10 @@
       <w:r>
         <w:rPr>
           <w:rFonts w:ascii="Courier New" w:cs="Courier New" w:eastAsia="Courier New" w:hAnsi="Courier New"/>
-          <w:sz w:val="17"/>
-          <w:szCs w:val="17"/>
-        </w:rPr>
-        <w:t xml:space="preserve">    legal structure to parse."""</w:t>
+          <w:sz w:val="16"/>
+          <w:szCs w:val="16"/>
+        </w:rPr>
+        <w:t xml:space="preserve">    if not path.is_file():</w:t>
       </w:r>
     </w:p>
     <w:p>
@@ -24226,10 +24240,10 @@
       <w:r>
         <w:rPr>
           <w:rFonts w:ascii="Courier New" w:cs="Courier New" w:eastAsia="Courier New" w:hAnsi="Courier New"/>
-          <w:sz w:val="17"/>
-          <w:szCs w:val="17"/>
-        </w:rPr>
-        <w:t xml:space="preserve">    path = Path(path)</w:t>
+          <w:sz w:val="16"/>
+          <w:szCs w:val="16"/>
+        </w:rPr>
+        <w:t xml:space="preserve">        raise FileNotFoundError(f"No such file: {path}")</w:t>
       </w:r>
     </w:p>
     <w:p>
@@ -24246,10 +24260,10 @@
       <w:r>
         <w:rPr>
           <w:rFonts w:ascii="Courier New" w:cs="Courier New" w:eastAsia="Courier New" w:hAnsi="Courier New"/>
-          <w:sz w:val="17"/>
-          <w:szCs w:val="17"/>
-        </w:rPr>
-        <w:t xml:space="preserve">    raw = load_document(path)          # pypdf for PDF, plain read for .txt</w:t>
+          <w:sz w:val="16"/>
+          <w:szCs w:val="16"/>
+        </w:rPr>
+        <w:t xml:space="preserve">    reader = PdfReader(str(path))</w:t>
       </w:r>
     </w:p>
     <w:p>
@@ -24266,10 +24280,10 @@
       <w:r>
         <w:rPr>
           <w:rFonts w:ascii="Courier New" w:cs="Courier New" w:eastAsia="Courier New" w:hAnsi="Courier New"/>
-          <w:sz w:val="17"/>
-          <w:szCs w:val="17"/>
-        </w:rPr>
-        <w:t xml:space="preserve">    cleaned = clean_text(raw)</w:t>
+          <w:sz w:val="16"/>
+          <w:szCs w:val="16"/>
+        </w:rPr>
+        <w:t xml:space="preserve">    pages_text = [page.extract_text() or "" for page in reader.pages]</w:t>
       </w:r>
     </w:p>
     <w:p>
@@ -24286,10 +24300,190 @@
       <w:r>
         <w:rPr>
           <w:rFonts w:ascii="Courier New" w:cs="Courier New" w:eastAsia="Courier New" w:hAnsi="Courier New"/>
-          <w:sz w:val="17"/>
-          <w:szCs w:val="17"/>
-        </w:rPr>
-        <w:t xml:space="preserve">    document = parse_document(cleaned, source_id=path.stem.strip())</w:t>
+          <w:sz w:val="16"/>
+          <w:szCs w:val="16"/>
+        </w:rPr>
+        <w:t xml:space="preserve">    return "\n".join(pages_text)</w:t>
+      </w:r>
+    </w:p>
+    <w:p>
+      <w:pPr>
+        <w:keepNext/>
+        <w:keepLines/>
+        <w:pBdr>
+          <w:left w:val="single" w:color="808080" w:sz="4" w:space="4"/>
+          <w:right w:val="single" w:color="808080" w:sz="4" w:space="4"/>
+        </w:pBdr>
+        <w:shd w:fill="F2F2F2" w:color="auto" w:val="clear"/>
+        <w:spacing w:after="0" w:before="0" w:line="240"/>
+      </w:pPr>
+      <w:r>
+        <w:rPr>
+          <w:rFonts w:ascii="Courier New" w:cs="Courier New" w:eastAsia="Courier New" w:hAnsi="Courier New"/>
+          <w:sz w:val="16"/>
+          <w:szCs w:val="16"/>
+        </w:rPr>
+        <w:t xml:space="preserve"> </w:t>
+      </w:r>
+    </w:p>
+    <w:p>
+      <w:pPr>
+        <w:keepNext/>
+        <w:keepLines/>
+        <w:pBdr>
+          <w:left w:val="single" w:color="808080" w:sz="4" w:space="4"/>
+          <w:right w:val="single" w:color="808080" w:sz="4" w:space="4"/>
+        </w:pBdr>
+        <w:shd w:fill="F2F2F2" w:color="auto" w:val="clear"/>
+        <w:spacing w:after="0" w:before="0" w:line="240"/>
+      </w:pPr>
+      <w:r>
+        <w:rPr>
+          <w:rFonts w:ascii="Courier New" w:cs="Courier New" w:eastAsia="Courier New" w:hAnsi="Courier New"/>
+          <w:sz w:val="16"/>
+          <w:szCs w:val="16"/>
+        </w:rPr>
+        <w:t xml:space="preserve">def load_document(path: str | Path) -&gt; str:</w:t>
+      </w:r>
+    </w:p>
+    <w:p>
+      <w:pPr>
+        <w:keepNext/>
+        <w:keepLines/>
+        <w:pBdr>
+          <w:left w:val="single" w:color="808080" w:sz="4" w:space="4"/>
+          <w:right w:val="single" w:color="808080" w:sz="4" w:space="4"/>
+        </w:pBdr>
+        <w:shd w:fill="F2F2F2" w:color="auto" w:val="clear"/>
+        <w:spacing w:after="0" w:before="0" w:line="240"/>
+      </w:pPr>
+      <w:r>
+        <w:rPr>
+          <w:rFonts w:ascii="Courier New" w:cs="Courier New" w:eastAsia="Courier New" w:hAnsi="Courier New"/>
+          <w:sz w:val="16"/>
+          <w:szCs w:val="16"/>
+        </w:rPr>
+        <w:t xml:space="preserve">    """Dispatch to the right loader based on file extension."""</w:t>
+      </w:r>
+    </w:p>
+    <w:p>
+      <w:pPr>
+        <w:keepNext/>
+        <w:keepLines/>
+        <w:pBdr>
+          <w:left w:val="single" w:color="808080" w:sz="4" w:space="4"/>
+          <w:right w:val="single" w:color="808080" w:sz="4" w:space="4"/>
+        </w:pBdr>
+        <w:shd w:fill="F2F2F2" w:color="auto" w:val="clear"/>
+        <w:spacing w:after="0" w:before="0" w:line="240"/>
+      </w:pPr>
+      <w:r>
+        <w:rPr>
+          <w:rFonts w:ascii="Courier New" w:cs="Courier New" w:eastAsia="Courier New" w:hAnsi="Courier New"/>
+          <w:sz w:val="16"/>
+          <w:szCs w:val="16"/>
+        </w:rPr>
+        <w:t xml:space="preserve">    path = Path(path)</w:t>
+      </w:r>
+    </w:p>
+    <w:p>
+      <w:pPr>
+        <w:keepNext/>
+        <w:keepLines/>
+        <w:pBdr>
+          <w:left w:val="single" w:color="808080" w:sz="4" w:space="4"/>
+          <w:right w:val="single" w:color="808080" w:sz="4" w:space="4"/>
+        </w:pBdr>
+        <w:shd w:fill="F2F2F2" w:color="auto" w:val="clear"/>
+        <w:spacing w:after="0" w:before="0" w:line="240"/>
+      </w:pPr>
+      <w:r>
+        <w:rPr>
+          <w:rFonts w:ascii="Courier New" w:cs="Courier New" w:eastAsia="Courier New" w:hAnsi="Courier New"/>
+          <w:sz w:val="16"/>
+          <w:szCs w:val="16"/>
+        </w:rPr>
+        <w:t xml:space="preserve">    suffix = path.suffix.lower()</w:t>
+      </w:r>
+    </w:p>
+    <w:p>
+      <w:pPr>
+        <w:keepNext/>
+        <w:keepLines/>
+        <w:pBdr>
+          <w:left w:val="single" w:color="808080" w:sz="4" w:space="4"/>
+          <w:right w:val="single" w:color="808080" w:sz="4" w:space="4"/>
+        </w:pBdr>
+        <w:shd w:fill="F2F2F2" w:color="auto" w:val="clear"/>
+        <w:spacing w:after="0" w:before="0" w:line="240"/>
+      </w:pPr>
+      <w:r>
+        <w:rPr>
+          <w:rFonts w:ascii="Courier New" w:cs="Courier New" w:eastAsia="Courier New" w:hAnsi="Courier New"/>
+          <w:sz w:val="16"/>
+          <w:szCs w:val="16"/>
+        </w:rPr>
+        <w:t xml:space="preserve">    try:</w:t>
+      </w:r>
+    </w:p>
+    <w:p>
+      <w:pPr>
+        <w:keepNext/>
+        <w:keepLines/>
+        <w:pBdr>
+          <w:left w:val="single" w:color="808080" w:sz="4" w:space="4"/>
+          <w:right w:val="single" w:color="808080" w:sz="4" w:space="4"/>
+        </w:pBdr>
+        <w:shd w:fill="F2F2F2" w:color="auto" w:val="clear"/>
+        <w:spacing w:after="0" w:before="0" w:line="240"/>
+      </w:pPr>
+      <w:r>
+        <w:rPr>
+          <w:rFonts w:ascii="Courier New" w:cs="Courier New" w:eastAsia="Courier New" w:hAnsi="Courier New"/>
+          <w:sz w:val="16"/>
+          <w:szCs w:val="16"/>
+        </w:rPr>
+        <w:t xml:space="preserve">        loader = _LOADERS[suffix]      # .txt, .pdf</w:t>
+      </w:r>
+    </w:p>
+    <w:p>
+      <w:pPr>
+        <w:keepNext/>
+        <w:keepLines/>
+        <w:pBdr>
+          <w:left w:val="single" w:color="808080" w:sz="4" w:space="4"/>
+          <w:right w:val="single" w:color="808080" w:sz="4" w:space="4"/>
+        </w:pBdr>
+        <w:shd w:fill="F2F2F2" w:color="auto" w:val="clear"/>
+        <w:spacing w:after="0" w:before="0" w:line="240"/>
+      </w:pPr>
+      <w:r>
+        <w:rPr>
+          <w:rFonts w:ascii="Courier New" w:cs="Courier New" w:eastAsia="Courier New" w:hAnsi="Courier New"/>
+          <w:sz w:val="16"/>
+          <w:szCs w:val="16"/>
+        </w:rPr>
+        <w:t xml:space="preserve">    except KeyError as exc:</w:t>
+      </w:r>
+    </w:p>
+    <w:p>
+      <w:pPr>
+        <w:keepNext/>
+        <w:keepLines/>
+        <w:pBdr>
+          <w:left w:val="single" w:color="808080" w:sz="4" w:space="4"/>
+          <w:right w:val="single" w:color="808080" w:sz="4" w:space="4"/>
+        </w:pBdr>
+        <w:shd w:fill="F2F2F2" w:color="auto" w:val="clear"/>
+        <w:spacing w:after="0" w:before="0" w:line="240"/>
+      </w:pPr>
+      <w:r>
+        <w:rPr>
+          <w:rFonts w:ascii="Courier New" w:cs="Courier New" w:eastAsia="Courier New" w:hAnsi="Courier New"/>
+          <w:sz w:val="16"/>
+          <w:szCs w:val="16"/>
+        </w:rPr>
+        <w:t xml:space="preserve">        raise ValueError(f"No loader registered for {suffix!r}") from exc</w:t>
       </w:r>
     </w:p>
     <w:p>
@@ -24307,41 +24501,10 @@
       <w:r>
         <w:rPr>
           <w:rFonts w:ascii="Courier New" w:cs="Courier New" w:eastAsia="Courier New" w:hAnsi="Courier New"/>
-          <w:sz w:val="17"/>
-          <w:szCs w:val="17"/>
-        </w:rPr>
-        <w:t xml:space="preserve">    return document, cleaned</w:t>
-      </w:r>
-    </w:p>
-    <w:p>
-      <w:pPr>
-        <w:spacing w:after="160" w:line="360"/>
-        <w:jc w:val="both"/>
-      </w:pPr>
-      <w:r>
-        <w:rPr>
-          <w:rFonts w:ascii="Times New Roman" w:cs="Times New Roman" w:eastAsia="Times New Roman" w:hAnsi="Times New Roman"/>
-          <w:sz w:val="24"/>
-          <w:szCs w:val="24"/>
-        </w:rPr>
-        <w:t xml:space="preserve">This function is the entry point of text extraction. It reads an uploaded file with the loader for its type, which uses the pypdf library for PDF files and a plain read for text files, and then cleans the text by normalising whitespace and removing artefacts of extraction while keeping the line breaks that mark headings. The cleaned text is passed to the structure parser, which recognises chapters, sections and clauses and returns a document object with its legal hierarchy. The function also returns the cleaned text itself, because a document without any legal structure, such as a contract, is split by the paragraph fallback instead. The source identifier is taken from the file name with surrounding spaces removed, a fix added after testing showed that a stray space in a file name broke every citation identifier of that document.</w:t>
-      </w:r>
-    </w:p>
-    <w:p>
-      <w:pPr>
-        <w:pStyle w:val="Heading3"/>
-        <w:keepNext/>
-        <w:spacing w:after="100" w:before="200"/>
-      </w:pPr>
-      <w:r>
-        <w:rPr>
-          <w:rFonts w:ascii="Times New Roman" w:cs="Times New Roman" w:eastAsia="Times New Roman" w:hAnsi="Times New Roman"/>
-          <w:b/>
-          <w:bCs/>
-          <w:sz w:val="24"/>
-          <w:szCs w:val="24"/>
-        </w:rPr>
-        <w:t xml:space="preserve">5.5.2  Query Pipeline</w:t>
+          <w:sz w:val="16"/>
+          <w:szCs w:val="16"/>
+        </w:rPr>
+        <w:t xml:space="preserve">    return loader(path)</w:t>
       </w:r>
     </w:p>
     <w:p>
@@ -24359,10 +24522,10 @@
       <w:r>
         <w:rPr>
           <w:rFonts w:ascii="Courier New" w:cs="Courier New" w:eastAsia="Courier New" w:hAnsi="Courier New"/>
-          <w:sz w:val="17"/>
-          <w:szCs w:val="17"/>
-        </w:rPr>
-        <w:t xml:space="preserve">def build_query_chain(retriever, llm, nli) -&gt; Runnable:</w:t>
+          <w:sz w:val="16"/>
+          <w:szCs w:val="16"/>
+        </w:rPr>
+        <w:t xml:space="preserve">def ingest_file_with_text(path: str | Path) -&gt; tuple[Document, str]:</w:t>
       </w:r>
     </w:p>
     <w:p>
@@ -24379,10 +24542,10 @@
       <w:r>
         <w:rPr>
           <w:rFonts w:ascii="Courier New" w:cs="Courier New" w:eastAsia="Courier New" w:hAnsi="Courier New"/>
-          <w:sz w:val="17"/>
-          <w:szCs w:val="17"/>
-        </w:rPr>
-        <w:t xml:space="preserve">    """Input: {question, self_consistency, allow_general_knowledge}."""</w:t>
+          <w:sz w:val="16"/>
+          <w:szCs w:val="16"/>
+        </w:rPr>
+        <w:t xml:space="preserve">    """Load (.txt or .pdf), clean, and parse; return the parsed Document and</w:t>
       </w:r>
     </w:p>
     <w:p>
@@ -24399,10 +24562,10 @@
       <w:r>
         <w:rPr>
           <w:rFonts w:ascii="Courier New" w:cs="Courier New" w:eastAsia="Courier New" w:hAnsi="Courier New"/>
-          <w:sz w:val="17"/>
-          <w:szCs w:val="17"/>
-        </w:rPr>
-        <w:t xml:space="preserve">    answer = answer_chain(llm)          # prompt | llm | citation parser</w:t>
+          <w:sz w:val="16"/>
+          <w:szCs w:val="16"/>
+        </w:rPr>
+        <w:t xml:space="preserve">    the cleaned text, which fallback chunking needs when the document has no</w:t>
       </w:r>
     </w:p>
     <w:p>
@@ -24419,10 +24582,10 @@
       <w:r>
         <w:rPr>
           <w:rFonts w:ascii="Courier New" w:cs="Courier New" w:eastAsia="Courier New" w:hAnsi="Courier New"/>
-          <w:sz w:val="17"/>
-          <w:szCs w:val="17"/>
-        </w:rPr>
-        <w:t xml:space="preserve">    ...</w:t>
+          <w:sz w:val="16"/>
+          <w:szCs w:val="16"/>
+        </w:rPr>
+        <w:t xml:space="preserve">    legal structure to parse."""</w:t>
       </w:r>
     </w:p>
     <w:p>
@@ -24439,10 +24602,10 @@
       <w:r>
         <w:rPr>
           <w:rFonts w:ascii="Courier New" w:cs="Courier New" w:eastAsia="Courier New" w:hAnsi="Courier New"/>
-          <w:sz w:val="17"/>
-          <w:szCs w:val="17"/>
-        </w:rPr>
-        <w:t xml:space="preserve">    return (</w:t>
+          <w:sz w:val="16"/>
+          <w:szCs w:val="16"/>
+        </w:rPr>
+        <w:t xml:space="preserve">    path = Path(path)</w:t>
       </w:r>
     </w:p>
     <w:p>
@@ -24459,10 +24622,10 @@
       <w:r>
         <w:rPr>
           <w:rFonts w:ascii="Courier New" w:cs="Courier New" w:eastAsia="Courier New" w:hAnsi="Courier New"/>
-          <w:sz w:val="17"/>
-          <w:szCs w:val="17"/>
-        </w:rPr>
-        <w:t xml:space="preserve">        RunnablePassthrough.assign(context=itemgetter("question") | retriever)</w:t>
+          <w:sz w:val="16"/>
+          <w:szCs w:val="16"/>
+        </w:rPr>
+        <w:t xml:space="preserve">    raw = load_document(path)          # pypdf for PDF, plain read for .txt</w:t>
       </w:r>
     </w:p>
     <w:p>
@@ -24479,10 +24642,10 @@
       <w:r>
         <w:rPr>
           <w:rFonts w:ascii="Courier New" w:cs="Courier New" w:eastAsia="Courier New" w:hAnsi="Courier New"/>
-          <w:sz w:val="17"/>
-          <w:szCs w:val="17"/>
-        </w:rPr>
-        <w:t xml:space="preserve">        | RunnablePassthrough.assign(prompt=RunnableLambda(_prompt_messages))</w:t>
+          <w:sz w:val="16"/>
+          <w:szCs w:val="16"/>
+        </w:rPr>
+        <w:t xml:space="preserve">    cleaned = clean_text(raw)</w:t>
       </w:r>
     </w:p>
     <w:p>
@@ -24499,170 +24662,10 @@
       <w:r>
         <w:rPr>
           <w:rFonts w:ascii="Courier New" w:cs="Courier New" w:eastAsia="Courier New" w:hAnsi="Courier New"/>
-          <w:sz w:val="17"/>
-          <w:szCs w:val="17"/>
-        </w:rPr>
-        <w:t xml:space="preserve">        | RunnablePassthrough.assign(parsed=_guard(answer, "generate"))</w:t>
-      </w:r>
-    </w:p>
-    <w:p>
-      <w:pPr>
-        <w:keepNext/>
-        <w:keepLines/>
-        <w:pBdr>
-          <w:left w:val="single" w:color="808080" w:sz="4" w:space="4"/>
-          <w:right w:val="single" w:color="808080" w:sz="4" w:space="4"/>
-        </w:pBdr>
-        <w:shd w:fill="F2F2F2" w:color="auto" w:val="clear"/>
-        <w:spacing w:after="0" w:before="0" w:line="240"/>
-      </w:pPr>
-      <w:r>
-        <w:rPr>
-          <w:rFonts w:ascii="Courier New" w:cs="Courier New" w:eastAsia="Courier New" w:hAnsi="Courier New"/>
-          <w:sz w:val="17"/>
-          <w:szCs w:val="17"/>
-        </w:rPr>
-        <w:t xml:space="preserve">        | RunnablePassthrough.assign(resamples=_guard(RunnableLambda(_resamples),</w:t>
-      </w:r>
-    </w:p>
-    <w:p>
-      <w:pPr>
-        <w:keepNext/>
-        <w:keepLines/>
-        <w:pBdr>
-          <w:left w:val="single" w:color="808080" w:sz="4" w:space="4"/>
-          <w:right w:val="single" w:color="808080" w:sz="4" w:space="4"/>
-        </w:pBdr>
-        <w:shd w:fill="F2F2F2" w:color="auto" w:val="clear"/>
-        <w:spacing w:after="0" w:before="0" w:line="240"/>
-      </w:pPr>
-      <w:r>
-        <w:rPr>
-          <w:rFonts w:ascii="Courier New" w:cs="Courier New" w:eastAsia="Courier New" w:hAnsi="Courier New"/>
-          <w:sz w:val="17"/>
-          <w:szCs w:val="17"/>
-        </w:rPr>
-        <w:t xml:space="preserve">                                                      "resample"))</w:t>
-      </w:r>
-    </w:p>
-    <w:p>
-      <w:pPr>
-        <w:keepNext/>
-        <w:keepLines/>
-        <w:pBdr>
-          <w:left w:val="single" w:color="808080" w:sz="4" w:space="4"/>
-          <w:right w:val="single" w:color="808080" w:sz="4" w:space="4"/>
-        </w:pBdr>
-        <w:shd w:fill="F2F2F2" w:color="auto" w:val="clear"/>
-        <w:spacing w:after="0" w:before="0" w:line="240"/>
-      </w:pPr>
-      <w:r>
-        <w:rPr>
-          <w:rFonts w:ascii="Courier New" w:cs="Courier New" w:eastAsia="Courier New" w:hAnsi="Courier New"/>
-          <w:sz w:val="17"/>
-          <w:szCs w:val="17"/>
-        </w:rPr>
-        <w:t xml:space="preserve">        | RunnablePassthrough.assign(verification=verification_step(nli))</w:t>
-      </w:r>
-    </w:p>
-    <w:p>
-      <w:pPr>
-        <w:keepNext/>
-        <w:keepLines/>
-        <w:pBdr>
-          <w:left w:val="single" w:color="808080" w:sz="4" w:space="4"/>
-          <w:right w:val="single" w:color="808080" w:sz="4" w:space="4"/>
-        </w:pBdr>
-        <w:shd w:fill="F2F2F2" w:color="auto" w:val="clear"/>
-        <w:spacing w:after="0" w:before="0" w:line="240"/>
-      </w:pPr>
-      <w:r>
-        <w:rPr>
-          <w:rFonts w:ascii="Courier New" w:cs="Courier New" w:eastAsia="Courier New" w:hAnsi="Courier New"/>
-          <w:sz w:val="17"/>
-          <w:szCs w:val="17"/>
-        </w:rPr>
-        <w:t xml:space="preserve">        | RunnableBranch(</w:t>
-      </w:r>
-    </w:p>
-    <w:p>
-      <w:pPr>
-        <w:keepNext/>
-        <w:keepLines/>
-        <w:pBdr>
-          <w:left w:val="single" w:color="808080" w:sz="4" w:space="4"/>
-          <w:right w:val="single" w:color="808080" w:sz="4" w:space="4"/>
-        </w:pBdr>
-        <w:shd w:fill="F2F2F2" w:color="auto" w:val="clear"/>
-        <w:spacing w:after="0" w:before="0" w:line="240"/>
-      </w:pPr>
-      <w:r>
-        <w:rPr>
-          <w:rFonts w:ascii="Courier New" w:cs="Courier New" w:eastAsia="Courier New" w:hAnsi="Courier New"/>
-          <w:sz w:val="17"/>
-          <w:szCs w:val="17"/>
-        </w:rPr>
-        <w:t xml:space="preserve">            (wants_general_knowledge,</w:t>
-      </w:r>
-    </w:p>
-    <w:p>
-      <w:pPr>
-        <w:keepNext/>
-        <w:keepLines/>
-        <w:pBdr>
-          <w:left w:val="single" w:color="808080" w:sz="4" w:space="4"/>
-          <w:right w:val="single" w:color="808080" w:sz="4" w:space="4"/>
-        </w:pBdr>
-        <w:shd w:fill="F2F2F2" w:color="auto" w:val="clear"/>
-        <w:spacing w:after="0" w:before="0" w:line="240"/>
-      </w:pPr>
-      <w:r>
-        <w:rPr>
-          <w:rFonts w:ascii="Courier New" w:cs="Courier New" w:eastAsia="Courier New" w:hAnsi="Courier New"/>
-          <w:sz w:val="17"/>
-          <w:szCs w:val="17"/>
-        </w:rPr>
-        <w:t xml:space="preserve">             RunnablePassthrough.assign(general_text=RunnableLambda(_general))),</w:t>
-      </w:r>
-    </w:p>
-    <w:p>
-      <w:pPr>
-        <w:keepNext/>
-        <w:keepLines/>
-        <w:pBdr>
-          <w:left w:val="single" w:color="808080" w:sz="4" w:space="4"/>
-          <w:right w:val="single" w:color="808080" w:sz="4" w:space="4"/>
-        </w:pBdr>
-        <w:shd w:fill="F2F2F2" w:color="auto" w:val="clear"/>
-        <w:spacing w:after="0" w:before="0" w:line="240"/>
-      </w:pPr>
-      <w:r>
-        <w:rPr>
-          <w:rFonts w:ascii="Courier New" w:cs="Courier New" w:eastAsia="Courier New" w:hAnsi="Courier New"/>
-          <w:sz w:val="17"/>
-          <w:szCs w:val="17"/>
-        </w:rPr>
-        <w:t xml:space="preserve">            RunnablePassthrough.assign(general_text=lambda _: None),</w:t>
-      </w:r>
-    </w:p>
-    <w:p>
-      <w:pPr>
-        <w:keepNext/>
-        <w:keepLines/>
-        <w:pBdr>
-          <w:left w:val="single" w:color="808080" w:sz="4" w:space="4"/>
-          <w:right w:val="single" w:color="808080" w:sz="4" w:space="4"/>
-        </w:pBdr>
-        <w:shd w:fill="F2F2F2" w:color="auto" w:val="clear"/>
-        <w:spacing w:after="0" w:before="0" w:line="240"/>
-      </w:pPr>
-      <w:r>
-        <w:rPr>
-          <w:rFonts w:ascii="Courier New" w:cs="Courier New" w:eastAsia="Courier New" w:hAnsi="Courier New"/>
-          <w:sz w:val="17"/>
-          <w:szCs w:val="17"/>
-        </w:rPr>
-        <w:t xml:space="preserve">        )</w:t>
+          <w:sz w:val="16"/>
+          <w:szCs w:val="16"/>
+        </w:rPr>
+        <w:t xml:space="preserve">    document = parse_document(cleaned, source_id=path.stem.strip())</w:t>
       </w:r>
     </w:p>
     <w:p>
@@ -24680,10 +24683,10 @@
       <w:r>
         <w:rPr>
           <w:rFonts w:ascii="Courier New" w:cs="Courier New" w:eastAsia="Courier New" w:hAnsi="Courier New"/>
-          <w:sz w:val="17"/>
-          <w:szCs w:val="17"/>
-        </w:rPr>
-        <w:t xml:space="preserve">    )</w:t>
+          <w:sz w:val="16"/>
+          <w:szCs w:val="16"/>
+        </w:rPr>
+        <w:t xml:space="preserve">    return document, cleaned</w:t>
       </w:r>
     </w:p>
     <w:p>
@@ -24697,24 +24700,7 @@
           <w:sz w:val="24"/>
           <w:szCs w:val="24"/>
         </w:rPr>
-        <w:t xml:space="preserve">This function builds the complete question-answering pipeline as a single LangChain chain. Each step adds its result to a shared state without removing what came before: the retriever adds the context chunks, the prompt step adds the exact messages sent to the model, the answer step adds the parsed claims and citations, the optional resampling step adds extra answers for the consistency check, and the verification step adds the score, the decision and the proof object. The final branch sends a question about a general legal concept to the general-knowledge path, which produces a labelled answer without citations, and leaves every other question on the verified path. Because the state keeps every intermediate result, the API can return a full trace of how an answer was produced, which was essential for finding the defects described in Chapter 6.</w:t>
-      </w:r>
-    </w:p>
-    <w:p>
-      <w:pPr>
-        <w:pStyle w:val="Heading3"/>
-        <w:keepNext/>
-        <w:spacing w:after="100" w:before="200"/>
-      </w:pPr>
-      <w:r>
-        <w:rPr>
-          <w:rFonts w:ascii="Times New Roman" w:cs="Times New Roman" w:eastAsia="Times New Roman" w:hAnsi="Times New Roman"/>
-          <w:b/>
-          <w:bCs/>
-          <w:sz w:val="24"/>
-          <w:szCs w:val="24"/>
-        </w:rPr>
-        <w:t xml:space="preserve">5.5.3  Retrieval Comparison and Fusion</w:t>
+        <w:t xml:space="preserve">This function is the entry point of text extraction. It reads an uploaded file with the loader for its type, which uses the pypdf library for PDF files and a plain read for text files, and then cleans the text by normalising whitespace and removing artefacts of extraction while keeping the line breaks that mark headings. The cleaned text is passed to the structure parser, which recognises chapters, sections and clauses and returns a document object with its legal hierarchy. The function also returns the cleaned text itself, because a document without any legal structure, such as a contract, is split by the paragraph fallback instead. The source identifier is taken from the file name with surrounding spaces removed, a fix added after testing showed that a stray space in a file name broke every citation identifier of that document.</w:t>
       </w:r>
     </w:p>
     <w:p>
@@ -24732,10 +24718,10 @@
       <w:r>
         <w:rPr>
           <w:rFonts w:ascii="Courier New" w:cs="Courier New" w:eastAsia="Courier New" w:hAnsi="Courier New"/>
-          <w:sz w:val="17"/>
-          <w:szCs w:val="17"/>
-        </w:rPr>
-        <w:t xml:space="preserve">def weighted_reciprocal_rank(self, doc_lists):</w:t>
+          <w:sz w:val="16"/>
+          <w:szCs w:val="16"/>
+        </w:rPr>
+        <w:t xml:space="preserve">def parse_document(cleaned_text: str, source_id: str) -&gt; Document:</w:t>
       </w:r>
     </w:p>
     <w:p>
@@ -24752,10 +24738,10 @@
       <w:r>
         <w:rPr>
           <w:rFonts w:ascii="Courier New" w:cs="Courier New" w:eastAsia="Courier New" w:hAnsi="Courier New"/>
-          <w:sz w:val="17"/>
-          <w:szCs w:val="17"/>
-        </w:rPr>
-        <w:t xml:space="preserve">    scores, first = {}, {}</w:t>
+          <w:sz w:val="16"/>
+          <w:szCs w:val="16"/>
+        </w:rPr>
+        <w:t xml:space="preserve">    """Parse a cleaned statute into its Act/Chapter/Section/Clause hierarchy."""</w:t>
       </w:r>
     </w:p>
     <w:p>
@@ -24772,10 +24758,10 @@
       <w:r>
         <w:rPr>
           <w:rFonts w:ascii="Courier New" w:cs="Courier New" w:eastAsia="Courier New" w:hAnsi="Courier New"/>
-          <w:sz w:val="17"/>
-          <w:szCs w:val="17"/>
-        </w:rPr>
-        <w:t xml:space="preserve">    for doc_list, weight in zip(doc_lists, self.weights):   # dense, BM25</w:t>
+          <w:sz w:val="16"/>
+          <w:szCs w:val="16"/>
+        </w:rPr>
+        <w:t xml:space="preserve">    lines = [line.strip() for line in cleaned_text.split("\n")]</w:t>
       </w:r>
     </w:p>
     <w:p>
@@ -24792,10 +24778,10 @@
       <w:r>
         <w:rPr>
           <w:rFonts w:ascii="Courier New" w:cs="Courier New" w:eastAsia="Courier New" w:hAnsi="Courier New"/>
-          <w:sz w:val="17"/>
-          <w:szCs w:val="17"/>
-        </w:rPr>
-        <w:t xml:space="preserve">        for rank, doc in enumerate(doc_list, start=1):</w:t>
+          <w:sz w:val="16"/>
+          <w:szCs w:val="16"/>
+        </w:rPr>
+        <w:t xml:space="preserve">    chapters, current_chapter, current_section = [], None, None</w:t>
       </w:r>
     </w:p>
     <w:p>
@@ -24812,10 +24798,10 @@
       <w:r>
         <w:rPr>
           <w:rFonts w:ascii="Courier New" w:cs="Courier New" w:eastAsia="Courier New" w:hAnsi="Courier New"/>
-          <w:sz w:val="17"/>
-          <w:szCs w:val="17"/>
-        </w:rPr>
-        <w:t xml:space="preserve">            key = doc.metadata[self.id_key]</w:t>
+          <w:sz w:val="16"/>
+          <w:szCs w:val="16"/>
+        </w:rPr>
+        <w:t xml:space="preserve">    ...</w:t>
       </w:r>
     </w:p>
     <w:p>
@@ -24832,10 +24818,10 @@
       <w:r>
         <w:rPr>
           <w:rFonts w:ascii="Courier New" w:cs="Courier New" w:eastAsia="Courier New" w:hAnsi="Courier New"/>
-          <w:sz w:val="17"/>
-          <w:szCs w:val="17"/>
-        </w:rPr>
-        <w:t xml:space="preserve">            scores[key] = scores.get(key, 0.0) + weight / (rank + self.c)</w:t>
+          <w:sz w:val="16"/>
+          <w:szCs w:val="16"/>
+        </w:rPr>
+        <w:t xml:space="preserve">    for line in lines:</w:t>
       </w:r>
     </w:p>
     <w:p>
@@ -24852,10 +24838,10 @@
       <w:r>
         <w:rPr>
           <w:rFonts w:ascii="Courier New" w:cs="Courier New" w:eastAsia="Courier New" w:hAnsi="Courier New"/>
-          <w:sz w:val="17"/>
-          <w:szCs w:val="17"/>
-        </w:rPr>
-        <w:t xml:space="preserve">            first.setdefault(key, doc)</w:t>
+          <w:sz w:val="16"/>
+          <w:szCs w:val="16"/>
+        </w:rPr>
+        <w:t xml:space="preserve">        if not line:</w:t>
       </w:r>
     </w:p>
     <w:p>
@@ -24872,10 +24858,10 @@
       <w:r>
         <w:rPr>
           <w:rFonts w:ascii="Courier New" w:cs="Courier New" w:eastAsia="Courier New" w:hAnsi="Courier New"/>
-          <w:sz w:val="17"/>
-          <w:szCs w:val="17"/>
-        </w:rPr>
-        <w:t xml:space="preserve">    ranked = sorted(scores, key=lambda key: scores[key],</w:t>
+          <w:sz w:val="16"/>
+          <w:szCs w:val="16"/>
+        </w:rPr>
+        <w:t xml:space="preserve">            continue</w:t>
       </w:r>
     </w:p>
     <w:p>
@@ -24892,10 +24878,10 @@
       <w:r>
         <w:rPr>
           <w:rFonts w:ascii="Courier New" w:cs="Courier New" w:eastAsia="Courier New" w:hAnsi="Courier New"/>
-          <w:sz w:val="17"/>
-          <w:szCs w:val="17"/>
-        </w:rPr>
-        <w:t xml:space="preserve">                    reverse=True)[: self.limit]</w:t>
+          <w:sz w:val="16"/>
+          <w:szCs w:val="16"/>
+        </w:rPr>
+        <w:t xml:space="preserve">        m = _CHAPTER_RE.match(line)</w:t>
       </w:r>
     </w:p>
     <w:p>
@@ -24912,10 +24898,10 @@
       <w:r>
         <w:rPr>
           <w:rFonts w:ascii="Courier New" w:cs="Courier New" w:eastAsia="Courier New" w:hAnsi="Courier New"/>
-          <w:sz w:val="17"/>
-          <w:szCs w:val="17"/>
-        </w:rPr>
-        <w:t xml:space="preserve">    return [_copy(first[key], _relevance_score=scores[key]) for key in ranked]</w:t>
+          <w:sz w:val="16"/>
+          <w:szCs w:val="16"/>
+        </w:rPr>
+        <w:t xml:space="preserve">        if m:</w:t>
       </w:r>
     </w:p>
     <w:p>
@@ -24932,10 +24918,10 @@
       <w:r>
         <w:rPr>
           <w:rFonts w:ascii="Courier New" w:cs="Courier New" w:eastAsia="Courier New" w:hAnsi="Courier New"/>
-          <w:sz w:val="17"/>
-          <w:szCs w:val="17"/>
-        </w:rPr>
-        <w:t xml:space="preserve"> </w:t>
+          <w:sz w:val="16"/>
+          <w:szCs w:val="16"/>
+        </w:rPr>
+        <w:t xml:space="preserve">            flush_section()</w:t>
       </w:r>
     </w:p>
     <w:p>
@@ -24952,10 +24938,10 @@
       <w:r>
         <w:rPr>
           <w:rFonts w:ascii="Courier New" w:cs="Courier New" w:eastAsia="Courier New" w:hAnsi="Courier New"/>
-          <w:sz w:val="17"/>
-          <w:szCs w:val="17"/>
-        </w:rPr>
-        <w:t xml:space="preserve">def query_retriever(store, k, n, reranker=None):</w:t>
+          <w:sz w:val="16"/>
+          <w:szCs w:val="16"/>
+        </w:rPr>
+        <w:t xml:space="preserve">            current_chapter = Chapter(number=m.group(1), name=m.group(2).strip())</w:t>
       </w:r>
     </w:p>
     <w:p>
@@ -24972,10 +24958,10 @@
       <w:r>
         <w:rPr>
           <w:rFonts w:ascii="Courier New" w:cs="Courier New" w:eastAsia="Courier New" w:hAnsi="Courier New"/>
-          <w:sz w:val="17"/>
-          <w:szCs w:val="17"/>
-        </w:rPr>
-        <w:t xml:space="preserve">    if reranker is None:</w:t>
+          <w:sz w:val="16"/>
+          <w:szCs w:val="16"/>
+        </w:rPr>
+        <w:t xml:space="preserve">            chapters.append(current_chapter)</w:t>
       </w:r>
     </w:p>
     <w:p>
@@ -24992,10 +24978,10 @@
       <w:r>
         <w:rPr>
           <w:rFonts w:ascii="Courier New" w:cs="Courier New" w:eastAsia="Courier New" w:hAnsi="Courier New"/>
-          <w:sz w:val="17"/>
-          <w:szCs w:val="17"/>
-        </w:rPr>
-        <w:t xml:space="preserve">        return hybrid_retriever(store, k)</w:t>
+          <w:sz w:val="16"/>
+          <w:szCs w:val="16"/>
+        </w:rPr>
+        <w:t xml:space="preserve">            continue</w:t>
       </w:r>
     </w:p>
     <w:p>
@@ -25012,10 +24998,10 @@
       <w:r>
         <w:rPr>
           <w:rFonts w:ascii="Courier New" w:cs="Courier New" w:eastAsia="Courier New" w:hAnsi="Courier New"/>
-          <w:sz w:val="17"/>
-          <w:szCs w:val="17"/>
-        </w:rPr>
-        <w:t xml:space="preserve">    return ContextualCompressionRetriever(</w:t>
+          <w:sz w:val="16"/>
+          <w:szCs w:val="16"/>
+        </w:rPr>
+        <w:t xml:space="preserve">        m = _SECTION_RE.match(line)          # "Section 379. Punishment..."</w:t>
       </w:r>
     </w:p>
     <w:p>
@@ -25032,10 +25018,330 @@
       <w:r>
         <w:rPr>
           <w:rFonts w:ascii="Courier New" w:cs="Courier New" w:eastAsia="Courier New" w:hAnsi="Courier New"/>
-          <w:sz w:val="17"/>
-          <w:szCs w:val="17"/>
-        </w:rPr>
-        <w:t xml:space="preserve">        base_compressor=as_compressor(reranker, top_n=k),</w:t>
+          <w:sz w:val="16"/>
+          <w:szCs w:val="16"/>
+        </w:rPr>
+        <w:t xml:space="preserve">        if m:</w:t>
+      </w:r>
+    </w:p>
+    <w:p>
+      <w:pPr>
+        <w:keepNext/>
+        <w:keepLines/>
+        <w:pBdr>
+          <w:left w:val="single" w:color="808080" w:sz="4" w:space="4"/>
+          <w:right w:val="single" w:color="808080" w:sz="4" w:space="4"/>
+        </w:pBdr>
+        <w:shd w:fill="F2F2F2" w:color="auto" w:val="clear"/>
+        <w:spacing w:after="0" w:before="0" w:line="240"/>
+      </w:pPr>
+      <w:r>
+        <w:rPr>
+          <w:rFonts w:ascii="Courier New" w:cs="Courier New" w:eastAsia="Courier New" w:hAnsi="Courier New"/>
+          <w:sz w:val="16"/>
+          <w:szCs w:val="16"/>
+        </w:rPr>
+        <w:t xml:space="preserve">            flush_section()</w:t>
+      </w:r>
+    </w:p>
+    <w:p>
+      <w:pPr>
+        <w:keepNext/>
+        <w:keepLines/>
+        <w:pBdr>
+          <w:left w:val="single" w:color="808080" w:sz="4" w:space="4"/>
+          <w:right w:val="single" w:color="808080" w:sz="4" w:space="4"/>
+        </w:pBdr>
+        <w:shd w:fill="F2F2F2" w:color="auto" w:val="clear"/>
+        <w:spacing w:after="0" w:before="0" w:line="240"/>
+      </w:pPr>
+      <w:r>
+        <w:rPr>
+          <w:rFonts w:ascii="Courier New" w:cs="Courier New" w:eastAsia="Courier New" w:hAnsi="Courier New"/>
+          <w:sz w:val="16"/>
+          <w:szCs w:val="16"/>
+        </w:rPr>
+        <w:t xml:space="preserve">            current_section = Section(number=m.group(1), title=m.group(2).strip())</w:t>
+      </w:r>
+    </w:p>
+    <w:p>
+      <w:pPr>
+        <w:keepNext/>
+        <w:keepLines/>
+        <w:pBdr>
+          <w:left w:val="single" w:color="808080" w:sz="4" w:space="4"/>
+          <w:right w:val="single" w:color="808080" w:sz="4" w:space="4"/>
+        </w:pBdr>
+        <w:shd w:fill="F2F2F2" w:color="auto" w:val="clear"/>
+        <w:spacing w:after="0" w:before="0" w:line="240"/>
+      </w:pPr>
+      <w:r>
+        <w:rPr>
+          <w:rFonts w:ascii="Courier New" w:cs="Courier New" w:eastAsia="Courier New" w:hAnsi="Courier New"/>
+          <w:sz w:val="16"/>
+          <w:szCs w:val="16"/>
+        </w:rPr>
+        <w:t xml:space="preserve">            continue</w:t>
+      </w:r>
+    </w:p>
+    <w:p>
+      <w:pPr>
+        <w:keepNext/>
+        <w:keepLines/>
+        <w:pBdr>
+          <w:left w:val="single" w:color="808080" w:sz="4" w:space="4"/>
+          <w:right w:val="single" w:color="808080" w:sz="4" w:space="4"/>
+        </w:pBdr>
+        <w:shd w:fill="F2F2F2" w:color="auto" w:val="clear"/>
+        <w:spacing w:after="0" w:before="0" w:line="240"/>
+      </w:pPr>
+      <w:r>
+        <w:rPr>
+          <w:rFonts w:ascii="Courier New" w:cs="Courier New" w:eastAsia="Courier New" w:hAnsi="Courier New"/>
+          <w:sz w:val="16"/>
+          <w:szCs w:val="16"/>
+        </w:rPr>
+        <w:t xml:space="preserve">        m = _LETTERED_CLAUSE_RE.match(line)  # "Clause (a): ..."</w:t>
+      </w:r>
+    </w:p>
+    <w:p>
+      <w:pPr>
+        <w:keepNext/>
+        <w:keepLines/>
+        <w:pBdr>
+          <w:left w:val="single" w:color="808080" w:sz="4" w:space="4"/>
+          <w:right w:val="single" w:color="808080" w:sz="4" w:space="4"/>
+        </w:pBdr>
+        <w:shd w:fill="F2F2F2" w:color="auto" w:val="clear"/>
+        <w:spacing w:after="0" w:before="0" w:line="240"/>
+      </w:pPr>
+      <w:r>
+        <w:rPr>
+          <w:rFonts w:ascii="Courier New" w:cs="Courier New" w:eastAsia="Courier New" w:hAnsi="Courier New"/>
+          <w:sz w:val="16"/>
+          <w:szCs w:val="16"/>
+        </w:rPr>
+        <w:t xml:space="preserve">        if m and current_section is not None:</w:t>
+      </w:r>
+    </w:p>
+    <w:p>
+      <w:pPr>
+        <w:keepNext/>
+        <w:keepLines/>
+        <w:pBdr>
+          <w:left w:val="single" w:color="808080" w:sz="4" w:space="4"/>
+          <w:right w:val="single" w:color="808080" w:sz="4" w:space="4"/>
+        </w:pBdr>
+        <w:shd w:fill="F2F2F2" w:color="auto" w:val="clear"/>
+        <w:spacing w:after="0" w:before="0" w:line="240"/>
+      </w:pPr>
+      <w:r>
+        <w:rPr>
+          <w:rFonts w:ascii="Courier New" w:cs="Courier New" w:eastAsia="Courier New" w:hAnsi="Courier New"/>
+          <w:sz w:val="16"/>
+          <w:szCs w:val="16"/>
+        </w:rPr>
+        <w:t xml:space="preserve">            current_section.clauses.append(</w:t>
+      </w:r>
+    </w:p>
+    <w:p>
+      <w:pPr>
+        <w:keepNext/>
+        <w:keepLines/>
+        <w:pBdr>
+          <w:left w:val="single" w:color="808080" w:sz="4" w:space="4"/>
+          <w:right w:val="single" w:color="808080" w:sz="4" w:space="4"/>
+        </w:pBdr>
+        <w:shd w:fill="F2F2F2" w:color="auto" w:val="clear"/>
+        <w:spacing w:after="0" w:before="0" w:line="240"/>
+      </w:pPr>
+      <w:r>
+        <w:rPr>
+          <w:rFonts w:ascii="Courier New" w:cs="Courier New" w:eastAsia="Courier New" w:hAnsi="Courier New"/>
+          <w:sz w:val="16"/>
+          <w:szCs w:val="16"/>
+        </w:rPr>
+        <w:t xml:space="preserve">                Clause(label=m.group(1).lower(), text=m.group(2).strip()))</w:t>
+      </w:r>
+    </w:p>
+    <w:p>
+      <w:pPr>
+        <w:keepNext/>
+        <w:keepLines/>
+        <w:pBdr>
+          <w:left w:val="single" w:color="808080" w:sz="4" w:space="4"/>
+          <w:right w:val="single" w:color="808080" w:sz="4" w:space="4"/>
+        </w:pBdr>
+        <w:shd w:fill="F2F2F2" w:color="auto" w:val="clear"/>
+        <w:spacing w:after="0" w:before="0" w:line="240"/>
+      </w:pPr>
+      <w:r>
+        <w:rPr>
+          <w:rFonts w:ascii="Courier New" w:cs="Courier New" w:eastAsia="Courier New" w:hAnsi="Courier New"/>
+          <w:sz w:val="16"/>
+          <w:szCs w:val="16"/>
+        </w:rPr>
+        <w:t xml:space="preserve">            continue</w:t>
+      </w:r>
+    </w:p>
+    <w:p>
+      <w:pPr>
+        <w:keepNext/>
+        <w:keepLines/>
+        <w:pBdr>
+          <w:left w:val="single" w:color="808080" w:sz="4" w:space="4"/>
+          <w:right w:val="single" w:color="808080" w:sz="4" w:space="4"/>
+        </w:pBdr>
+        <w:shd w:fill="F2F2F2" w:color="auto" w:val="clear"/>
+        <w:spacing w:after="0" w:before="0" w:line="240"/>
+      </w:pPr>
+      <w:r>
+        <w:rPr>
+          <w:rFonts w:ascii="Courier New" w:cs="Courier New" w:eastAsia="Courier New" w:hAnsi="Courier New"/>
+          <w:sz w:val="16"/>
+          <w:szCs w:val="16"/>
+        </w:rPr>
+        <w:t xml:space="preserve">        m = _NUMBERED_CLAUSE_RE.match(line)  # "(1) ..."</w:t>
+      </w:r>
+    </w:p>
+    <w:p>
+      <w:pPr>
+        <w:keepNext/>
+        <w:keepLines/>
+        <w:pBdr>
+          <w:left w:val="single" w:color="808080" w:sz="4" w:space="4"/>
+          <w:right w:val="single" w:color="808080" w:sz="4" w:space="4"/>
+        </w:pBdr>
+        <w:shd w:fill="F2F2F2" w:color="auto" w:val="clear"/>
+        <w:spacing w:after="0" w:before="0" w:line="240"/>
+      </w:pPr>
+      <w:r>
+        <w:rPr>
+          <w:rFonts w:ascii="Courier New" w:cs="Courier New" w:eastAsia="Courier New" w:hAnsi="Courier New"/>
+          <w:sz w:val="16"/>
+          <w:szCs w:val="16"/>
+        </w:rPr>
+        <w:t xml:space="preserve">        if m and current_section is not None:</w:t>
+      </w:r>
+    </w:p>
+    <w:p>
+      <w:pPr>
+        <w:keepNext/>
+        <w:keepLines/>
+        <w:pBdr>
+          <w:left w:val="single" w:color="808080" w:sz="4" w:space="4"/>
+          <w:right w:val="single" w:color="808080" w:sz="4" w:space="4"/>
+        </w:pBdr>
+        <w:shd w:fill="F2F2F2" w:color="auto" w:val="clear"/>
+        <w:spacing w:after="0" w:before="0" w:line="240"/>
+      </w:pPr>
+      <w:r>
+        <w:rPr>
+          <w:rFonts w:ascii="Courier New" w:cs="Courier New" w:eastAsia="Courier New" w:hAnsi="Courier New"/>
+          <w:sz w:val="16"/>
+          <w:szCs w:val="16"/>
+        </w:rPr>
+        <w:t xml:space="preserve">            current_section.clauses.append(</w:t>
+      </w:r>
+    </w:p>
+    <w:p>
+      <w:pPr>
+        <w:keepNext/>
+        <w:keepLines/>
+        <w:pBdr>
+          <w:left w:val="single" w:color="808080" w:sz="4" w:space="4"/>
+          <w:right w:val="single" w:color="808080" w:sz="4" w:space="4"/>
+        </w:pBdr>
+        <w:shd w:fill="F2F2F2" w:color="auto" w:val="clear"/>
+        <w:spacing w:after="0" w:before="0" w:line="240"/>
+      </w:pPr>
+      <w:r>
+        <w:rPr>
+          <w:rFonts w:ascii="Courier New" w:cs="Courier New" w:eastAsia="Courier New" w:hAnsi="Courier New"/>
+          <w:sz w:val="16"/>
+          <w:szCs w:val="16"/>
+        </w:rPr>
+        <w:t xml:space="preserve">                Clause(label=m.group(1), text=m.group(2).strip()))</w:t>
+      </w:r>
+    </w:p>
+    <w:p>
+      <w:pPr>
+        <w:keepNext/>
+        <w:keepLines/>
+        <w:pBdr>
+          <w:left w:val="single" w:color="808080" w:sz="4" w:space="4"/>
+          <w:right w:val="single" w:color="808080" w:sz="4" w:space="4"/>
+        </w:pBdr>
+        <w:shd w:fill="F2F2F2" w:color="auto" w:val="clear"/>
+        <w:spacing w:after="0" w:before="0" w:line="240"/>
+      </w:pPr>
+      <w:r>
+        <w:rPr>
+          <w:rFonts w:ascii="Courier New" w:cs="Courier New" w:eastAsia="Courier New" w:hAnsi="Courier New"/>
+          <w:sz w:val="16"/>
+          <w:szCs w:val="16"/>
+        </w:rPr>
+        <w:t xml:space="preserve">            continue</w:t>
+      </w:r>
+    </w:p>
+    <w:p>
+      <w:pPr>
+        <w:keepNext/>
+        <w:keepLines/>
+        <w:pBdr>
+          <w:left w:val="single" w:color="808080" w:sz="4" w:space="4"/>
+          <w:right w:val="single" w:color="808080" w:sz="4" w:space="4"/>
+        </w:pBdr>
+        <w:shd w:fill="F2F2F2" w:color="auto" w:val="clear"/>
+        <w:spacing w:after="0" w:before="0" w:line="240"/>
+      </w:pPr>
+      <w:r>
+        <w:rPr>
+          <w:rFonts w:ascii="Courier New" w:cs="Courier New" w:eastAsia="Courier New" w:hAnsi="Courier New"/>
+          <w:sz w:val="16"/>
+          <w:szCs w:val="16"/>
+        </w:rPr>
+        <w:t xml:space="preserve">        if current_section is not None:      # body text of the section</w:t>
+      </w:r>
+    </w:p>
+    <w:p>
+      <w:pPr>
+        <w:keepNext/>
+        <w:keepLines/>
+        <w:pBdr>
+          <w:left w:val="single" w:color="808080" w:sz="4" w:space="4"/>
+          <w:right w:val="single" w:color="808080" w:sz="4" w:space="4"/>
+        </w:pBdr>
+        <w:shd w:fill="F2F2F2" w:color="auto" w:val="clear"/>
+        <w:spacing w:after="0" w:before="0" w:line="240"/>
+      </w:pPr>
+      <w:r>
+        <w:rPr>
+          <w:rFonts w:ascii="Courier New" w:cs="Courier New" w:eastAsia="Courier New" w:hAnsi="Courier New"/>
+          <w:sz w:val="16"/>
+          <w:szCs w:val="16"/>
+        </w:rPr>
+        <w:t xml:space="preserve">            current_section.body_lines.append(line)</w:t>
+      </w:r>
+    </w:p>
+    <w:p>
+      <w:pPr>
+        <w:keepNext/>
+        <w:keepLines/>
+        <w:pBdr>
+          <w:left w:val="single" w:color="808080" w:sz="4" w:space="4"/>
+          <w:right w:val="single" w:color="808080" w:sz="4" w:space="4"/>
+        </w:pBdr>
+        <w:shd w:fill="F2F2F2" w:color="auto" w:val="clear"/>
+        <w:spacing w:after="0" w:before="0" w:line="240"/>
+      </w:pPr>
+      <w:r>
+        <w:rPr>
+          <w:rFonts w:ascii="Courier New" w:cs="Courier New" w:eastAsia="Courier New" w:hAnsi="Courier New"/>
+          <w:sz w:val="16"/>
+          <w:szCs w:val="16"/>
+        </w:rPr>
+        <w:t xml:space="preserve">    flush_section()</w:t>
       </w:r>
     </w:p>
     <w:p>
@@ -25053,10 +25359,10 @@
       <w:r>
         <w:rPr>
           <w:rFonts w:ascii="Courier New" w:cs="Courier New" w:eastAsia="Courier New" w:hAnsi="Courier New"/>
-          <w:sz w:val="17"/>
-          <w:szCs w:val="17"/>
-        </w:rPr>
-        <w:t xml:space="preserve">        base_retriever=hybrid_retriever(store, n))</w:t>
+          <w:sz w:val="16"/>
+          <w:szCs w:val="16"/>
+        </w:rPr>
+        <w:t xml:space="preserve">    return Document(source_id=source_id, title=title or source_id, ...)</w:t>
       </w:r>
     </w:p>
     <w:p>
@@ -25070,7 +25376,7 @@
           <w:sz w:val="24"/>
           <w:szCs w:val="24"/>
         </w:rPr>
-        <w:t xml:space="preserve">The first function compares and merges the ranked lists returned by dense search and BM25 keyword search. For every list it walks through the chunks in order and adds the weight of the list divided by the rank plus a constant to the score of each chunk, which is Equation 4.1, so a chunk found near the top of both lists collects two contributions and moves up. The chunks are then sorted by their fused score and the best ones are returned with the score attached, so the Search page and the proof view can display it. The second function puts the stages together: without a reranker it returns the fused top k directly, and with a reranker it first fetches a larger pool of n fused candidates and then lets the cross-encoder keep the best k of them, which is how the Ask page turns a pool of one hundred candidates into twelve passages.</w:t>
+        <w:t xml:space="preserve">The structure parser reads the cleaned text line by line and builds the legal hierarchy that summary-augmented chunking needs. Regular expressions recognise each kind of line: a chapter heading starts a new chapter, a line such as "Section 379. Punishment for theft." starts a new section, and a line that begins with a lettered clause or a numbered sub-section adds a clause to the current section. Any other line is treated as part of the body of the current section. Whenever a new section or chapter begins, the helper flush_section stores the section that was being built, so no text is lost at the boundaries. The section pattern accepts letter suffixes such as 498A and 13B, which appear in Indian statutes. If the whole document produces no section at all, the caller knows that the document has no legal structure and passes its cleaned text to the paragraph fallback instead.</w:t>
       </w:r>
     </w:p>
     <w:p>
@@ -25087,7 +25393,7 @@
           <w:sz w:val="24"/>
           <w:szCs w:val="24"/>
         </w:rPr>
-        <w:t xml:space="preserve">5.5.4  Verification Rules and Orchestration</w:t>
+        <w:t xml:space="preserve">5.5.2  Query Pipeline</w:t>
       </w:r>
     </w:p>
     <w:p>
@@ -25105,10 +25411,10 @@
       <w:r>
         <w:rPr>
           <w:rFonts w:ascii="Courier New" w:cs="Courier New" w:eastAsia="Courier New" w:hAnsi="Courier New"/>
-          <w:sz w:val="17"/>
-          <w:szCs w:val="17"/>
-        </w:rPr>
-        <w:t xml:space="preserve">def _claim_vcs(citation_ok, entailment, fidelity, consistency, config):</w:t>
+          <w:sz w:val="16"/>
+          <w:szCs w:val="16"/>
+        </w:rPr>
+        <w:t xml:space="preserve">def build_query_chain(retriever, llm, nli) -&gt; Runnable:</w:t>
       </w:r>
     </w:p>
     <w:p>
@@ -25125,10 +25431,10 @@
       <w:r>
         <w:rPr>
           <w:rFonts w:ascii="Courier New" w:cs="Courier New" w:eastAsia="Courier New" w:hAnsi="Courier New"/>
-          <w:sz w:val="17"/>
-          <w:szCs w:val="17"/>
-        </w:rPr>
-        <w:t xml:space="preserve">    if config.enable_v1 and not citation_ok:</w:t>
+          <w:sz w:val="16"/>
+          <w:szCs w:val="16"/>
+        </w:rPr>
+        <w:t xml:space="preserve">    """Input: {question, self_consistency, allow_general_knowledge}."""</w:t>
       </w:r>
     </w:p>
     <w:p>
@@ -25145,10 +25451,10 @@
       <w:r>
         <w:rPr>
           <w:rFonts w:ascii="Courier New" w:cs="Courier New" w:eastAsia="Courier New" w:hAnsi="Courier New"/>
-          <w:sz w:val="17"/>
-          <w:szCs w:val="17"/>
-        </w:rPr>
-        <w:t xml:space="preserve">        return 0.0, "citation"                     # hard gate V1</w:t>
+          <w:sz w:val="16"/>
+          <w:szCs w:val="16"/>
+        </w:rPr>
+        <w:t xml:space="preserve">    answer = answer_chain(llm)          # prompt | llm | citation parser</w:t>
       </w:r>
     </w:p>
     <w:p>
@@ -25165,10 +25471,10 @@
       <w:r>
         <w:rPr>
           <w:rFonts w:ascii="Courier New" w:cs="Courier New" w:eastAsia="Courier New" w:hAnsi="Courier New"/>
-          <w:sz w:val="17"/>
-          <w:szCs w:val="17"/>
-        </w:rPr>
-        <w:t xml:space="preserve">    if config.enable_v2 and entailment == Entailment.CONTRADICTS:</w:t>
+          <w:sz w:val="16"/>
+          <w:szCs w:val="16"/>
+        </w:rPr>
+        <w:t xml:space="preserve">    ...</w:t>
       </w:r>
     </w:p>
     <w:p>
@@ -25185,10 +25491,10 @@
       <w:r>
         <w:rPr>
           <w:rFonts w:ascii="Courier New" w:cs="Courier New" w:eastAsia="Courier New" w:hAnsi="Courier New"/>
-          <w:sz w:val="17"/>
-          <w:szCs w:val="17"/>
-        </w:rPr>
-        <w:t xml:space="preserve">        return 0.0, "contradiction"                # hard gate V2</w:t>
+          <w:sz w:val="16"/>
+          <w:szCs w:val="16"/>
+        </w:rPr>
+        <w:t xml:space="preserve">    return (</w:t>
       </w:r>
     </w:p>
     <w:p>
@@ -25205,10 +25511,10 @@
       <w:r>
         <w:rPr>
           <w:rFonts w:ascii="Courier New" w:cs="Courier New" w:eastAsia="Courier New" w:hAnsi="Courier New"/>
-          <w:sz w:val="17"/>
-          <w:szCs w:val="17"/>
-        </w:rPr>
-        <w:t xml:space="preserve">    components = [(1.0 if entailment == Entailment.ENTAILS else 0.0,</w:t>
+          <w:sz w:val="16"/>
+          <w:szCs w:val="16"/>
+        </w:rPr>
+        <w:t xml:space="preserve">        RunnablePassthrough.assign(context=itemgetter("question") | retriever)</w:t>
       </w:r>
     </w:p>
     <w:p>
@@ -25225,10 +25531,10 @@
       <w:r>
         <w:rPr>
           <w:rFonts w:ascii="Courier New" w:cs="Courier New" w:eastAsia="Courier New" w:hAnsi="Courier New"/>
-          <w:sz w:val="17"/>
-          <w:szCs w:val="17"/>
-        </w:rPr>
-        <w:t xml:space="preserve">                   config.w_entail), (fidelity, config.w_fidelity)]</w:t>
+          <w:sz w:val="16"/>
+          <w:szCs w:val="16"/>
+        </w:rPr>
+        <w:t xml:space="preserve">        | RunnablePassthrough.assign(prompt=RunnableLambda(_prompt_messages))</w:t>
       </w:r>
     </w:p>
     <w:p>
@@ -25245,10 +25551,10 @@
       <w:r>
         <w:rPr>
           <w:rFonts w:ascii="Courier New" w:cs="Courier New" w:eastAsia="Courier New" w:hAnsi="Courier New"/>
-          <w:sz w:val="17"/>
-          <w:szCs w:val="17"/>
-        </w:rPr>
-        <w:t xml:space="preserve">    if consistency is not None:</w:t>
+          <w:sz w:val="16"/>
+          <w:szCs w:val="16"/>
+        </w:rPr>
+        <w:t xml:space="preserve">        | RunnablePassthrough.assign(parsed=_guard(answer, "generate"))</w:t>
       </w:r>
     </w:p>
     <w:p>
@@ -25265,10 +25571,10 @@
       <w:r>
         <w:rPr>
           <w:rFonts w:ascii="Courier New" w:cs="Courier New" w:eastAsia="Courier New" w:hAnsi="Courier New"/>
-          <w:sz w:val="17"/>
-          <w:szCs w:val="17"/>
-        </w:rPr>
-        <w:t xml:space="preserve">        components.append((consistency, config.w_consistency))</w:t>
+          <w:sz w:val="16"/>
+          <w:szCs w:val="16"/>
+        </w:rPr>
+        <w:t xml:space="preserve">        | RunnablePassthrough.assign(resamples=_guard(RunnableLambda(_resamples),</w:t>
       </w:r>
     </w:p>
     <w:p>
@@ -25285,10 +25591,10 @@
       <w:r>
         <w:rPr>
           <w:rFonts w:ascii="Courier New" w:cs="Courier New" w:eastAsia="Courier New" w:hAnsi="Courier New"/>
-          <w:sz w:val="17"/>
-          <w:szCs w:val="17"/>
-        </w:rPr>
-        <w:t xml:space="preserve">    total_weight = sum(w for _, w in components)</w:t>
+          <w:sz w:val="16"/>
+          <w:szCs w:val="16"/>
+        </w:rPr>
+        <w:t xml:space="preserve">                                                      "resample"))</w:t>
       </w:r>
     </w:p>
     <w:p>
@@ -25305,10 +25611,10 @@
       <w:r>
         <w:rPr>
           <w:rFonts w:ascii="Courier New" w:cs="Courier New" w:eastAsia="Courier New" w:hAnsi="Courier New"/>
-          <w:sz w:val="17"/>
-          <w:szCs w:val="17"/>
-        </w:rPr>
-        <w:t xml:space="preserve">    return sum(c * w for c, w in components) / total_weight, None</w:t>
+          <w:sz w:val="16"/>
+          <w:szCs w:val="16"/>
+        </w:rPr>
+        <w:t xml:space="preserve">        | RunnablePassthrough.assign(verification=verification_step(nli))</w:t>
       </w:r>
     </w:p>
     <w:p>
@@ -25325,10 +25631,10 @@
       <w:r>
         <w:rPr>
           <w:rFonts w:ascii="Courier New" w:cs="Courier New" w:eastAsia="Courier New" w:hAnsi="Courier New"/>
-          <w:sz w:val="17"/>
-          <w:szCs w:val="17"/>
-        </w:rPr>
-        <w:t xml:space="preserve"> </w:t>
+          <w:sz w:val="16"/>
+          <w:szCs w:val="16"/>
+        </w:rPr>
+        <w:t xml:space="preserve">        | RunnableBranch(</w:t>
       </w:r>
     </w:p>
     <w:p>
@@ -25345,10 +25651,10 @@
       <w:r>
         <w:rPr>
           <w:rFonts w:ascii="Courier New" w:cs="Courier New" w:eastAsia="Courier New" w:hAnsi="Courier New"/>
-          <w:sz w:val="17"/>
-          <w:szCs w:val="17"/>
-        </w:rPr>
-        <w:t xml:space="preserve">def verify_answer(answer, context_chunks, nli, resamples=None, config=None):</w:t>
+          <w:sz w:val="16"/>
+          <w:szCs w:val="16"/>
+        </w:rPr>
+        <w:t xml:space="preserve">            (wants_general_knowledge,</w:t>
       </w:r>
     </w:p>
     <w:p>
@@ -25365,10 +25671,10 @@
       <w:r>
         <w:rPr>
           <w:rFonts w:ascii="Courier New" w:cs="Courier New" w:eastAsia="Courier New" w:hAnsi="Courier New"/>
-          <w:sz w:val="17"/>
-          <w:szCs w:val="17"/>
-        </w:rPr>
-        <w:t xml:space="preserve">    v1 = check_citation_existence(answer)                       # V1</w:t>
+          <w:sz w:val="16"/>
+          <w:szCs w:val="16"/>
+        </w:rPr>
+        <w:t xml:space="preserve">             RunnablePassthrough.assign(general_text=RunnableLambda(_general))),</w:t>
       </w:r>
     </w:p>
     <w:p>
@@ -25385,10 +25691,10 @@
       <w:r>
         <w:rPr>
           <w:rFonts w:ascii="Courier New" w:cs="Courier New" w:eastAsia="Courier New" w:hAnsi="Courier New"/>
-          <w:sz w:val="17"/>
-          <w:szCs w:val="17"/>
-        </w:rPr>
-        <w:t xml:space="preserve">    v2 = check_entailment_all(answer.claims, context_chunks, nli)  # V2</w:t>
+          <w:sz w:val="16"/>
+          <w:szCs w:val="16"/>
+        </w:rPr>
+        <w:t xml:space="preserve">            RunnablePassthrough.assign(general_text=lambda _: None),</w:t>
       </w:r>
     </w:p>
     <w:p>
@@ -25405,90 +25711,10 @@
       <w:r>
         <w:rPr>
           <w:rFonts w:ascii="Courier New" w:cs="Courier New" w:eastAsia="Courier New" w:hAnsi="Courier New"/>
-          <w:sz w:val="17"/>
-          <w:szCs w:val="17"/>
-        </w:rPr>
-        <w:t xml:space="preserve">    v3 = check_fidelity_all(answer.claims, context_chunks, nli)    # V3</w:t>
-      </w:r>
-    </w:p>
-    <w:p>
-      <w:pPr>
-        <w:keepNext/>
-        <w:keepLines/>
-        <w:pBdr>
-          <w:left w:val="single" w:color="808080" w:sz="4" w:space="4"/>
-          <w:right w:val="single" w:color="808080" w:sz="4" w:space="4"/>
-        </w:pBdr>
-        <w:shd w:fill="F2F2F2" w:color="auto" w:val="clear"/>
-        <w:spacing w:after="0" w:before="0" w:line="240"/>
-      </w:pPr>
-      <w:r>
-        <w:rPr>
-          <w:rFonts w:ascii="Courier New" w:cs="Courier New" w:eastAsia="Courier New" w:hAnsi="Courier New"/>
-          <w:sz w:val="17"/>
-          <w:szCs w:val="17"/>
-        </w:rPr>
-        <w:t xml:space="preserve">    v4 = self_consistency(answer, resamples) if resamples else None  # V4</w:t>
-      </w:r>
-    </w:p>
-    <w:p>
-      <w:pPr>
-        <w:keepNext/>
-        <w:keepLines/>
-        <w:pBdr>
-          <w:left w:val="single" w:color="808080" w:sz="4" w:space="4"/>
-          <w:right w:val="single" w:color="808080" w:sz="4" w:space="4"/>
-        </w:pBdr>
-        <w:shd w:fill="F2F2F2" w:color="auto" w:val="clear"/>
-        <w:spacing w:after="0" w:before="0" w:line="240"/>
-      </w:pPr>
-      <w:r>
-        <w:rPr>
-          <w:rFonts w:ascii="Courier New" w:cs="Courier New" w:eastAsia="Courier New" w:hAnsi="Courier New"/>
-          <w:sz w:val="17"/>
-          <w:szCs w:val="17"/>
-        </w:rPr>
-        <w:t xml:space="preserve">    vcs_result = aggregate_vcs(...)             # V5: claim scores, gate 0.60</w:t>
-      </w:r>
-    </w:p>
-    <w:p>
-      <w:pPr>
-        <w:keepNext/>
-        <w:keepLines/>
-        <w:pBdr>
-          <w:left w:val="single" w:color="808080" w:sz="4" w:space="4"/>
-          <w:right w:val="single" w:color="808080" w:sz="4" w:space="4"/>
-        </w:pBdr>
-        <w:shd w:fill="F2F2F2" w:color="auto" w:val="clear"/>
-        <w:spacing w:after="0" w:before="0" w:line="240"/>
-      </w:pPr>
-      <w:r>
-        <w:rPr>
-          <w:rFonts w:ascii="Courier New" w:cs="Courier New" w:eastAsia="Courier New" w:hAnsi="Courier New"/>
-          <w:sz w:val="17"/>
-          <w:szCs w:val="17"/>
-        </w:rPr>
-        <w:t xml:space="preserve">    proof = build_proof(answer.query, answer.raw_text, context_chunks,</w:t>
-      </w:r>
-    </w:p>
-    <w:p>
-      <w:pPr>
-        <w:keepNext/>
-        <w:keepLines/>
-        <w:pBdr>
-          <w:left w:val="single" w:color="808080" w:sz="4" w:space="4"/>
-          <w:right w:val="single" w:color="808080" w:sz="4" w:space="4"/>
-        </w:pBdr>
-        <w:shd w:fill="F2F2F2" w:color="auto" w:val="clear"/>
-        <w:spacing w:after="0" w:before="0" w:line="240"/>
-      </w:pPr>
-      <w:r>
-        <w:rPr>
-          <w:rFonts w:ascii="Courier New" w:cs="Courier New" w:eastAsia="Courier New" w:hAnsi="Courier New"/>
-          <w:sz w:val="17"/>
-          <w:szCs w:val="17"/>
-        </w:rPr>
-        <w:t xml:space="preserve">                        v1=v1, v2=v2, v3=v3, v4=v4, vcs_result=vcs_result)  # V6</w:t>
+          <w:sz w:val="16"/>
+          <w:szCs w:val="16"/>
+        </w:rPr>
+        <w:t xml:space="preserve">        )</w:t>
       </w:r>
     </w:p>
     <w:p>
@@ -25506,8 +25732,2202 @@
       <w:r>
         <w:rPr>
           <w:rFonts w:ascii="Courier New" w:cs="Courier New" w:eastAsia="Courier New" w:hAnsi="Courier New"/>
-          <w:sz w:val="17"/>
-          <w:szCs w:val="17"/>
+          <w:sz w:val="16"/>
+          <w:szCs w:val="16"/>
+        </w:rPr>
+        <w:t xml:space="preserve">    )</w:t>
+      </w:r>
+    </w:p>
+    <w:p>
+      <w:pPr>
+        <w:spacing w:after="160" w:line="360"/>
+        <w:jc w:val="both"/>
+      </w:pPr>
+      <w:r>
+        <w:rPr>
+          <w:rFonts w:ascii="Times New Roman" w:cs="Times New Roman" w:eastAsia="Times New Roman" w:hAnsi="Times New Roman"/>
+          <w:sz w:val="24"/>
+          <w:szCs w:val="24"/>
+        </w:rPr>
+        <w:t xml:space="preserve">This function builds the complete question-answering pipeline as a single LangChain chain. Each step adds its result to a shared state without removing what came before: the retriever adds the context chunks, the prompt step adds the exact messages sent to the model, the answer step adds the parsed claims and citations, the optional resampling step adds extra answers for the consistency check, and the verification step adds the score, the decision and the proof object. The final branch sends a question about a general legal concept to the general-knowledge path, which produces a labelled answer without citations, and leaves every other question on the verified path. Because the state keeps every intermediate result, the API can return a full trace of how an answer was produced, which was essential for finding the defects described in Chapter 6.</w:t>
+      </w:r>
+    </w:p>
+    <w:p>
+      <w:pPr>
+        <w:keepNext/>
+        <w:keepLines/>
+        <w:pBdr>
+          <w:top w:val="single" w:color="808080" w:sz="4" w:space="4"/>
+          <w:left w:val="single" w:color="808080" w:sz="4" w:space="4"/>
+          <w:right w:val="single" w:color="808080" w:sz="4" w:space="4"/>
+        </w:pBdr>
+        <w:shd w:fill="F2F2F2" w:color="auto" w:val="clear"/>
+        <w:spacing w:after="0" w:before="120" w:line="240"/>
+      </w:pPr>
+      <w:r>
+        <w:rPr>
+          <w:rFonts w:ascii="Courier New" w:cs="Courier New" w:eastAsia="Courier New" w:hAnsi="Courier New"/>
+          <w:sz w:val="16"/>
+          <w:szCs w:val="16"/>
+        </w:rPr>
+        <w:t xml:space="preserve">def answer_chain(llm) -&gt; Runnable:</w:t>
+      </w:r>
+    </w:p>
+    <w:p>
+      <w:pPr>
+        <w:keepNext/>
+        <w:keepLines/>
+        <w:pBdr>
+          <w:left w:val="single" w:color="808080" w:sz="4" w:space="4"/>
+          <w:right w:val="single" w:color="808080" w:sz="4" w:space="4"/>
+        </w:pBdr>
+        <w:shd w:fill="F2F2F2" w:color="auto" w:val="clear"/>
+        <w:spacing w:after="0" w:before="0" w:line="240"/>
+      </w:pPr>
+      <w:r>
+        <w:rPr>
+          <w:rFonts w:ascii="Courier New" w:cs="Courier New" w:eastAsia="Courier New" w:hAnsi="Courier New"/>
+          <w:sz w:val="16"/>
+          <w:szCs w:val="16"/>
+        </w:rPr>
+        <w:t xml:space="preserve">    """{question, context} -&gt; ParsedAnswer: prompt | llm | str | parser."""</w:t>
+      </w:r>
+    </w:p>
+    <w:p>
+      <w:pPr>
+        <w:keepNext/>
+        <w:keepLines/>
+        <w:pBdr>
+          <w:left w:val="single" w:color="808080" w:sz="4" w:space="4"/>
+          <w:right w:val="single" w:color="808080" w:sz="4" w:space="4"/>
+        </w:pBdr>
+        <w:shd w:fill="F2F2F2" w:color="auto" w:val="clear"/>
+        <w:spacing w:after="0" w:before="0" w:line="240"/>
+      </w:pPr>
+      <w:r>
+        <w:rPr>
+          <w:rFonts w:ascii="Courier New" w:cs="Courier New" w:eastAsia="Courier New" w:hAnsi="Courier New"/>
+          <w:sz w:val="16"/>
+          <w:szCs w:val="16"/>
+        </w:rPr>
+        <w:t xml:space="preserve">    return (</w:t>
+      </w:r>
+    </w:p>
+    <w:p>
+      <w:pPr>
+        <w:keepNext/>
+        <w:keepLines/>
+        <w:pBdr>
+          <w:left w:val="single" w:color="808080" w:sz="4" w:space="4"/>
+          <w:right w:val="single" w:color="808080" w:sz="4" w:space="4"/>
+        </w:pBdr>
+        <w:shd w:fill="F2F2F2" w:color="auto" w:val="clear"/>
+        <w:spacing w:after="0" w:before="0" w:line="240"/>
+      </w:pPr>
+      <w:r>
+        <w:rPr>
+          <w:rFonts w:ascii="Courier New" w:cs="Courier New" w:eastAsia="Courier New" w:hAnsi="Courier New"/>
+          <w:sz w:val="16"/>
+          <w:szCs w:val="16"/>
+        </w:rPr>
+        <w:t xml:space="preserve">        RunnableLambda(prompt_inputs, name="prompt_inputs")</w:t>
+      </w:r>
+    </w:p>
+    <w:p>
+      <w:pPr>
+        <w:keepNext/>
+        <w:keepLines/>
+        <w:pBdr>
+          <w:left w:val="single" w:color="808080" w:sz="4" w:space="4"/>
+          <w:right w:val="single" w:color="808080" w:sz="4" w:space="4"/>
+        </w:pBdr>
+        <w:shd w:fill="F2F2F2" w:color="auto" w:val="clear"/>
+        <w:spacing w:after="0" w:before="0" w:line="240"/>
+      </w:pPr>
+      <w:r>
+        <w:rPr>
+          <w:rFonts w:ascii="Courier New" w:cs="Courier New" w:eastAsia="Courier New" w:hAnsi="Courier New"/>
+          <w:sz w:val="16"/>
+          <w:szCs w:val="16"/>
+        </w:rPr>
+        <w:t xml:space="preserve">        | ANSWER_PROMPT</w:t>
+      </w:r>
+    </w:p>
+    <w:p>
+      <w:pPr>
+        <w:keepNext/>
+        <w:keepLines/>
+        <w:pBdr>
+          <w:left w:val="single" w:color="808080" w:sz="4" w:space="4"/>
+          <w:right w:val="single" w:color="808080" w:sz="4" w:space="4"/>
+        </w:pBdr>
+        <w:shd w:fill="F2F2F2" w:color="auto" w:val="clear"/>
+        <w:spacing w:after="0" w:before="0" w:line="240"/>
+      </w:pPr>
+      <w:r>
+        <w:rPr>
+          <w:rFonts w:ascii="Courier New" w:cs="Courier New" w:eastAsia="Courier New" w:hAnsi="Courier New"/>
+          <w:sz w:val="16"/>
+          <w:szCs w:val="16"/>
+        </w:rPr>
+        <w:t xml:space="preserve">        | as_chat_runnable(llm)</w:t>
+      </w:r>
+    </w:p>
+    <w:p>
+      <w:pPr>
+        <w:keepNext/>
+        <w:keepLines/>
+        <w:pBdr>
+          <w:left w:val="single" w:color="808080" w:sz="4" w:space="4"/>
+          <w:right w:val="single" w:color="808080" w:sz="4" w:space="4"/>
+        </w:pBdr>
+        <w:shd w:fill="F2F2F2" w:color="auto" w:val="clear"/>
+        <w:spacing w:after="0" w:before="0" w:line="240"/>
+      </w:pPr>
+      <w:r>
+        <w:rPr>
+          <w:rFonts w:ascii="Courier New" w:cs="Courier New" w:eastAsia="Courier New" w:hAnsi="Courier New"/>
+          <w:sz w:val="16"/>
+          <w:szCs w:val="16"/>
+        </w:rPr>
+        <w:t xml:space="preserve">        | StrOutputParser()</w:t>
+      </w:r>
+    </w:p>
+    <w:p>
+      <w:pPr>
+        <w:keepNext/>
+        <w:keepLines/>
+        <w:pBdr>
+          <w:left w:val="single" w:color="808080" w:sz="4" w:space="4"/>
+          <w:right w:val="single" w:color="808080" w:sz="4" w:space="4"/>
+        </w:pBdr>
+        <w:shd w:fill="F2F2F2" w:color="auto" w:val="clear"/>
+        <w:spacing w:after="0" w:before="0" w:line="240"/>
+      </w:pPr>
+      <w:r>
+        <w:rPr>
+          <w:rFonts w:ascii="Courier New" w:cs="Courier New" w:eastAsia="Courier New" w:hAnsi="Courier New"/>
+          <w:sz w:val="16"/>
+          <w:szCs w:val="16"/>
+        </w:rPr>
+        <w:t xml:space="preserve">        | CitationOutputParser()</w:t>
+      </w:r>
+    </w:p>
+    <w:p>
+      <w:pPr>
+        <w:keepNext/>
+        <w:keepLines/>
+        <w:pBdr>
+          <w:left w:val="single" w:color="808080" w:sz="4" w:space="4"/>
+          <w:right w:val="single" w:color="808080" w:sz="4" w:space="4"/>
+        </w:pBdr>
+        <w:shd w:fill="F2F2F2" w:color="auto" w:val="clear"/>
+        <w:spacing w:after="0" w:before="0" w:line="240"/>
+      </w:pPr>
+      <w:r>
+        <w:rPr>
+          <w:rFonts w:ascii="Courier New" w:cs="Courier New" w:eastAsia="Courier New" w:hAnsi="Courier New"/>
+          <w:sz w:val="16"/>
+          <w:szCs w:val="16"/>
+        </w:rPr>
+        <w:t xml:space="preserve">    )</w:t>
+      </w:r>
+    </w:p>
+    <w:p>
+      <w:pPr>
+        <w:keepNext/>
+        <w:keepLines/>
+        <w:pBdr>
+          <w:left w:val="single" w:color="808080" w:sz="4" w:space="4"/>
+          <w:right w:val="single" w:color="808080" w:sz="4" w:space="4"/>
+        </w:pBdr>
+        <w:shd w:fill="F2F2F2" w:color="auto" w:val="clear"/>
+        <w:spacing w:after="0" w:before="0" w:line="240"/>
+      </w:pPr>
+      <w:r>
+        <w:rPr>
+          <w:rFonts w:ascii="Courier New" w:cs="Courier New" w:eastAsia="Courier New" w:hAnsi="Courier New"/>
+          <w:sz w:val="16"/>
+          <w:szCs w:val="16"/>
+        </w:rPr>
+        <w:t xml:space="preserve"> </w:t>
+      </w:r>
+    </w:p>
+    <w:p>
+      <w:pPr>
+        <w:keepNext/>
+        <w:keepLines/>
+        <w:pBdr>
+          <w:left w:val="single" w:color="808080" w:sz="4" w:space="4"/>
+          <w:right w:val="single" w:color="808080" w:sz="4" w:space="4"/>
+        </w:pBdr>
+        <w:shd w:fill="F2F2F2" w:color="auto" w:val="clear"/>
+        <w:spacing w:after="0" w:before="0" w:line="240"/>
+      </w:pPr>
+      <w:r>
+        <w:rPr>
+          <w:rFonts w:ascii="Courier New" w:cs="Courier New" w:eastAsia="Courier New" w:hAnsi="Courier New"/>
+          <w:sz w:val="16"/>
+          <w:szCs w:val="16"/>
+        </w:rPr>
+        <w:t xml:space="preserve">class CitationOutputParser(BaseOutputParser[ParsedAnswer]):</w:t>
+      </w:r>
+    </w:p>
+    <w:p>
+      <w:pPr>
+        <w:keepNext/>
+        <w:keepLines/>
+        <w:pBdr>
+          <w:left w:val="single" w:color="808080" w:sz="4" w:space="4"/>
+          <w:right w:val="single" w:color="808080" w:sz="4" w:space="4"/>
+        </w:pBdr>
+        <w:shd w:fill="F2F2F2" w:color="auto" w:val="clear"/>
+        <w:spacing w:after="0" w:before="0" w:line="240"/>
+      </w:pPr>
+      <w:r>
+        <w:rPr>
+          <w:rFonts w:ascii="Courier New" w:cs="Courier New" w:eastAsia="Courier New" w:hAnsi="Courier New"/>
+          <w:sz w:val="16"/>
+          <w:szCs w:val="16"/>
+        </w:rPr>
+        <w:t xml:space="preserve">    def parse(self, text: str) -&gt; ParsedAnswer:</w:t>
+      </w:r>
+    </w:p>
+    <w:p>
+      <w:pPr>
+        <w:keepNext/>
+        <w:keepLines/>
+        <w:pBdr>
+          <w:left w:val="single" w:color="808080" w:sz="4" w:space="4"/>
+          <w:right w:val="single" w:color="808080" w:sz="4" w:space="4"/>
+        </w:pBdr>
+        <w:shd w:fill="F2F2F2" w:color="auto" w:val="clear"/>
+        <w:spacing w:after="0" w:before="0" w:line="240"/>
+      </w:pPr>
+      <w:r>
+        <w:rPr>
+          <w:rFonts w:ascii="Courier New" w:cs="Courier New" w:eastAsia="Courier New" w:hAnsi="Courier New"/>
+          <w:sz w:val="16"/>
+          <w:szCs w:val="16"/>
+        </w:rPr>
+        <w:t xml:space="preserve">        if text.strip().startswith(f"{ABSTENTION_MARKER}:"):</w:t>
+      </w:r>
+    </w:p>
+    <w:p>
+      <w:pPr>
+        <w:keepNext/>
+        <w:keepLines/>
+        <w:pBdr>
+          <w:left w:val="single" w:color="808080" w:sz="4" w:space="4"/>
+          <w:right w:val="single" w:color="808080" w:sz="4" w:space="4"/>
+        </w:pBdr>
+        <w:shd w:fill="F2F2F2" w:color="auto" w:val="clear"/>
+        <w:spacing w:after="0" w:before="0" w:line="240"/>
+      </w:pPr>
+      <w:r>
+        <w:rPr>
+          <w:rFonts w:ascii="Courier New" w:cs="Courier New" w:eastAsia="Courier New" w:hAnsi="Courier New"/>
+          <w:sz w:val="16"/>
+          <w:szCs w:val="16"/>
+        </w:rPr>
+        <w:t xml:space="preserve">            return ParsedAnswer(raw_text=text, abstained=True)</w:t>
+      </w:r>
+    </w:p>
+    <w:p>
+      <w:pPr>
+        <w:keepNext/>
+        <w:keepLines/>
+        <w:pBdr>
+          <w:left w:val="single" w:color="808080" w:sz="4" w:space="4"/>
+          <w:right w:val="single" w:color="808080" w:sz="4" w:space="4"/>
+        </w:pBdr>
+        <w:shd w:fill="F2F2F2" w:color="auto" w:val="clear"/>
+        <w:spacing w:after="0" w:before="0" w:line="240"/>
+      </w:pPr>
+      <w:r>
+        <w:rPr>
+          <w:rFonts w:ascii="Courier New" w:cs="Courier New" w:eastAsia="Courier New" w:hAnsi="Courier New"/>
+          <w:sz w:val="16"/>
+          <w:szCs w:val="16"/>
+        </w:rPr>
+        <w:t xml:space="preserve">        claims, malformed = [], []</w:t>
+      </w:r>
+    </w:p>
+    <w:p>
+      <w:pPr>
+        <w:keepNext/>
+        <w:keepLines/>
+        <w:pBdr>
+          <w:left w:val="single" w:color="808080" w:sz="4" w:space="4"/>
+          <w:right w:val="single" w:color="808080" w:sz="4" w:space="4"/>
+        </w:pBdr>
+        <w:shd w:fill="F2F2F2" w:color="auto" w:val="clear"/>
+        <w:spacing w:after="0" w:before="0" w:line="240"/>
+      </w:pPr>
+      <w:r>
+        <w:rPr>
+          <w:rFonts w:ascii="Courier New" w:cs="Courier New" w:eastAsia="Courier New" w:hAnsi="Courier New"/>
+          <w:sz w:val="16"/>
+          <w:szCs w:val="16"/>
+        </w:rPr>
+        <w:t xml:space="preserve">        for raw_line in text.splitlines():</w:t>
+      </w:r>
+    </w:p>
+    <w:p>
+      <w:pPr>
+        <w:keepNext/>
+        <w:keepLines/>
+        <w:pBdr>
+          <w:left w:val="single" w:color="808080" w:sz="4" w:space="4"/>
+          <w:right w:val="single" w:color="808080" w:sz="4" w:space="4"/>
+        </w:pBdr>
+        <w:shd w:fill="F2F2F2" w:color="auto" w:val="clear"/>
+        <w:spacing w:after="0" w:before="0" w:line="240"/>
+      </w:pPr>
+      <w:r>
+        <w:rPr>
+          <w:rFonts w:ascii="Courier New" w:cs="Courier New" w:eastAsia="Courier New" w:hAnsi="Courier New"/>
+          <w:sz w:val="16"/>
+          <w:szCs w:val="16"/>
+        </w:rPr>
+        <w:t xml:space="preserve">            line = raw_line.strip()</w:t>
+      </w:r>
+    </w:p>
+    <w:p>
+      <w:pPr>
+        <w:keepNext/>
+        <w:keepLines/>
+        <w:pBdr>
+          <w:left w:val="single" w:color="808080" w:sz="4" w:space="4"/>
+          <w:right w:val="single" w:color="808080" w:sz="4" w:space="4"/>
+        </w:pBdr>
+        <w:shd w:fill="F2F2F2" w:color="auto" w:val="clear"/>
+        <w:spacing w:after="0" w:before="0" w:line="240"/>
+      </w:pPr>
+      <w:r>
+        <w:rPr>
+          <w:rFonts w:ascii="Courier New" w:cs="Courier New" w:eastAsia="Courier New" w:hAnsi="Courier New"/>
+          <w:sz w:val="16"/>
+          <w:szCs w:val="16"/>
+        </w:rPr>
+        <w:t xml:space="preserve">            if not line:</w:t>
+      </w:r>
+    </w:p>
+    <w:p>
+      <w:pPr>
+        <w:keepNext/>
+        <w:keepLines/>
+        <w:pBdr>
+          <w:left w:val="single" w:color="808080" w:sz="4" w:space="4"/>
+          <w:right w:val="single" w:color="808080" w:sz="4" w:space="4"/>
+        </w:pBdr>
+        <w:shd w:fill="F2F2F2" w:color="auto" w:val="clear"/>
+        <w:spacing w:after="0" w:before="0" w:line="240"/>
+      </w:pPr>
+      <w:r>
+        <w:rPr>
+          <w:rFonts w:ascii="Courier New" w:cs="Courier New" w:eastAsia="Courier New" w:hAnsi="Courier New"/>
+          <w:sz w:val="16"/>
+          <w:szCs w:val="16"/>
+        </w:rPr>
+        <w:t xml:space="preserve">                continue</w:t>
+      </w:r>
+    </w:p>
+    <w:p>
+      <w:pPr>
+        <w:keepNext/>
+        <w:keepLines/>
+        <w:pBdr>
+          <w:left w:val="single" w:color="808080" w:sz="4" w:space="4"/>
+          <w:right w:val="single" w:color="808080" w:sz="4" w:space="4"/>
+        </w:pBdr>
+        <w:shd w:fill="F2F2F2" w:color="auto" w:val="clear"/>
+        <w:spacing w:after="0" w:before="0" w:line="240"/>
+      </w:pPr>
+      <w:r>
+        <w:rPr>
+          <w:rFonts w:ascii="Courier New" w:cs="Courier New" w:eastAsia="Courier New" w:hAnsi="Courier New"/>
+          <w:sz w:val="16"/>
+          <w:szCs w:val="16"/>
+        </w:rPr>
+        <w:t xml:space="preserve">            ids = self.citations(line)          # chunk ids in [brackets]</w:t>
+      </w:r>
+    </w:p>
+    <w:p>
+      <w:pPr>
+        <w:keepNext/>
+        <w:keepLines/>
+        <w:pBdr>
+          <w:left w:val="single" w:color="808080" w:sz="4" w:space="4"/>
+          <w:right w:val="single" w:color="808080" w:sz="4" w:space="4"/>
+        </w:pBdr>
+        <w:shd w:fill="F2F2F2" w:color="auto" w:val="clear"/>
+        <w:spacing w:after="0" w:before="0" w:line="240"/>
+      </w:pPr>
+      <w:r>
+        <w:rPr>
+          <w:rFonts w:ascii="Courier New" w:cs="Courier New" w:eastAsia="Courier New" w:hAnsi="Courier New"/>
+          <w:sz w:val="16"/>
+          <w:szCs w:val="16"/>
+        </w:rPr>
+        <w:t xml:space="preserve">            if ids:</w:t>
+      </w:r>
+    </w:p>
+    <w:p>
+      <w:pPr>
+        <w:keepNext/>
+        <w:keepLines/>
+        <w:pBdr>
+          <w:left w:val="single" w:color="808080" w:sz="4" w:space="4"/>
+          <w:right w:val="single" w:color="808080" w:sz="4" w:space="4"/>
+        </w:pBdr>
+        <w:shd w:fill="F2F2F2" w:color="auto" w:val="clear"/>
+        <w:spacing w:after="0" w:before="0" w:line="240"/>
+      </w:pPr>
+      <w:r>
+        <w:rPr>
+          <w:rFonts w:ascii="Courier New" w:cs="Courier New" w:eastAsia="Courier New" w:hAnsi="Courier New"/>
+          <w:sz w:val="16"/>
+          <w:szCs w:val="16"/>
+        </w:rPr>
+        <w:t xml:space="preserve">                text = _CITATION_RE.sub("", line).strip()</w:t>
+      </w:r>
+    </w:p>
+    <w:p>
+      <w:pPr>
+        <w:keepNext/>
+        <w:keepLines/>
+        <w:pBdr>
+          <w:left w:val="single" w:color="808080" w:sz="4" w:space="4"/>
+          <w:right w:val="single" w:color="808080" w:sz="4" w:space="4"/>
+        </w:pBdr>
+        <w:shd w:fill="F2F2F2" w:color="auto" w:val="clear"/>
+        <w:spacing w:after="0" w:before="0" w:line="240"/>
+      </w:pPr>
+      <w:r>
+        <w:rPr>
+          <w:rFonts w:ascii="Courier New" w:cs="Courier New" w:eastAsia="Courier New" w:hAnsi="Courier New"/>
+          <w:sz w:val="16"/>
+          <w:szCs w:val="16"/>
+        </w:rPr>
+        <w:t xml:space="preserve">                claims.append(ParsedClaim(text, ids))</w:t>
+      </w:r>
+    </w:p>
+    <w:p>
+      <w:pPr>
+        <w:keepNext/>
+        <w:keepLines/>
+        <w:pBdr>
+          <w:left w:val="single" w:color="808080" w:sz="4" w:space="4"/>
+          <w:right w:val="single" w:color="808080" w:sz="4" w:space="4"/>
+        </w:pBdr>
+        <w:shd w:fill="F2F2F2" w:color="auto" w:val="clear"/>
+        <w:spacing w:after="0" w:before="0" w:line="240"/>
+      </w:pPr>
+      <w:r>
+        <w:rPr>
+          <w:rFonts w:ascii="Courier New" w:cs="Courier New" w:eastAsia="Courier New" w:hAnsi="Courier New"/>
+          <w:sz w:val="16"/>
+          <w:szCs w:val="16"/>
+        </w:rPr>
+        <w:t xml:space="preserve">            else:</w:t>
+      </w:r>
+    </w:p>
+    <w:p>
+      <w:pPr>
+        <w:keepNext/>
+        <w:keepLines/>
+        <w:pBdr>
+          <w:left w:val="single" w:color="808080" w:sz="4" w:space="4"/>
+          <w:right w:val="single" w:color="808080" w:sz="4" w:space="4"/>
+        </w:pBdr>
+        <w:shd w:fill="F2F2F2" w:color="auto" w:val="clear"/>
+        <w:spacing w:after="0" w:before="0" w:line="240"/>
+      </w:pPr>
+      <w:r>
+        <w:rPr>
+          <w:rFonts w:ascii="Courier New" w:cs="Courier New" w:eastAsia="Courier New" w:hAnsi="Courier New"/>
+          <w:sz w:val="16"/>
+          <w:szCs w:val="16"/>
+        </w:rPr>
+        <w:t xml:space="preserve">                malformed.append(line)          # a sentence with no citation</w:t>
+      </w:r>
+    </w:p>
+    <w:p>
+      <w:pPr>
+        <w:keepNext/>
+        <w:keepLines/>
+        <w:pBdr>
+          <w:left w:val="single" w:color="808080" w:sz="4" w:space="4"/>
+          <w:right w:val="single" w:color="808080" w:sz="4" w:space="4"/>
+        </w:pBdr>
+        <w:shd w:fill="F2F2F2" w:color="auto" w:val="clear"/>
+        <w:spacing w:after="0" w:before="0" w:line="240"/>
+      </w:pPr>
+      <w:r>
+        <w:rPr>
+          <w:rFonts w:ascii="Courier New" w:cs="Courier New" w:eastAsia="Courier New" w:hAnsi="Courier New"/>
+          <w:sz w:val="16"/>
+          <w:szCs w:val="16"/>
+        </w:rPr>
+        <w:t xml:space="preserve">        return ParsedAnswer(raw_text=text, abstained=False,</w:t>
+      </w:r>
+    </w:p>
+    <w:p>
+      <w:pPr>
+        <w:keepNext w:val="false"/>
+        <w:keepLines/>
+        <w:pBdr>
+          <w:bottom w:val="single" w:color="808080" w:sz="4" w:space="4"/>
+          <w:left w:val="single" w:color="808080" w:sz="4" w:space="4"/>
+          <w:right w:val="single" w:color="808080" w:sz="4" w:space="4"/>
+        </w:pBdr>
+        <w:shd w:fill="F2F2F2" w:color="auto" w:val="clear"/>
+        <w:spacing w:after="200" w:before="0" w:line="240"/>
+      </w:pPr>
+      <w:r>
+        <w:rPr>
+          <w:rFonts w:ascii="Courier New" w:cs="Courier New" w:eastAsia="Courier New" w:hAnsi="Courier New"/>
+          <w:sz w:val="16"/>
+          <w:szCs w:val="16"/>
+        </w:rPr>
+        <w:t xml:space="preserve">                            claims=claims, malformed_lines=malformed)</w:t>
+      </w:r>
+    </w:p>
+    <w:p>
+      <w:pPr>
+        <w:spacing w:after="160" w:line="360"/>
+        <w:jc w:val="both"/>
+      </w:pPr>
+      <w:r>
+        <w:rPr>
+          <w:rFonts w:ascii="Times New Roman" w:cs="Times New Roman" w:eastAsia="Times New Roman" w:hAnsi="Times New Roman"/>
+          <w:sz w:val="24"/>
+          <w:szCs w:val="24"/>
+        </w:rPr>
+        <w:t xml:space="preserve">The answer step itself is a small chain of four parts. The prompt step fills the citation-forced prompt with the question and the retrieved chunks, the model wraps whichever language model provider is configured, the string parser takes the text of the reply, and the citation parser turns that text into a structured answer. The parser first checks for the abstention marker, in which case the answer is recorded as an abstention with no claims. Otherwise it reads the reply line by line, extracts the chunk identifiers written in square brackets at the end of each line, and stores every line that has at least one identifier as a claim with its citations. A line without any citation is kept separately as a malformed line and is never shown as a claim, because a factual sentence without a source cannot be verified by the layers that follow.</w:t>
+      </w:r>
+    </w:p>
+    <w:p>
+      <w:pPr>
+        <w:pStyle w:val="Heading3"/>
+        <w:keepNext/>
+        <w:spacing w:after="100" w:before="200"/>
+      </w:pPr>
+      <w:r>
+        <w:rPr>
+          <w:rFonts w:ascii="Times New Roman" w:cs="Times New Roman" w:eastAsia="Times New Roman" w:hAnsi="Times New Roman"/>
+          <w:b/>
+          <w:bCs/>
+          <w:sz w:val="24"/>
+          <w:szCs w:val="24"/>
+        </w:rPr>
+        <w:t xml:space="preserve">5.5.3  Retrieval Comparison and Fusion</w:t>
+      </w:r>
+    </w:p>
+    <w:p>
+      <w:pPr>
+        <w:keepNext/>
+        <w:keepLines/>
+        <w:pBdr>
+          <w:top w:val="single" w:color="808080" w:sz="4" w:space="4"/>
+          <w:left w:val="single" w:color="808080" w:sz="4" w:space="4"/>
+          <w:right w:val="single" w:color="808080" w:sz="4" w:space="4"/>
+        </w:pBdr>
+        <w:shd w:fill="F2F2F2" w:color="auto" w:val="clear"/>
+        <w:spacing w:after="0" w:before="120" w:line="240"/>
+      </w:pPr>
+      <w:r>
+        <w:rPr>
+          <w:rFonts w:ascii="Courier New" w:cs="Courier New" w:eastAsia="Courier New" w:hAnsi="Courier New"/>
+          <w:sz w:val="16"/>
+          <w:szCs w:val="16"/>
+        </w:rPr>
+        <w:t xml:space="preserve">def weighted_reciprocal_rank(self, doc_lists):</w:t>
+      </w:r>
+    </w:p>
+    <w:p>
+      <w:pPr>
+        <w:keepNext/>
+        <w:keepLines/>
+        <w:pBdr>
+          <w:left w:val="single" w:color="808080" w:sz="4" w:space="4"/>
+          <w:right w:val="single" w:color="808080" w:sz="4" w:space="4"/>
+        </w:pBdr>
+        <w:shd w:fill="F2F2F2" w:color="auto" w:val="clear"/>
+        <w:spacing w:after="0" w:before="0" w:line="240"/>
+      </w:pPr>
+      <w:r>
+        <w:rPr>
+          <w:rFonts w:ascii="Courier New" w:cs="Courier New" w:eastAsia="Courier New" w:hAnsi="Courier New"/>
+          <w:sz w:val="16"/>
+          <w:szCs w:val="16"/>
+        </w:rPr>
+        <w:t xml:space="preserve">    scores, first = {}, {}</w:t>
+      </w:r>
+    </w:p>
+    <w:p>
+      <w:pPr>
+        <w:keepNext/>
+        <w:keepLines/>
+        <w:pBdr>
+          <w:left w:val="single" w:color="808080" w:sz="4" w:space="4"/>
+          <w:right w:val="single" w:color="808080" w:sz="4" w:space="4"/>
+        </w:pBdr>
+        <w:shd w:fill="F2F2F2" w:color="auto" w:val="clear"/>
+        <w:spacing w:after="0" w:before="0" w:line="240"/>
+      </w:pPr>
+      <w:r>
+        <w:rPr>
+          <w:rFonts w:ascii="Courier New" w:cs="Courier New" w:eastAsia="Courier New" w:hAnsi="Courier New"/>
+          <w:sz w:val="16"/>
+          <w:szCs w:val="16"/>
+        </w:rPr>
+        <w:t xml:space="preserve">    for doc_list, weight in zip(doc_lists, self.weights):   # dense, BM25</w:t>
+      </w:r>
+    </w:p>
+    <w:p>
+      <w:pPr>
+        <w:keepNext/>
+        <w:keepLines/>
+        <w:pBdr>
+          <w:left w:val="single" w:color="808080" w:sz="4" w:space="4"/>
+          <w:right w:val="single" w:color="808080" w:sz="4" w:space="4"/>
+        </w:pBdr>
+        <w:shd w:fill="F2F2F2" w:color="auto" w:val="clear"/>
+        <w:spacing w:after="0" w:before="0" w:line="240"/>
+      </w:pPr>
+      <w:r>
+        <w:rPr>
+          <w:rFonts w:ascii="Courier New" w:cs="Courier New" w:eastAsia="Courier New" w:hAnsi="Courier New"/>
+          <w:sz w:val="16"/>
+          <w:szCs w:val="16"/>
+        </w:rPr>
+        <w:t xml:space="preserve">        for rank, doc in enumerate(doc_list, start=1):</w:t>
+      </w:r>
+    </w:p>
+    <w:p>
+      <w:pPr>
+        <w:keepNext/>
+        <w:keepLines/>
+        <w:pBdr>
+          <w:left w:val="single" w:color="808080" w:sz="4" w:space="4"/>
+          <w:right w:val="single" w:color="808080" w:sz="4" w:space="4"/>
+        </w:pBdr>
+        <w:shd w:fill="F2F2F2" w:color="auto" w:val="clear"/>
+        <w:spacing w:after="0" w:before="0" w:line="240"/>
+      </w:pPr>
+      <w:r>
+        <w:rPr>
+          <w:rFonts w:ascii="Courier New" w:cs="Courier New" w:eastAsia="Courier New" w:hAnsi="Courier New"/>
+          <w:sz w:val="16"/>
+          <w:szCs w:val="16"/>
+        </w:rPr>
+        <w:t xml:space="preserve">            key = doc.metadata[self.id_key]</w:t>
+      </w:r>
+    </w:p>
+    <w:p>
+      <w:pPr>
+        <w:keepNext/>
+        <w:keepLines/>
+        <w:pBdr>
+          <w:left w:val="single" w:color="808080" w:sz="4" w:space="4"/>
+          <w:right w:val="single" w:color="808080" w:sz="4" w:space="4"/>
+        </w:pBdr>
+        <w:shd w:fill="F2F2F2" w:color="auto" w:val="clear"/>
+        <w:spacing w:after="0" w:before="0" w:line="240"/>
+      </w:pPr>
+      <w:r>
+        <w:rPr>
+          <w:rFonts w:ascii="Courier New" w:cs="Courier New" w:eastAsia="Courier New" w:hAnsi="Courier New"/>
+          <w:sz w:val="16"/>
+          <w:szCs w:val="16"/>
+        </w:rPr>
+        <w:t xml:space="preserve">            scores[key] = scores.get(key, 0.0) + weight / (rank + self.c)</w:t>
+      </w:r>
+    </w:p>
+    <w:p>
+      <w:pPr>
+        <w:keepNext/>
+        <w:keepLines/>
+        <w:pBdr>
+          <w:left w:val="single" w:color="808080" w:sz="4" w:space="4"/>
+          <w:right w:val="single" w:color="808080" w:sz="4" w:space="4"/>
+        </w:pBdr>
+        <w:shd w:fill="F2F2F2" w:color="auto" w:val="clear"/>
+        <w:spacing w:after="0" w:before="0" w:line="240"/>
+      </w:pPr>
+      <w:r>
+        <w:rPr>
+          <w:rFonts w:ascii="Courier New" w:cs="Courier New" w:eastAsia="Courier New" w:hAnsi="Courier New"/>
+          <w:sz w:val="16"/>
+          <w:szCs w:val="16"/>
+        </w:rPr>
+        <w:t xml:space="preserve">            first.setdefault(key, doc)</w:t>
+      </w:r>
+    </w:p>
+    <w:p>
+      <w:pPr>
+        <w:keepNext/>
+        <w:keepLines/>
+        <w:pBdr>
+          <w:left w:val="single" w:color="808080" w:sz="4" w:space="4"/>
+          <w:right w:val="single" w:color="808080" w:sz="4" w:space="4"/>
+        </w:pBdr>
+        <w:shd w:fill="F2F2F2" w:color="auto" w:val="clear"/>
+        <w:spacing w:after="0" w:before="0" w:line="240"/>
+      </w:pPr>
+      <w:r>
+        <w:rPr>
+          <w:rFonts w:ascii="Courier New" w:cs="Courier New" w:eastAsia="Courier New" w:hAnsi="Courier New"/>
+          <w:sz w:val="16"/>
+          <w:szCs w:val="16"/>
+        </w:rPr>
+        <w:t xml:space="preserve">    ranked = sorted(scores, key=lambda key: scores[key],</w:t>
+      </w:r>
+    </w:p>
+    <w:p>
+      <w:pPr>
+        <w:keepNext/>
+        <w:keepLines/>
+        <w:pBdr>
+          <w:left w:val="single" w:color="808080" w:sz="4" w:space="4"/>
+          <w:right w:val="single" w:color="808080" w:sz="4" w:space="4"/>
+        </w:pBdr>
+        <w:shd w:fill="F2F2F2" w:color="auto" w:val="clear"/>
+        <w:spacing w:after="0" w:before="0" w:line="240"/>
+      </w:pPr>
+      <w:r>
+        <w:rPr>
+          <w:rFonts w:ascii="Courier New" w:cs="Courier New" w:eastAsia="Courier New" w:hAnsi="Courier New"/>
+          <w:sz w:val="16"/>
+          <w:szCs w:val="16"/>
+        </w:rPr>
+        <w:t xml:space="preserve">                    reverse=True)[: self.limit]</w:t>
+      </w:r>
+    </w:p>
+    <w:p>
+      <w:pPr>
+        <w:keepNext/>
+        <w:keepLines/>
+        <w:pBdr>
+          <w:left w:val="single" w:color="808080" w:sz="4" w:space="4"/>
+          <w:right w:val="single" w:color="808080" w:sz="4" w:space="4"/>
+        </w:pBdr>
+        <w:shd w:fill="F2F2F2" w:color="auto" w:val="clear"/>
+        <w:spacing w:after="0" w:before="0" w:line="240"/>
+      </w:pPr>
+      <w:r>
+        <w:rPr>
+          <w:rFonts w:ascii="Courier New" w:cs="Courier New" w:eastAsia="Courier New" w:hAnsi="Courier New"/>
+          <w:sz w:val="16"/>
+          <w:szCs w:val="16"/>
+        </w:rPr>
+        <w:t xml:space="preserve">    return [_copy(first[key], _relevance_score=scores[key]) for key in ranked]</w:t>
+      </w:r>
+    </w:p>
+    <w:p>
+      <w:pPr>
+        <w:keepNext/>
+        <w:keepLines/>
+        <w:pBdr>
+          <w:left w:val="single" w:color="808080" w:sz="4" w:space="4"/>
+          <w:right w:val="single" w:color="808080" w:sz="4" w:space="4"/>
+        </w:pBdr>
+        <w:shd w:fill="F2F2F2" w:color="auto" w:val="clear"/>
+        <w:spacing w:after="0" w:before="0" w:line="240"/>
+      </w:pPr>
+      <w:r>
+        <w:rPr>
+          <w:rFonts w:ascii="Courier New" w:cs="Courier New" w:eastAsia="Courier New" w:hAnsi="Courier New"/>
+          <w:sz w:val="16"/>
+          <w:szCs w:val="16"/>
+        </w:rPr>
+        <w:t xml:space="preserve"> </w:t>
+      </w:r>
+    </w:p>
+    <w:p>
+      <w:pPr>
+        <w:keepNext/>
+        <w:keepLines/>
+        <w:pBdr>
+          <w:left w:val="single" w:color="808080" w:sz="4" w:space="4"/>
+          <w:right w:val="single" w:color="808080" w:sz="4" w:space="4"/>
+        </w:pBdr>
+        <w:shd w:fill="F2F2F2" w:color="auto" w:val="clear"/>
+        <w:spacing w:after="0" w:before="0" w:line="240"/>
+      </w:pPr>
+      <w:r>
+        <w:rPr>
+          <w:rFonts w:ascii="Courier New" w:cs="Courier New" w:eastAsia="Courier New" w:hAnsi="Courier New"/>
+          <w:sz w:val="16"/>
+          <w:szCs w:val="16"/>
+        </w:rPr>
+        <w:t xml:space="preserve">def query_retriever(store, k, n, reranker=None):</w:t>
+      </w:r>
+    </w:p>
+    <w:p>
+      <w:pPr>
+        <w:keepNext/>
+        <w:keepLines/>
+        <w:pBdr>
+          <w:left w:val="single" w:color="808080" w:sz="4" w:space="4"/>
+          <w:right w:val="single" w:color="808080" w:sz="4" w:space="4"/>
+        </w:pBdr>
+        <w:shd w:fill="F2F2F2" w:color="auto" w:val="clear"/>
+        <w:spacing w:after="0" w:before="0" w:line="240"/>
+      </w:pPr>
+      <w:r>
+        <w:rPr>
+          <w:rFonts w:ascii="Courier New" w:cs="Courier New" w:eastAsia="Courier New" w:hAnsi="Courier New"/>
+          <w:sz w:val="16"/>
+          <w:szCs w:val="16"/>
+        </w:rPr>
+        <w:t xml:space="preserve">    if reranker is None:</w:t>
+      </w:r>
+    </w:p>
+    <w:p>
+      <w:pPr>
+        <w:keepNext/>
+        <w:keepLines/>
+        <w:pBdr>
+          <w:left w:val="single" w:color="808080" w:sz="4" w:space="4"/>
+          <w:right w:val="single" w:color="808080" w:sz="4" w:space="4"/>
+        </w:pBdr>
+        <w:shd w:fill="F2F2F2" w:color="auto" w:val="clear"/>
+        <w:spacing w:after="0" w:before="0" w:line="240"/>
+      </w:pPr>
+      <w:r>
+        <w:rPr>
+          <w:rFonts w:ascii="Courier New" w:cs="Courier New" w:eastAsia="Courier New" w:hAnsi="Courier New"/>
+          <w:sz w:val="16"/>
+          <w:szCs w:val="16"/>
+        </w:rPr>
+        <w:t xml:space="preserve">        return hybrid_retriever(store, k)</w:t>
+      </w:r>
+    </w:p>
+    <w:p>
+      <w:pPr>
+        <w:keepNext/>
+        <w:keepLines/>
+        <w:pBdr>
+          <w:left w:val="single" w:color="808080" w:sz="4" w:space="4"/>
+          <w:right w:val="single" w:color="808080" w:sz="4" w:space="4"/>
+        </w:pBdr>
+        <w:shd w:fill="F2F2F2" w:color="auto" w:val="clear"/>
+        <w:spacing w:after="0" w:before="0" w:line="240"/>
+      </w:pPr>
+      <w:r>
+        <w:rPr>
+          <w:rFonts w:ascii="Courier New" w:cs="Courier New" w:eastAsia="Courier New" w:hAnsi="Courier New"/>
+          <w:sz w:val="16"/>
+          <w:szCs w:val="16"/>
+        </w:rPr>
+        <w:t xml:space="preserve">    return ContextualCompressionRetriever(</w:t>
+      </w:r>
+    </w:p>
+    <w:p>
+      <w:pPr>
+        <w:keepNext/>
+        <w:keepLines/>
+        <w:pBdr>
+          <w:left w:val="single" w:color="808080" w:sz="4" w:space="4"/>
+          <w:right w:val="single" w:color="808080" w:sz="4" w:space="4"/>
+        </w:pBdr>
+        <w:shd w:fill="F2F2F2" w:color="auto" w:val="clear"/>
+        <w:spacing w:after="0" w:before="0" w:line="240"/>
+      </w:pPr>
+      <w:r>
+        <w:rPr>
+          <w:rFonts w:ascii="Courier New" w:cs="Courier New" w:eastAsia="Courier New" w:hAnsi="Courier New"/>
+          <w:sz w:val="16"/>
+          <w:szCs w:val="16"/>
+        </w:rPr>
+        <w:t xml:space="preserve">        base_compressor=as_compressor(reranker, top_n=k),</w:t>
+      </w:r>
+    </w:p>
+    <w:p>
+      <w:pPr>
+        <w:keepNext w:val="false"/>
+        <w:keepLines/>
+        <w:pBdr>
+          <w:bottom w:val="single" w:color="808080" w:sz="4" w:space="4"/>
+          <w:left w:val="single" w:color="808080" w:sz="4" w:space="4"/>
+          <w:right w:val="single" w:color="808080" w:sz="4" w:space="4"/>
+        </w:pBdr>
+        <w:shd w:fill="F2F2F2" w:color="auto" w:val="clear"/>
+        <w:spacing w:after="200" w:before="0" w:line="240"/>
+      </w:pPr>
+      <w:r>
+        <w:rPr>
+          <w:rFonts w:ascii="Courier New" w:cs="Courier New" w:eastAsia="Courier New" w:hAnsi="Courier New"/>
+          <w:sz w:val="16"/>
+          <w:szCs w:val="16"/>
+        </w:rPr>
+        <w:t xml:space="preserve">        base_retriever=hybrid_retriever(store, n))</w:t>
+      </w:r>
+    </w:p>
+    <w:p>
+      <w:pPr>
+        <w:spacing w:after="160" w:line="360"/>
+        <w:jc w:val="both"/>
+      </w:pPr>
+      <w:r>
+        <w:rPr>
+          <w:rFonts w:ascii="Times New Roman" w:cs="Times New Roman" w:eastAsia="Times New Roman" w:hAnsi="Times New Roman"/>
+          <w:sz w:val="24"/>
+          <w:szCs w:val="24"/>
+        </w:rPr>
+        <w:t xml:space="preserve">The first function compares and merges the ranked lists returned by dense search and BM25 keyword search. For every list it walks through the chunks in order and adds the weight of the list divided by the rank plus a constant to the score of each chunk, which is Equation 4.1, so a chunk found near the top of both lists collects two contributions and moves up. The chunks are then sorted by their fused score and the best ones are returned with the score attached, so the Search page and the proof view can display it. The second function puts the stages together: without a reranker it returns the fused top k directly, and with a reranker it first fetches a larger pool of n fused candidates and then lets the cross-encoder keep the best k of them, which is how the Ask page turns a pool of one hundred candidates into twelve passages.</w:t>
+      </w:r>
+    </w:p>
+    <w:p>
+      <w:pPr>
+        <w:keepNext/>
+        <w:keepLines/>
+        <w:pBdr>
+          <w:top w:val="single" w:color="808080" w:sz="4" w:space="4"/>
+          <w:left w:val="single" w:color="808080" w:sz="4" w:space="4"/>
+          <w:right w:val="single" w:color="808080" w:sz="4" w:space="4"/>
+        </w:pBdr>
+        <w:shd w:fill="F2F2F2" w:color="auto" w:val="clear"/>
+        <w:spacing w:after="0" w:before="120" w:line="240"/>
+      </w:pPr>
+      <w:r>
+        <w:rPr>
+          <w:rFonts w:ascii="Courier New" w:cs="Courier New" w:eastAsia="Courier New" w:hAnsi="Courier New"/>
+          <w:sz w:val="16"/>
+          <w:szCs w:val="16"/>
+        </w:rPr>
+        <w:t xml:space="preserve">def bm25_retriever(store: ChunkStore, k: int) -&gt; BaseRetriever:</w:t>
+      </w:r>
+    </w:p>
+    <w:p>
+      <w:pPr>
+        <w:keepNext/>
+        <w:keepLines/>
+        <w:pBdr>
+          <w:left w:val="single" w:color="808080" w:sz="4" w:space="4"/>
+          <w:right w:val="single" w:color="808080" w:sz="4" w:space="4"/>
+        </w:pBdr>
+        <w:shd w:fill="F2F2F2" w:color="auto" w:val="clear"/>
+        <w:spacing w:after="0" w:before="0" w:line="240"/>
+      </w:pPr>
+      <w:r>
+        <w:rPr>
+          <w:rFonts w:ascii="Courier New" w:cs="Courier New" w:eastAsia="Courier New" w:hAnsi="Courier New"/>
+          <w:sz w:val="16"/>
+          <w:szCs w:val="16"/>
+        </w:rPr>
+        <w:t xml:space="preserve">    key = (store.db_path, store.version())</w:t>
+      </w:r>
+    </w:p>
+    <w:p>
+      <w:pPr>
+        <w:keepNext/>
+        <w:keepLines/>
+        <w:pBdr>
+          <w:left w:val="single" w:color="808080" w:sz="4" w:space="4"/>
+          <w:right w:val="single" w:color="808080" w:sz="4" w:space="4"/>
+        </w:pBdr>
+        <w:shd w:fill="F2F2F2" w:color="auto" w:val="clear"/>
+        <w:spacing w:after="0" w:before="0" w:line="240"/>
+      </w:pPr>
+      <w:r>
+        <w:rPr>
+          <w:rFonts w:ascii="Courier New" w:cs="Courier New" w:eastAsia="Courier New" w:hAnsi="Courier New"/>
+          <w:sz w:val="16"/>
+          <w:szCs w:val="16"/>
+        </w:rPr>
+        <w:t xml:space="preserve">    if key not in _BM25_CACHE:          # rebuilt after an ingest or delete</w:t>
+      </w:r>
+    </w:p>
+    <w:p>
+      <w:pPr>
+        <w:keepNext/>
+        <w:keepLines/>
+        <w:pBdr>
+          <w:left w:val="single" w:color="808080" w:sz="4" w:space="4"/>
+          <w:right w:val="single" w:color="808080" w:sz="4" w:space="4"/>
+        </w:pBdr>
+        <w:shd w:fill="F2F2F2" w:color="auto" w:val="clear"/>
+        <w:spacing w:after="0" w:before="0" w:line="240"/>
+      </w:pPr>
+      <w:r>
+        <w:rPr>
+          <w:rFonts w:ascii="Courier New" w:cs="Courier New" w:eastAsia="Courier New" w:hAnsi="Courier New"/>
+          <w:sz w:val="16"/>
+          <w:szCs w:val="16"/>
+        </w:rPr>
+        <w:t xml:space="preserve">        docs = store.all_documents()</w:t>
+      </w:r>
+    </w:p>
+    <w:p>
+      <w:pPr>
+        <w:keepNext/>
+        <w:keepLines/>
+        <w:pBdr>
+          <w:left w:val="single" w:color="808080" w:sz="4" w:space="4"/>
+          <w:right w:val="single" w:color="808080" w:sz="4" w:space="4"/>
+        </w:pBdr>
+        <w:shd w:fill="F2F2F2" w:color="auto" w:val="clear"/>
+        <w:spacing w:after="0" w:before="0" w:line="240"/>
+      </w:pPr>
+      <w:r>
+        <w:rPr>
+          <w:rFonts w:ascii="Courier New" w:cs="Courier New" w:eastAsia="Courier New" w:hAnsi="Courier New"/>
+          <w:sz w:val="16"/>
+          <w:szCs w:val="16"/>
+        </w:rPr>
+        <w:t xml:space="preserve">        _BM25_CACHE.clear()</w:t>
+      </w:r>
+    </w:p>
+    <w:p>
+      <w:pPr>
+        <w:keepNext/>
+        <w:keepLines/>
+        <w:pBdr>
+          <w:left w:val="single" w:color="808080" w:sz="4" w:space="4"/>
+          <w:right w:val="single" w:color="808080" w:sz="4" w:space="4"/>
+        </w:pBdr>
+        <w:shd w:fill="F2F2F2" w:color="auto" w:val="clear"/>
+        <w:spacing w:after="0" w:before="0" w:line="240"/>
+      </w:pPr>
+      <w:r>
+        <w:rPr>
+          <w:rFonts w:ascii="Courier New" w:cs="Courier New" w:eastAsia="Courier New" w:hAnsi="Courier New"/>
+          <w:sz w:val="16"/>
+          <w:szCs w:val="16"/>
+        </w:rPr>
+        <w:t xml:space="preserve">        _BM25_CACHE[key] = (</w:t>
+      </w:r>
+    </w:p>
+    <w:p>
+      <w:pPr>
+        <w:keepNext/>
+        <w:keepLines/>
+        <w:pBdr>
+          <w:left w:val="single" w:color="808080" w:sz="4" w:space="4"/>
+          <w:right w:val="single" w:color="808080" w:sz="4" w:space="4"/>
+        </w:pBdr>
+        <w:shd w:fill="F2F2F2" w:color="auto" w:val="clear"/>
+        <w:spacing w:after="0" w:before="0" w:line="240"/>
+      </w:pPr>
+      <w:r>
+        <w:rPr>
+          <w:rFonts w:ascii="Courier New" w:cs="Courier New" w:eastAsia="Courier New" w:hAnsi="Courier New"/>
+          <w:sz w:val="16"/>
+          <w:szCs w:val="16"/>
+        </w:rPr>
+        <w:t xml:space="preserve">            ScoredBM25Retriever.from_documents(</w:t>
+      </w:r>
+    </w:p>
+    <w:p>
+      <w:pPr>
+        <w:keepNext/>
+        <w:keepLines/>
+        <w:pBdr>
+          <w:left w:val="single" w:color="808080" w:sz="4" w:space="4"/>
+          <w:right w:val="single" w:color="808080" w:sz="4" w:space="4"/>
+        </w:pBdr>
+        <w:shd w:fill="F2F2F2" w:color="auto" w:val="clear"/>
+        <w:spacing w:after="0" w:before="0" w:line="240"/>
+      </w:pPr>
+      <w:r>
+        <w:rPr>
+          <w:rFonts w:ascii="Courier New" w:cs="Courier New" w:eastAsia="Courier New" w:hAnsi="Courier New"/>
+          <w:sz w:val="16"/>
+          <w:szCs w:val="16"/>
+        </w:rPr>
+        <w:t xml:space="preserve">                docs, preprocess_func=lance_tokenize)</w:t>
+      </w:r>
+    </w:p>
+    <w:p>
+      <w:pPr>
+        <w:keepNext/>
+        <w:keepLines/>
+        <w:pBdr>
+          <w:left w:val="single" w:color="808080" w:sz="4" w:space="4"/>
+          <w:right w:val="single" w:color="808080" w:sz="4" w:space="4"/>
+        </w:pBdr>
+        <w:shd w:fill="F2F2F2" w:color="auto" w:val="clear"/>
+        <w:spacing w:after="0" w:before="0" w:line="240"/>
+      </w:pPr>
+      <w:r>
+        <w:rPr>
+          <w:rFonts w:ascii="Courier New" w:cs="Courier New" w:eastAsia="Courier New" w:hAnsi="Courier New"/>
+          <w:sz w:val="16"/>
+          <w:szCs w:val="16"/>
+        </w:rPr>
+        <w:t xml:space="preserve">            if docs else _EmptyRetriever())</w:t>
+      </w:r>
+    </w:p>
+    <w:p>
+      <w:pPr>
+        <w:keepNext/>
+        <w:keepLines/>
+        <w:pBdr>
+          <w:left w:val="single" w:color="808080" w:sz="4" w:space="4"/>
+          <w:right w:val="single" w:color="808080" w:sz="4" w:space="4"/>
+        </w:pBdr>
+        <w:shd w:fill="F2F2F2" w:color="auto" w:val="clear"/>
+        <w:spacing w:after="0" w:before="0" w:line="240"/>
+      </w:pPr>
+      <w:r>
+        <w:rPr>
+          <w:rFonts w:ascii="Courier New" w:cs="Courier New" w:eastAsia="Courier New" w:hAnsi="Courier New"/>
+          <w:sz w:val="16"/>
+          <w:szCs w:val="16"/>
+        </w:rPr>
+        <w:t xml:space="preserve">    base = _BM25_CACHE[key]</w:t>
+      </w:r>
+    </w:p>
+    <w:p>
+      <w:pPr>
+        <w:keepNext/>
+        <w:keepLines/>
+        <w:pBdr>
+          <w:left w:val="single" w:color="808080" w:sz="4" w:space="4"/>
+          <w:right w:val="single" w:color="808080" w:sz="4" w:space="4"/>
+        </w:pBdr>
+        <w:shd w:fill="F2F2F2" w:color="auto" w:val="clear"/>
+        <w:spacing w:after="0" w:before="0" w:line="240"/>
+      </w:pPr>
+      <w:r>
+        <w:rPr>
+          <w:rFonts w:ascii="Courier New" w:cs="Courier New" w:eastAsia="Courier New" w:hAnsi="Courier New"/>
+          <w:sz w:val="16"/>
+          <w:szCs w:val="16"/>
+        </w:rPr>
+        <w:t xml:space="preserve">    return base.model_copy(update={"k": k})</w:t>
+      </w:r>
+    </w:p>
+    <w:p>
+      <w:pPr>
+        <w:keepNext/>
+        <w:keepLines/>
+        <w:pBdr>
+          <w:left w:val="single" w:color="808080" w:sz="4" w:space="4"/>
+          <w:right w:val="single" w:color="808080" w:sz="4" w:space="4"/>
+        </w:pBdr>
+        <w:shd w:fill="F2F2F2" w:color="auto" w:val="clear"/>
+        <w:spacing w:after="0" w:before="0" w:line="240"/>
+      </w:pPr>
+      <w:r>
+        <w:rPr>
+          <w:rFonts w:ascii="Courier New" w:cs="Courier New" w:eastAsia="Courier New" w:hAnsi="Courier New"/>
+          <w:sz w:val="16"/>
+          <w:szCs w:val="16"/>
+        </w:rPr>
+        <w:t xml:space="preserve"> </w:t>
+      </w:r>
+    </w:p>
+    <w:p>
+      <w:pPr>
+        <w:keepNext/>
+        <w:keepLines/>
+        <w:pBdr>
+          <w:left w:val="single" w:color="808080" w:sz="4" w:space="4"/>
+          <w:right w:val="single" w:color="808080" w:sz="4" w:space="4"/>
+        </w:pBdr>
+        <w:shd w:fill="F2F2F2" w:color="auto" w:val="clear"/>
+        <w:spacing w:after="0" w:before="0" w:line="240"/>
+      </w:pPr>
+      <w:r>
+        <w:rPr>
+          <w:rFonts w:ascii="Courier New" w:cs="Courier New" w:eastAsia="Courier New" w:hAnsi="Courier New"/>
+          <w:sz w:val="16"/>
+          <w:szCs w:val="16"/>
+        </w:rPr>
+        <w:t xml:space="preserve">def dense_retriever(store: ChunkStore, k: int) -&gt; DenseRetriever:</w:t>
+      </w:r>
+    </w:p>
+    <w:p>
+      <w:pPr>
+        <w:keepNext/>
+        <w:keepLines/>
+        <w:pBdr>
+          <w:left w:val="single" w:color="808080" w:sz="4" w:space="4"/>
+          <w:right w:val="single" w:color="808080" w:sz="4" w:space="4"/>
+        </w:pBdr>
+        <w:shd w:fill="F2F2F2" w:color="auto" w:val="clear"/>
+        <w:spacing w:after="0" w:before="0" w:line="240"/>
+      </w:pPr>
+      <w:r>
+        <w:rPr>
+          <w:rFonts w:ascii="Courier New" w:cs="Courier New" w:eastAsia="Courier New" w:hAnsi="Courier New"/>
+          <w:sz w:val="16"/>
+          <w:szCs w:val="16"/>
+        </w:rPr>
+        <w:t xml:space="preserve">    return DenseRetriever(store=store, k=k)</w:t>
+      </w:r>
+    </w:p>
+    <w:p>
+      <w:pPr>
+        <w:keepNext/>
+        <w:keepLines/>
+        <w:pBdr>
+          <w:left w:val="single" w:color="808080" w:sz="4" w:space="4"/>
+          <w:right w:val="single" w:color="808080" w:sz="4" w:space="4"/>
+        </w:pBdr>
+        <w:shd w:fill="F2F2F2" w:color="auto" w:val="clear"/>
+        <w:spacing w:after="0" w:before="0" w:line="240"/>
+      </w:pPr>
+      <w:r>
+        <w:rPr>
+          <w:rFonts w:ascii="Courier New" w:cs="Courier New" w:eastAsia="Courier New" w:hAnsi="Courier New"/>
+          <w:sz w:val="16"/>
+          <w:szCs w:val="16"/>
+        </w:rPr>
+        <w:t xml:space="preserve"> </w:t>
+      </w:r>
+    </w:p>
+    <w:p>
+      <w:pPr>
+        <w:keepNext/>
+        <w:keepLines/>
+        <w:pBdr>
+          <w:left w:val="single" w:color="808080" w:sz="4" w:space="4"/>
+          <w:right w:val="single" w:color="808080" w:sz="4" w:space="4"/>
+        </w:pBdr>
+        <w:shd w:fill="F2F2F2" w:color="auto" w:val="clear"/>
+        <w:spacing w:after="0" w:before="0" w:line="240"/>
+      </w:pPr>
+      <w:r>
+        <w:rPr>
+          <w:rFonts w:ascii="Courier New" w:cs="Courier New" w:eastAsia="Courier New" w:hAnsi="Courier New"/>
+          <w:sz w:val="16"/>
+          <w:szCs w:val="16"/>
+        </w:rPr>
+        <w:t xml:space="preserve">def hybrid_retriever(store: ChunkStore, k: int) -&gt; FusedRetriever:</w:t>
+      </w:r>
+    </w:p>
+    <w:p>
+      <w:pPr>
+        <w:keepNext/>
+        <w:keepLines/>
+        <w:pBdr>
+          <w:left w:val="single" w:color="808080" w:sz="4" w:space="4"/>
+          <w:right w:val="single" w:color="808080" w:sz="4" w:space="4"/>
+        </w:pBdr>
+        <w:shd w:fill="F2F2F2" w:color="auto" w:val="clear"/>
+        <w:spacing w:after="0" w:before="0" w:line="240"/>
+      </w:pPr>
+      <w:r>
+        <w:rPr>
+          <w:rFonts w:ascii="Courier New" w:cs="Courier New" w:eastAsia="Courier New" w:hAnsi="Courier New"/>
+          <w:sz w:val="16"/>
+          <w:szCs w:val="16"/>
+        </w:rPr>
+        <w:t xml:space="preserve">    """Dense + BM25, each fetching k, RRF-fused and truncated to k."""</w:t>
+      </w:r>
+    </w:p>
+    <w:p>
+      <w:pPr>
+        <w:keepNext/>
+        <w:keepLines/>
+        <w:pBdr>
+          <w:left w:val="single" w:color="808080" w:sz="4" w:space="4"/>
+          <w:right w:val="single" w:color="808080" w:sz="4" w:space="4"/>
+        </w:pBdr>
+        <w:shd w:fill="F2F2F2" w:color="auto" w:val="clear"/>
+        <w:spacing w:after="0" w:before="0" w:line="240"/>
+      </w:pPr>
+      <w:r>
+        <w:rPr>
+          <w:rFonts w:ascii="Courier New" w:cs="Courier New" w:eastAsia="Courier New" w:hAnsi="Courier New"/>
+          <w:sz w:val="16"/>
+          <w:szCs w:val="16"/>
+        </w:rPr>
+        <w:t xml:space="preserve">    return FusedRetriever(</w:t>
+      </w:r>
+    </w:p>
+    <w:p>
+      <w:pPr>
+        <w:keepNext/>
+        <w:keepLines/>
+        <w:pBdr>
+          <w:left w:val="single" w:color="808080" w:sz="4" w:space="4"/>
+          <w:right w:val="single" w:color="808080" w:sz="4" w:space="4"/>
+        </w:pBdr>
+        <w:shd w:fill="F2F2F2" w:color="auto" w:val="clear"/>
+        <w:spacing w:after="0" w:before="0" w:line="240"/>
+      </w:pPr>
+      <w:r>
+        <w:rPr>
+          <w:rFonts w:ascii="Courier New" w:cs="Courier New" w:eastAsia="Courier New" w:hAnsi="Courier New"/>
+          <w:sz w:val="16"/>
+          <w:szCs w:val="16"/>
+        </w:rPr>
+        <w:t xml:space="preserve">        retrievers=[dense_retriever(store, k), bm25_retriever(store, k)],</w:t>
+      </w:r>
+    </w:p>
+    <w:p>
+      <w:pPr>
+        <w:keepNext/>
+        <w:keepLines/>
+        <w:pBdr>
+          <w:left w:val="single" w:color="808080" w:sz="4" w:space="4"/>
+          <w:right w:val="single" w:color="808080" w:sz="4" w:space="4"/>
+        </w:pBdr>
+        <w:shd w:fill="F2F2F2" w:color="auto" w:val="clear"/>
+        <w:spacing w:after="0" w:before="0" w:line="240"/>
+      </w:pPr>
+      <w:r>
+        <w:rPr>
+          <w:rFonts w:ascii="Courier New" w:cs="Courier New" w:eastAsia="Courier New" w:hAnsi="Courier New"/>
+          <w:sz w:val="16"/>
+          <w:szCs w:val="16"/>
+        </w:rPr>
+        <w:t xml:space="preserve">        weights=[0.5, 0.5],</w:t>
+      </w:r>
+    </w:p>
+    <w:p>
+      <w:pPr>
+        <w:keepNext/>
+        <w:keepLines/>
+        <w:pBdr>
+          <w:left w:val="single" w:color="808080" w:sz="4" w:space="4"/>
+          <w:right w:val="single" w:color="808080" w:sz="4" w:space="4"/>
+        </w:pBdr>
+        <w:shd w:fill="F2F2F2" w:color="auto" w:val="clear"/>
+        <w:spacing w:after="0" w:before="0" w:line="240"/>
+      </w:pPr>
+      <w:r>
+        <w:rPr>
+          <w:rFonts w:ascii="Courier New" w:cs="Courier New" w:eastAsia="Courier New" w:hAnsi="Courier New"/>
+          <w:sz w:val="16"/>
+          <w:szCs w:val="16"/>
+        </w:rPr>
+        <w:t xml:space="preserve">        c=59,</w:t>
+      </w:r>
+    </w:p>
+    <w:p>
+      <w:pPr>
+        <w:keepNext/>
+        <w:keepLines/>
+        <w:pBdr>
+          <w:left w:val="single" w:color="808080" w:sz="4" w:space="4"/>
+          <w:right w:val="single" w:color="808080" w:sz="4" w:space="4"/>
+        </w:pBdr>
+        <w:shd w:fill="F2F2F2" w:color="auto" w:val="clear"/>
+        <w:spacing w:after="0" w:before="0" w:line="240"/>
+      </w:pPr>
+      <w:r>
+        <w:rPr>
+          <w:rFonts w:ascii="Courier New" w:cs="Courier New" w:eastAsia="Courier New" w:hAnsi="Courier New"/>
+          <w:sz w:val="16"/>
+          <w:szCs w:val="16"/>
+        </w:rPr>
+        <w:t xml:space="preserve">        id_key="chunk_id",</w:t>
+      </w:r>
+    </w:p>
+    <w:p>
+      <w:pPr>
+        <w:keepNext/>
+        <w:keepLines/>
+        <w:pBdr>
+          <w:left w:val="single" w:color="808080" w:sz="4" w:space="4"/>
+          <w:right w:val="single" w:color="808080" w:sz="4" w:space="4"/>
+        </w:pBdr>
+        <w:shd w:fill="F2F2F2" w:color="auto" w:val="clear"/>
+        <w:spacing w:after="0" w:before="0" w:line="240"/>
+      </w:pPr>
+      <w:r>
+        <w:rPr>
+          <w:rFonts w:ascii="Courier New" w:cs="Courier New" w:eastAsia="Courier New" w:hAnsi="Courier New"/>
+          <w:sz w:val="16"/>
+          <w:szCs w:val="16"/>
+        </w:rPr>
+        <w:t xml:space="preserve">        limit=k,</w:t>
+      </w:r>
+    </w:p>
+    <w:p>
+      <w:pPr>
+        <w:keepNext w:val="false"/>
+        <w:keepLines/>
+        <w:pBdr>
+          <w:bottom w:val="single" w:color="808080" w:sz="4" w:space="4"/>
+          <w:left w:val="single" w:color="808080" w:sz="4" w:space="4"/>
+          <w:right w:val="single" w:color="808080" w:sz="4" w:space="4"/>
+        </w:pBdr>
+        <w:shd w:fill="F2F2F2" w:color="auto" w:val="clear"/>
+        <w:spacing w:after="200" w:before="0" w:line="240"/>
+      </w:pPr>
+      <w:r>
+        <w:rPr>
+          <w:rFonts w:ascii="Courier New" w:cs="Courier New" w:eastAsia="Courier New" w:hAnsi="Courier New"/>
+          <w:sz w:val="16"/>
+          <w:szCs w:val="16"/>
+        </w:rPr>
+        <w:t xml:space="preserve">    )</w:t>
+      </w:r>
+    </w:p>
+    <w:p>
+      <w:pPr>
+        <w:spacing w:after="160" w:line="360"/>
+        <w:jc w:val="both"/>
+      </w:pPr>
+      <w:r>
+        <w:rPr>
+          <w:rFonts w:ascii="Times New Roman" w:cs="Times New Roman" w:eastAsia="Times New Roman" w:hAnsi="Times New Roman"/>
+          <w:sz w:val="24"/>
+          <w:szCs w:val="24"/>
+        </w:rPr>
+        <w:t xml:space="preserve">These functions create the two retrieval methods that are compared and combined. The keyword retriever builds a BM25 index over the text of every chunk in the LanceDB table, using the same simple tokenizer as LanceDB, which lowercases the text and splits it on characters that are not letters or digits. Because building this index takes time, it is kept in a cache keyed by the database path and the version of the table, so it is rebuilt only after a document is ingested or deleted rather than for every question. The dense retriever searches the embedding vectors stored in LanceDB. The hybrid retriever joins the two with equal weights of 0.5 and the fusion constant, and returns the best k fused chunks. The Search page calls the dense, keyword and hybrid retrievers separately for the same query, so that their results can be compared side by side.</w:t>
+      </w:r>
+    </w:p>
+    <w:p>
+      <w:pPr>
+        <w:pStyle w:val="Heading3"/>
+        <w:keepNext/>
+        <w:spacing w:after="100" w:before="200"/>
+      </w:pPr>
+      <w:r>
+        <w:rPr>
+          <w:rFonts w:ascii="Times New Roman" w:cs="Times New Roman" w:eastAsia="Times New Roman" w:hAnsi="Times New Roman"/>
+          <w:b/>
+          <w:bCs/>
+          <w:sz w:val="24"/>
+          <w:szCs w:val="24"/>
+        </w:rPr>
+        <w:t xml:space="preserve">5.5.4  Verification Rules and Orchestration</w:t>
+      </w:r>
+    </w:p>
+    <w:p>
+      <w:pPr>
+        <w:keepNext/>
+        <w:keepLines/>
+        <w:pBdr>
+          <w:top w:val="single" w:color="808080" w:sz="4" w:space="4"/>
+          <w:left w:val="single" w:color="808080" w:sz="4" w:space="4"/>
+          <w:right w:val="single" w:color="808080" w:sz="4" w:space="4"/>
+        </w:pBdr>
+        <w:shd w:fill="F2F2F2" w:color="auto" w:val="clear"/>
+        <w:spacing w:after="0" w:before="120" w:line="240"/>
+      </w:pPr>
+      <w:r>
+        <w:rPr>
+          <w:rFonts w:ascii="Courier New" w:cs="Courier New" w:eastAsia="Courier New" w:hAnsi="Courier New"/>
+          <w:sz w:val="16"/>
+          <w:szCs w:val="16"/>
+        </w:rPr>
+        <w:t xml:space="preserve">def check_citation_existence(answer: Answer) -&gt; list[ClaimCitationResult]:</w:t>
+      </w:r>
+    </w:p>
+    <w:p>
+      <w:pPr>
+        <w:keepNext/>
+        <w:keepLines/>
+        <w:pBdr>
+          <w:left w:val="single" w:color="808080" w:sz="4" w:space="4"/>
+          <w:right w:val="single" w:color="808080" w:sz="4" w:space="4"/>
+        </w:pBdr>
+        <w:shd w:fill="F2F2F2" w:color="auto" w:val="clear"/>
+        <w:spacing w:after="0" w:before="0" w:line="240"/>
+      </w:pPr>
+      <w:r>
+        <w:rPr>
+          <w:rFonts w:ascii="Courier New" w:cs="Courier New" w:eastAsia="Courier New" w:hAnsi="Courier New"/>
+          <w:sz w:val="16"/>
+          <w:szCs w:val="16"/>
+        </w:rPr>
+        <w:t xml:space="preserve">    """Check each claim's citations against the retrieved context ids."""</w:t>
+      </w:r>
+    </w:p>
+    <w:p>
+      <w:pPr>
+        <w:keepNext/>
+        <w:keepLines/>
+        <w:pBdr>
+          <w:left w:val="single" w:color="808080" w:sz="4" w:space="4"/>
+          <w:right w:val="single" w:color="808080" w:sz="4" w:space="4"/>
+        </w:pBdr>
+        <w:shd w:fill="F2F2F2" w:color="auto" w:val="clear"/>
+        <w:spacing w:after="0" w:before="0" w:line="240"/>
+      </w:pPr>
+      <w:r>
+        <w:rPr>
+          <w:rFonts w:ascii="Courier New" w:cs="Courier New" w:eastAsia="Courier New" w:hAnsi="Courier New"/>
+          <w:sz w:val="16"/>
+          <w:szCs w:val="16"/>
+        </w:rPr>
+        <w:t xml:space="preserve">    context_ids = set(answer.context_chunk_ids)</w:t>
+      </w:r>
+    </w:p>
+    <w:p>
+      <w:pPr>
+        <w:keepNext/>
+        <w:keepLines/>
+        <w:pBdr>
+          <w:left w:val="single" w:color="808080" w:sz="4" w:space="4"/>
+          <w:right w:val="single" w:color="808080" w:sz="4" w:space="4"/>
+        </w:pBdr>
+        <w:shd w:fill="F2F2F2" w:color="auto" w:val="clear"/>
+        <w:spacing w:after="0" w:before="0" w:line="240"/>
+      </w:pPr>
+      <w:r>
+        <w:rPr>
+          <w:rFonts w:ascii="Courier New" w:cs="Courier New" w:eastAsia="Courier New" w:hAnsi="Courier New"/>
+          <w:sz w:val="16"/>
+          <w:szCs w:val="16"/>
+        </w:rPr>
+        <w:t xml:space="preserve">    results: list[ClaimCitationResult] = []</w:t>
+      </w:r>
+    </w:p>
+    <w:p>
+      <w:pPr>
+        <w:keepNext/>
+        <w:keepLines/>
+        <w:pBdr>
+          <w:left w:val="single" w:color="808080" w:sz="4" w:space="4"/>
+          <w:right w:val="single" w:color="808080" w:sz="4" w:space="4"/>
+        </w:pBdr>
+        <w:shd w:fill="F2F2F2" w:color="auto" w:val="clear"/>
+        <w:spacing w:after="0" w:before="0" w:line="240"/>
+      </w:pPr>
+      <w:r>
+        <w:rPr>
+          <w:rFonts w:ascii="Courier New" w:cs="Courier New" w:eastAsia="Courier New" w:hAnsi="Courier New"/>
+          <w:sz w:val="16"/>
+          <w:szCs w:val="16"/>
+        </w:rPr>
+        <w:t xml:space="preserve">    for claim in answer.claims:</w:t>
+      </w:r>
+    </w:p>
+    <w:p>
+      <w:pPr>
+        <w:keepNext/>
+        <w:keepLines/>
+        <w:pBdr>
+          <w:left w:val="single" w:color="808080" w:sz="4" w:space="4"/>
+          <w:right w:val="single" w:color="808080" w:sz="4" w:space="4"/>
+        </w:pBdr>
+        <w:shd w:fill="F2F2F2" w:color="auto" w:val="clear"/>
+        <w:spacing w:after="0" w:before="0" w:line="240"/>
+      </w:pPr>
+      <w:r>
+        <w:rPr>
+          <w:rFonts w:ascii="Courier New" w:cs="Courier New" w:eastAsia="Courier New" w:hAnsi="Courier New"/>
+          <w:sz w:val="16"/>
+          <w:szCs w:val="16"/>
+        </w:rPr>
+        <w:t xml:space="preserve">        existing = [cid for cid in claim.cited_chunk_ids</w:t>
+      </w:r>
+    </w:p>
+    <w:p>
+      <w:pPr>
+        <w:keepNext/>
+        <w:keepLines/>
+        <w:pBdr>
+          <w:left w:val="single" w:color="808080" w:sz="4" w:space="4"/>
+          <w:right w:val="single" w:color="808080" w:sz="4" w:space="4"/>
+        </w:pBdr>
+        <w:shd w:fill="F2F2F2" w:color="auto" w:val="clear"/>
+        <w:spacing w:after="0" w:before="0" w:line="240"/>
+      </w:pPr>
+      <w:r>
+        <w:rPr>
+          <w:rFonts w:ascii="Courier New" w:cs="Courier New" w:eastAsia="Courier New" w:hAnsi="Courier New"/>
+          <w:sz w:val="16"/>
+          <w:szCs w:val="16"/>
+        </w:rPr>
+        <w:t xml:space="preserve">                    if cid in context_ids]</w:t>
+      </w:r>
+    </w:p>
+    <w:p>
+      <w:pPr>
+        <w:keepNext/>
+        <w:keepLines/>
+        <w:pBdr>
+          <w:left w:val="single" w:color="808080" w:sz="4" w:space="4"/>
+          <w:right w:val="single" w:color="808080" w:sz="4" w:space="4"/>
+        </w:pBdr>
+        <w:shd w:fill="F2F2F2" w:color="auto" w:val="clear"/>
+        <w:spacing w:after="0" w:before="0" w:line="240"/>
+      </w:pPr>
+      <w:r>
+        <w:rPr>
+          <w:rFonts w:ascii="Courier New" w:cs="Courier New" w:eastAsia="Courier New" w:hAnsi="Courier New"/>
+          <w:sz w:val="16"/>
+          <w:szCs w:val="16"/>
+        </w:rPr>
+        <w:t xml:space="preserve">        missing = [cid for cid in claim.cited_chunk_ids</w:t>
+      </w:r>
+    </w:p>
+    <w:p>
+      <w:pPr>
+        <w:keepNext/>
+        <w:keepLines/>
+        <w:pBdr>
+          <w:left w:val="single" w:color="808080" w:sz="4" w:space="4"/>
+          <w:right w:val="single" w:color="808080" w:sz="4" w:space="4"/>
+        </w:pBdr>
+        <w:shd w:fill="F2F2F2" w:color="auto" w:val="clear"/>
+        <w:spacing w:after="0" w:before="0" w:line="240"/>
+      </w:pPr>
+      <w:r>
+        <w:rPr>
+          <w:rFonts w:ascii="Courier New" w:cs="Courier New" w:eastAsia="Courier New" w:hAnsi="Courier New"/>
+          <w:sz w:val="16"/>
+          <w:szCs w:val="16"/>
+        </w:rPr>
+        <w:t xml:space="preserve">                   if cid not in context_ids]</w:t>
+      </w:r>
+    </w:p>
+    <w:p>
+      <w:pPr>
+        <w:keepNext/>
+        <w:keepLines/>
+        <w:pBdr>
+          <w:left w:val="single" w:color="808080" w:sz="4" w:space="4"/>
+          <w:right w:val="single" w:color="808080" w:sz="4" w:space="4"/>
+        </w:pBdr>
+        <w:shd w:fill="F2F2F2" w:color="auto" w:val="clear"/>
+        <w:spacing w:after="0" w:before="0" w:line="240"/>
+      </w:pPr>
+      <w:r>
+        <w:rPr>
+          <w:rFonts w:ascii="Courier New" w:cs="Courier New" w:eastAsia="Courier New" w:hAnsi="Courier New"/>
+          <w:sz w:val="16"/>
+          <w:szCs w:val="16"/>
+        </w:rPr>
+        <w:t xml:space="preserve">        results.append(ClaimCitationResult(</w:t>
+      </w:r>
+    </w:p>
+    <w:p>
+      <w:pPr>
+        <w:keepNext/>
+        <w:keepLines/>
+        <w:pBdr>
+          <w:left w:val="single" w:color="808080" w:sz="4" w:space="4"/>
+          <w:right w:val="single" w:color="808080" w:sz="4" w:space="4"/>
+        </w:pBdr>
+        <w:shd w:fill="F2F2F2" w:color="auto" w:val="clear"/>
+        <w:spacing w:after="0" w:before="0" w:line="240"/>
+      </w:pPr>
+      <w:r>
+        <w:rPr>
+          <w:rFonts w:ascii="Courier New" w:cs="Courier New" w:eastAsia="Courier New" w:hAnsi="Courier New"/>
+          <w:sz w:val="16"/>
+          <w:szCs w:val="16"/>
+        </w:rPr>
+        <w:t xml:space="preserve">            claim_text=claim.text,</w:t>
+      </w:r>
+    </w:p>
+    <w:p>
+      <w:pPr>
+        <w:keepNext/>
+        <w:keepLines/>
+        <w:pBdr>
+          <w:left w:val="single" w:color="808080" w:sz="4" w:space="4"/>
+          <w:right w:val="single" w:color="808080" w:sz="4" w:space="4"/>
+        </w:pBdr>
+        <w:shd w:fill="F2F2F2" w:color="auto" w:val="clear"/>
+        <w:spacing w:after="0" w:before="0" w:line="240"/>
+      </w:pPr>
+      <w:r>
+        <w:rPr>
+          <w:rFonts w:ascii="Courier New" w:cs="Courier New" w:eastAsia="Courier New" w:hAnsi="Courier New"/>
+          <w:sz w:val="16"/>
+          <w:szCs w:val="16"/>
+        </w:rPr>
+        <w:t xml:space="preserve">            cited_chunk_ids=list(claim.cited_chunk_ids),</w:t>
+      </w:r>
+    </w:p>
+    <w:p>
+      <w:pPr>
+        <w:keepNext/>
+        <w:keepLines/>
+        <w:pBdr>
+          <w:left w:val="single" w:color="808080" w:sz="4" w:space="4"/>
+          <w:right w:val="single" w:color="808080" w:sz="4" w:space="4"/>
+        </w:pBdr>
+        <w:shd w:fill="F2F2F2" w:color="auto" w:val="clear"/>
+        <w:spacing w:after="0" w:before="0" w:line="240"/>
+      </w:pPr>
+      <w:r>
+        <w:rPr>
+          <w:rFonts w:ascii="Courier New" w:cs="Courier New" w:eastAsia="Courier New" w:hAnsi="Courier New"/>
+          <w:sz w:val="16"/>
+          <w:szCs w:val="16"/>
+        </w:rPr>
+        <w:t xml:space="preserve">            existing_ids=existing,</w:t>
+      </w:r>
+    </w:p>
+    <w:p>
+      <w:pPr>
+        <w:keepNext/>
+        <w:keepLines/>
+        <w:pBdr>
+          <w:left w:val="single" w:color="808080" w:sz="4" w:space="4"/>
+          <w:right w:val="single" w:color="808080" w:sz="4" w:space="4"/>
+        </w:pBdr>
+        <w:shd w:fill="F2F2F2" w:color="auto" w:val="clear"/>
+        <w:spacing w:after="0" w:before="0" w:line="240"/>
+      </w:pPr>
+      <w:r>
+        <w:rPr>
+          <w:rFonts w:ascii="Courier New" w:cs="Courier New" w:eastAsia="Courier New" w:hAnsi="Courier New"/>
+          <w:sz w:val="16"/>
+          <w:szCs w:val="16"/>
+        </w:rPr>
+        <w:t xml:space="preserve">            missing_ids=missing))</w:t>
+      </w:r>
+    </w:p>
+    <w:p>
+      <w:pPr>
+        <w:keepNext w:val="false"/>
+        <w:keepLines/>
+        <w:pBdr>
+          <w:bottom w:val="single" w:color="808080" w:sz="4" w:space="4"/>
+          <w:left w:val="single" w:color="808080" w:sz="4" w:space="4"/>
+          <w:right w:val="single" w:color="808080" w:sz="4" w:space="4"/>
+        </w:pBdr>
+        <w:shd w:fill="F2F2F2" w:color="auto" w:val="clear"/>
+        <w:spacing w:after="200" w:before="0" w:line="240"/>
+      </w:pPr>
+      <w:r>
+        <w:rPr>
+          <w:rFonts w:ascii="Courier New" w:cs="Courier New" w:eastAsia="Courier New" w:hAnsi="Courier New"/>
+          <w:sz w:val="16"/>
+          <w:szCs w:val="16"/>
+        </w:rPr>
+        <w:t xml:space="preserve">    return results</w:t>
+      </w:r>
+    </w:p>
+    <w:p>
+      <w:pPr>
+        <w:spacing w:after="160" w:line="360"/>
+        <w:jc w:val="both"/>
+      </w:pPr>
+      <w:r>
+        <w:rPr>
+          <w:rFonts w:ascii="Times New Roman" w:cs="Times New Roman" w:eastAsia="Times New Roman" w:hAnsi="Times New Roman"/>
+          <w:sz w:val="24"/>
+          <w:szCs w:val="24"/>
+        </w:rPr>
+        <w:t xml:space="preserve">Layer V1 is the simplest rule of the verification chain and the first one to run. It collects the identifiers of all the chunks that were actually retrieved for the question, and then, for every claim, separates the identifiers the claim cites into those that exist among the retrieved chunks and those that do not. A claim passes only when it cites at least one identifier and every cited identifier was retrieved. A claim that cites an identifier that was never retrieved has, by definition, a fabricated citation, so its score is set to zero by the scoring rules shown next. The missing identifiers are also kept in the result, which allows the proof view to name exactly which citation was invented. This is the distinct contribution of V1 observed in the ablation, since the other layers also score such a claim at zero but cannot say why.</w:t>
+      </w:r>
+    </w:p>
+    <w:p>
+      <w:pPr>
+        <w:keepNext/>
+        <w:keepLines/>
+        <w:pBdr>
+          <w:top w:val="single" w:color="808080" w:sz="4" w:space="4"/>
+          <w:left w:val="single" w:color="808080" w:sz="4" w:space="4"/>
+          <w:right w:val="single" w:color="808080" w:sz="4" w:space="4"/>
+        </w:pBdr>
+        <w:shd w:fill="F2F2F2" w:color="auto" w:val="clear"/>
+        <w:spacing w:after="0" w:before="120" w:line="240"/>
+      </w:pPr>
+      <w:r>
+        <w:rPr>
+          <w:rFonts w:ascii="Courier New" w:cs="Courier New" w:eastAsia="Courier New" w:hAnsi="Courier New"/>
+          <w:sz w:val="16"/>
+          <w:szCs w:val="16"/>
+        </w:rPr>
+        <w:t xml:space="preserve">def _claim_vcs(citation_ok, entailment, fidelity, consistency, config):</w:t>
+      </w:r>
+    </w:p>
+    <w:p>
+      <w:pPr>
+        <w:keepNext/>
+        <w:keepLines/>
+        <w:pBdr>
+          <w:left w:val="single" w:color="808080" w:sz="4" w:space="4"/>
+          <w:right w:val="single" w:color="808080" w:sz="4" w:space="4"/>
+        </w:pBdr>
+        <w:shd w:fill="F2F2F2" w:color="auto" w:val="clear"/>
+        <w:spacing w:after="0" w:before="0" w:line="240"/>
+      </w:pPr>
+      <w:r>
+        <w:rPr>
+          <w:rFonts w:ascii="Courier New" w:cs="Courier New" w:eastAsia="Courier New" w:hAnsi="Courier New"/>
+          <w:sz w:val="16"/>
+          <w:szCs w:val="16"/>
+        </w:rPr>
+        <w:t xml:space="preserve">    if config.enable_v1 and not citation_ok:</w:t>
+      </w:r>
+    </w:p>
+    <w:p>
+      <w:pPr>
+        <w:keepNext/>
+        <w:keepLines/>
+        <w:pBdr>
+          <w:left w:val="single" w:color="808080" w:sz="4" w:space="4"/>
+          <w:right w:val="single" w:color="808080" w:sz="4" w:space="4"/>
+        </w:pBdr>
+        <w:shd w:fill="F2F2F2" w:color="auto" w:val="clear"/>
+        <w:spacing w:after="0" w:before="0" w:line="240"/>
+      </w:pPr>
+      <w:r>
+        <w:rPr>
+          <w:rFonts w:ascii="Courier New" w:cs="Courier New" w:eastAsia="Courier New" w:hAnsi="Courier New"/>
+          <w:sz w:val="16"/>
+          <w:szCs w:val="16"/>
+        </w:rPr>
+        <w:t xml:space="preserve">        return 0.0, "citation"                     # hard gate V1</w:t>
+      </w:r>
+    </w:p>
+    <w:p>
+      <w:pPr>
+        <w:keepNext/>
+        <w:keepLines/>
+        <w:pBdr>
+          <w:left w:val="single" w:color="808080" w:sz="4" w:space="4"/>
+          <w:right w:val="single" w:color="808080" w:sz="4" w:space="4"/>
+        </w:pBdr>
+        <w:shd w:fill="F2F2F2" w:color="auto" w:val="clear"/>
+        <w:spacing w:after="0" w:before="0" w:line="240"/>
+      </w:pPr>
+      <w:r>
+        <w:rPr>
+          <w:rFonts w:ascii="Courier New" w:cs="Courier New" w:eastAsia="Courier New" w:hAnsi="Courier New"/>
+          <w:sz w:val="16"/>
+          <w:szCs w:val="16"/>
+        </w:rPr>
+        <w:t xml:space="preserve">    if config.enable_v2 and entailment == Entailment.CONTRADICTS:</w:t>
+      </w:r>
+    </w:p>
+    <w:p>
+      <w:pPr>
+        <w:keepNext/>
+        <w:keepLines/>
+        <w:pBdr>
+          <w:left w:val="single" w:color="808080" w:sz="4" w:space="4"/>
+          <w:right w:val="single" w:color="808080" w:sz="4" w:space="4"/>
+        </w:pBdr>
+        <w:shd w:fill="F2F2F2" w:color="auto" w:val="clear"/>
+        <w:spacing w:after="0" w:before="0" w:line="240"/>
+      </w:pPr>
+      <w:r>
+        <w:rPr>
+          <w:rFonts w:ascii="Courier New" w:cs="Courier New" w:eastAsia="Courier New" w:hAnsi="Courier New"/>
+          <w:sz w:val="16"/>
+          <w:szCs w:val="16"/>
+        </w:rPr>
+        <w:t xml:space="preserve">        return 0.0, "contradiction"                # hard gate V2</w:t>
+      </w:r>
+    </w:p>
+    <w:p>
+      <w:pPr>
+        <w:keepNext/>
+        <w:keepLines/>
+        <w:pBdr>
+          <w:left w:val="single" w:color="808080" w:sz="4" w:space="4"/>
+          <w:right w:val="single" w:color="808080" w:sz="4" w:space="4"/>
+        </w:pBdr>
+        <w:shd w:fill="F2F2F2" w:color="auto" w:val="clear"/>
+        <w:spacing w:after="0" w:before="0" w:line="240"/>
+      </w:pPr>
+      <w:r>
+        <w:rPr>
+          <w:rFonts w:ascii="Courier New" w:cs="Courier New" w:eastAsia="Courier New" w:hAnsi="Courier New"/>
+          <w:sz w:val="16"/>
+          <w:szCs w:val="16"/>
+        </w:rPr>
+        <w:t xml:space="preserve">    components = [(1.0 if entailment == Entailment.ENTAILS else 0.0,</w:t>
+      </w:r>
+    </w:p>
+    <w:p>
+      <w:pPr>
+        <w:keepNext/>
+        <w:keepLines/>
+        <w:pBdr>
+          <w:left w:val="single" w:color="808080" w:sz="4" w:space="4"/>
+          <w:right w:val="single" w:color="808080" w:sz="4" w:space="4"/>
+        </w:pBdr>
+        <w:shd w:fill="F2F2F2" w:color="auto" w:val="clear"/>
+        <w:spacing w:after="0" w:before="0" w:line="240"/>
+      </w:pPr>
+      <w:r>
+        <w:rPr>
+          <w:rFonts w:ascii="Courier New" w:cs="Courier New" w:eastAsia="Courier New" w:hAnsi="Courier New"/>
+          <w:sz w:val="16"/>
+          <w:szCs w:val="16"/>
+        </w:rPr>
+        <w:t xml:space="preserve">                   config.w_entail), (fidelity, config.w_fidelity)]</w:t>
+      </w:r>
+    </w:p>
+    <w:p>
+      <w:pPr>
+        <w:keepNext/>
+        <w:keepLines/>
+        <w:pBdr>
+          <w:left w:val="single" w:color="808080" w:sz="4" w:space="4"/>
+          <w:right w:val="single" w:color="808080" w:sz="4" w:space="4"/>
+        </w:pBdr>
+        <w:shd w:fill="F2F2F2" w:color="auto" w:val="clear"/>
+        <w:spacing w:after="0" w:before="0" w:line="240"/>
+      </w:pPr>
+      <w:r>
+        <w:rPr>
+          <w:rFonts w:ascii="Courier New" w:cs="Courier New" w:eastAsia="Courier New" w:hAnsi="Courier New"/>
+          <w:sz w:val="16"/>
+          <w:szCs w:val="16"/>
+        </w:rPr>
+        <w:t xml:space="preserve">    if consistency is not None:</w:t>
+      </w:r>
+    </w:p>
+    <w:p>
+      <w:pPr>
+        <w:keepNext/>
+        <w:keepLines/>
+        <w:pBdr>
+          <w:left w:val="single" w:color="808080" w:sz="4" w:space="4"/>
+          <w:right w:val="single" w:color="808080" w:sz="4" w:space="4"/>
+        </w:pBdr>
+        <w:shd w:fill="F2F2F2" w:color="auto" w:val="clear"/>
+        <w:spacing w:after="0" w:before="0" w:line="240"/>
+      </w:pPr>
+      <w:r>
+        <w:rPr>
+          <w:rFonts w:ascii="Courier New" w:cs="Courier New" w:eastAsia="Courier New" w:hAnsi="Courier New"/>
+          <w:sz w:val="16"/>
+          <w:szCs w:val="16"/>
+        </w:rPr>
+        <w:t xml:space="preserve">        components.append((consistency, config.w_consistency))</w:t>
+      </w:r>
+    </w:p>
+    <w:p>
+      <w:pPr>
+        <w:keepNext/>
+        <w:keepLines/>
+        <w:pBdr>
+          <w:left w:val="single" w:color="808080" w:sz="4" w:space="4"/>
+          <w:right w:val="single" w:color="808080" w:sz="4" w:space="4"/>
+        </w:pBdr>
+        <w:shd w:fill="F2F2F2" w:color="auto" w:val="clear"/>
+        <w:spacing w:after="0" w:before="0" w:line="240"/>
+      </w:pPr>
+      <w:r>
+        <w:rPr>
+          <w:rFonts w:ascii="Courier New" w:cs="Courier New" w:eastAsia="Courier New" w:hAnsi="Courier New"/>
+          <w:sz w:val="16"/>
+          <w:szCs w:val="16"/>
+        </w:rPr>
+        <w:t xml:space="preserve">    total_weight = sum(w for _, w in components)</w:t>
+      </w:r>
+    </w:p>
+    <w:p>
+      <w:pPr>
+        <w:keepNext/>
+        <w:keepLines/>
+        <w:pBdr>
+          <w:left w:val="single" w:color="808080" w:sz="4" w:space="4"/>
+          <w:right w:val="single" w:color="808080" w:sz="4" w:space="4"/>
+        </w:pBdr>
+        <w:shd w:fill="F2F2F2" w:color="auto" w:val="clear"/>
+        <w:spacing w:after="0" w:before="0" w:line="240"/>
+      </w:pPr>
+      <w:r>
+        <w:rPr>
+          <w:rFonts w:ascii="Courier New" w:cs="Courier New" w:eastAsia="Courier New" w:hAnsi="Courier New"/>
+          <w:sz w:val="16"/>
+          <w:szCs w:val="16"/>
+        </w:rPr>
+        <w:t xml:space="preserve">    return sum(c * w for c, w in components) / total_weight, None</w:t>
+      </w:r>
+    </w:p>
+    <w:p>
+      <w:pPr>
+        <w:keepNext/>
+        <w:keepLines/>
+        <w:pBdr>
+          <w:left w:val="single" w:color="808080" w:sz="4" w:space="4"/>
+          <w:right w:val="single" w:color="808080" w:sz="4" w:space="4"/>
+        </w:pBdr>
+        <w:shd w:fill="F2F2F2" w:color="auto" w:val="clear"/>
+        <w:spacing w:after="0" w:before="0" w:line="240"/>
+      </w:pPr>
+      <w:r>
+        <w:rPr>
+          <w:rFonts w:ascii="Courier New" w:cs="Courier New" w:eastAsia="Courier New" w:hAnsi="Courier New"/>
+          <w:sz w:val="16"/>
+          <w:szCs w:val="16"/>
+        </w:rPr>
+        <w:t xml:space="preserve"> </w:t>
+      </w:r>
+    </w:p>
+    <w:p>
+      <w:pPr>
+        <w:keepNext/>
+        <w:keepLines/>
+        <w:pBdr>
+          <w:left w:val="single" w:color="808080" w:sz="4" w:space="4"/>
+          <w:right w:val="single" w:color="808080" w:sz="4" w:space="4"/>
+        </w:pBdr>
+        <w:shd w:fill="F2F2F2" w:color="auto" w:val="clear"/>
+        <w:spacing w:after="0" w:before="0" w:line="240"/>
+      </w:pPr>
+      <w:r>
+        <w:rPr>
+          <w:rFonts w:ascii="Courier New" w:cs="Courier New" w:eastAsia="Courier New" w:hAnsi="Courier New"/>
+          <w:sz w:val="16"/>
+          <w:szCs w:val="16"/>
+        </w:rPr>
+        <w:t xml:space="preserve">def verify_answer(answer, context_chunks, nli, resamples=None, config=None):</w:t>
+      </w:r>
+    </w:p>
+    <w:p>
+      <w:pPr>
+        <w:keepNext/>
+        <w:keepLines/>
+        <w:pBdr>
+          <w:left w:val="single" w:color="808080" w:sz="4" w:space="4"/>
+          <w:right w:val="single" w:color="808080" w:sz="4" w:space="4"/>
+        </w:pBdr>
+        <w:shd w:fill="F2F2F2" w:color="auto" w:val="clear"/>
+        <w:spacing w:after="0" w:before="0" w:line="240"/>
+      </w:pPr>
+      <w:r>
+        <w:rPr>
+          <w:rFonts w:ascii="Courier New" w:cs="Courier New" w:eastAsia="Courier New" w:hAnsi="Courier New"/>
+          <w:sz w:val="16"/>
+          <w:szCs w:val="16"/>
+        </w:rPr>
+        <w:t xml:space="preserve">    v1 = check_citation_existence(answer)                       # V1</w:t>
+      </w:r>
+    </w:p>
+    <w:p>
+      <w:pPr>
+        <w:keepNext/>
+        <w:keepLines/>
+        <w:pBdr>
+          <w:left w:val="single" w:color="808080" w:sz="4" w:space="4"/>
+          <w:right w:val="single" w:color="808080" w:sz="4" w:space="4"/>
+        </w:pBdr>
+        <w:shd w:fill="F2F2F2" w:color="auto" w:val="clear"/>
+        <w:spacing w:after="0" w:before="0" w:line="240"/>
+      </w:pPr>
+      <w:r>
+        <w:rPr>
+          <w:rFonts w:ascii="Courier New" w:cs="Courier New" w:eastAsia="Courier New" w:hAnsi="Courier New"/>
+          <w:sz w:val="16"/>
+          <w:szCs w:val="16"/>
+        </w:rPr>
+        <w:t xml:space="preserve">    v2 = check_entailment_all(answer.claims, context_chunks, nli)  # V2</w:t>
+      </w:r>
+    </w:p>
+    <w:p>
+      <w:pPr>
+        <w:keepNext/>
+        <w:keepLines/>
+        <w:pBdr>
+          <w:left w:val="single" w:color="808080" w:sz="4" w:space="4"/>
+          <w:right w:val="single" w:color="808080" w:sz="4" w:space="4"/>
+        </w:pBdr>
+        <w:shd w:fill="F2F2F2" w:color="auto" w:val="clear"/>
+        <w:spacing w:after="0" w:before="0" w:line="240"/>
+      </w:pPr>
+      <w:r>
+        <w:rPr>
+          <w:rFonts w:ascii="Courier New" w:cs="Courier New" w:eastAsia="Courier New" w:hAnsi="Courier New"/>
+          <w:sz w:val="16"/>
+          <w:szCs w:val="16"/>
+        </w:rPr>
+        <w:t xml:space="preserve">    v3 = check_fidelity_all(answer.claims, context_chunks, nli)    # V3</w:t>
+      </w:r>
+    </w:p>
+    <w:p>
+      <w:pPr>
+        <w:keepNext/>
+        <w:keepLines/>
+        <w:pBdr>
+          <w:left w:val="single" w:color="808080" w:sz="4" w:space="4"/>
+          <w:right w:val="single" w:color="808080" w:sz="4" w:space="4"/>
+        </w:pBdr>
+        <w:shd w:fill="F2F2F2" w:color="auto" w:val="clear"/>
+        <w:spacing w:after="0" w:before="0" w:line="240"/>
+      </w:pPr>
+      <w:r>
+        <w:rPr>
+          <w:rFonts w:ascii="Courier New" w:cs="Courier New" w:eastAsia="Courier New" w:hAnsi="Courier New"/>
+          <w:sz w:val="16"/>
+          <w:szCs w:val="16"/>
+        </w:rPr>
+        <w:t xml:space="preserve">    v4 = self_consistency(answer, resamples) if resamples else None  # V4</w:t>
+      </w:r>
+    </w:p>
+    <w:p>
+      <w:pPr>
+        <w:keepNext/>
+        <w:keepLines/>
+        <w:pBdr>
+          <w:left w:val="single" w:color="808080" w:sz="4" w:space="4"/>
+          <w:right w:val="single" w:color="808080" w:sz="4" w:space="4"/>
+        </w:pBdr>
+        <w:shd w:fill="F2F2F2" w:color="auto" w:val="clear"/>
+        <w:spacing w:after="0" w:before="0" w:line="240"/>
+      </w:pPr>
+      <w:r>
+        <w:rPr>
+          <w:rFonts w:ascii="Courier New" w:cs="Courier New" w:eastAsia="Courier New" w:hAnsi="Courier New"/>
+          <w:sz w:val="16"/>
+          <w:szCs w:val="16"/>
+        </w:rPr>
+        <w:t xml:space="preserve">    vcs_result = aggregate_vcs(...)             # V5: claim scores, gate 0.60</w:t>
+      </w:r>
+    </w:p>
+    <w:p>
+      <w:pPr>
+        <w:keepNext/>
+        <w:keepLines/>
+        <w:pBdr>
+          <w:left w:val="single" w:color="808080" w:sz="4" w:space="4"/>
+          <w:right w:val="single" w:color="808080" w:sz="4" w:space="4"/>
+        </w:pBdr>
+        <w:shd w:fill="F2F2F2" w:color="auto" w:val="clear"/>
+        <w:spacing w:after="0" w:before="0" w:line="240"/>
+      </w:pPr>
+      <w:r>
+        <w:rPr>
+          <w:rFonts w:ascii="Courier New" w:cs="Courier New" w:eastAsia="Courier New" w:hAnsi="Courier New"/>
+          <w:sz w:val="16"/>
+          <w:szCs w:val="16"/>
+        </w:rPr>
+        <w:t xml:space="preserve">    proof = build_proof(answer.query, answer.raw_text, context_chunks,</w:t>
+      </w:r>
+    </w:p>
+    <w:p>
+      <w:pPr>
+        <w:keepNext/>
+        <w:keepLines/>
+        <w:pBdr>
+          <w:left w:val="single" w:color="808080" w:sz="4" w:space="4"/>
+          <w:right w:val="single" w:color="808080" w:sz="4" w:space="4"/>
+        </w:pBdr>
+        <w:shd w:fill="F2F2F2" w:color="auto" w:val="clear"/>
+        <w:spacing w:after="0" w:before="0" w:line="240"/>
+      </w:pPr>
+      <w:r>
+        <w:rPr>
+          <w:rFonts w:ascii="Courier New" w:cs="Courier New" w:eastAsia="Courier New" w:hAnsi="Courier New"/>
+          <w:sz w:val="16"/>
+          <w:szCs w:val="16"/>
+        </w:rPr>
+        <w:t xml:space="preserve">                        v1=v1, v2=v2, v3=v3, v4=v4, vcs_result=vcs_result)  # V6</w:t>
+      </w:r>
+    </w:p>
+    <w:p>
+      <w:pPr>
+        <w:keepNext w:val="false"/>
+        <w:keepLines/>
+        <w:pBdr>
+          <w:bottom w:val="single" w:color="808080" w:sz="4" w:space="4"/>
+          <w:left w:val="single" w:color="808080" w:sz="4" w:space="4"/>
+          <w:right w:val="single" w:color="808080" w:sz="4" w:space="4"/>
+        </w:pBdr>
+        <w:shd w:fill="F2F2F2" w:color="auto" w:val="clear"/>
+        <w:spacing w:after="200" w:before="0" w:line="240"/>
+      </w:pPr>
+      <w:r>
+        <w:rPr>
+          <w:rFonts w:ascii="Courier New" w:cs="Courier New" w:eastAsia="Courier New" w:hAnsi="Courier New"/>
+          <w:sz w:val="16"/>
+          <w:szCs w:val="16"/>
         </w:rPr>
         <w:t xml:space="preserve">    return VerificationResult(vcs_result, proof)</w:t>
       </w:r>

</xml_diff>